<commit_message>
docs(golden-fur): refresh docs/Architectural-Change-Suggestions.docx from the current History docx
Overwrites the stale docs/ copy with Inbox/Architectural-Change-History.docx
(the canonical successor). docs/context/architecture/Architectural-Change-Suggestions.docx
is a third stale copy still present - left for a follow-up.

Co-Authored-By: Claude Sonnet 5 <noreply@anthropic.com>
</commit_message>
<xml_diff>
--- a/Projects/golden-fur/docs/Architectural-Change-Suggestions.docx
+++ b/Projects/golden-fur/docs/Architectural-Change-Suggestions.docx
@@ -41,7 +41,7 @@
           <w:pgNumType w:start="1"/>
         </w:sectPr>
       </w:pPr>
-      <w:bookmarkStart w:colFirst="0" w:colLast="0" w:name="_agt7vq3kl7nw" w:id="0"/>
+      <w:bookmarkStart w:colFirst="0" w:colLast="0" w:name="_crb1dr4a5qaa" w:id="0"/>
       <w:bookmarkEnd w:id="0"/>
       <w:r>
         <w:rPr>
@@ -233,7 +233,7 @@
             <w:sdt>
               <w:sdtPr>
                 <w:alias w:val="Project status"/>
-                <w:id w:val="1178523336"/>
+                <w:id w:val="-277296131"/>
                 <w:dropDownList w:lastValue="Not Started">
                   <w:listItem w:displayText="Not Started" w:value="Not Started"/>
                   <w:listItem w:displayText="Blocked" w:value="Blocked"/>
@@ -267,7 +267,7 @@
             <w:pPr>
               <w:numPr>
                 <w:ilvl w:val="0"/>
-                <w:numId w:val="41"/>
+                <w:numId w:val="39"/>
               </w:numPr>
               <w:spacing w:after="60" w:line="240" w:lineRule="auto"/>
               <w:ind w:left="720" w:hanging="360"/>
@@ -303,7 +303,7 @@
             <w:sdt>
               <w:sdtPr>
                 <w:alias w:val="Assignee"/>
-                <w:id w:val="910680518"/>
+                <w:id w:val="514797261"/>
                 <w:dropDownList w:lastValue="Alarie">
                   <w:listItem w:displayText="None" w:value="None"/>
                   <w:listItem w:displayText="Alarie" w:value="Alarie"/>
@@ -352,7 +352,7 @@
             <w:sdt>
               <w:sdtPr>
                 <w:alias w:val="Project status"/>
-                <w:id w:val="1071036443"/>
+                <w:id w:val="-665957717"/>
                 <w:dropDownList w:lastValue="Not Started">
                   <w:listItem w:displayText="Not Started" w:value="Not Started"/>
                   <w:listItem w:displayText="Blocked" w:value="Blocked"/>
@@ -386,7 +386,7 @@
             <w:pPr>
               <w:numPr>
                 <w:ilvl w:val="0"/>
-                <w:numId w:val="29"/>
+                <w:numId w:val="26"/>
               </w:numPr>
               <w:spacing w:after="60" w:line="240" w:lineRule="auto"/>
               <w:ind w:left="720" w:hanging="360"/>
@@ -422,7 +422,7 @@
             <w:sdt>
               <w:sdtPr>
                 <w:alias w:val="Assignee"/>
-                <w:id w:val="401661910"/>
+                <w:id w:val="630092036"/>
                 <w:dropDownList w:lastValue="Alarie">
                   <w:listItem w:displayText="None" w:value="None"/>
                   <w:listItem w:displayText="Alarie" w:value="Alarie"/>
@@ -471,7 +471,7 @@
             <w:sdt>
               <w:sdtPr>
                 <w:alias w:val="Project status"/>
-                <w:id w:val="-1569001260"/>
+                <w:id w:val="-630449743"/>
                 <w:dropDownList w:lastValue="Not Started">
                   <w:listItem w:displayText="Not Started" w:value="Not Started"/>
                   <w:listItem w:displayText="Blocked" w:value="Blocked"/>
@@ -505,7 +505,7 @@
             <w:pPr>
               <w:numPr>
                 <w:ilvl w:val="0"/>
-                <w:numId w:val="17"/>
+                <w:numId w:val="43"/>
               </w:numPr>
               <w:spacing w:after="0" w:afterAutospacing="0" w:line="240" w:lineRule="auto"/>
               <w:ind w:left="720" w:hanging="360"/>
@@ -522,17 +522,17 @@
                 <w:szCs w:val="24"/>
                 <w:rtl w:val="0"/>
               </w:rPr>
-              <w:t xml:space="preserve">Apply downpayment config for all bookings made online</w:t>
+              <w:t xml:space="preserve">Add a dedicated transactions page (I think it’s already there) to search, filter and sort all customer transactions (e.g. downpayment, full, etc.), where each transaction is linked to a booking</w:t>
             </w:r>
           </w:p>
           <w:p>
             <w:pPr>
               <w:numPr>
-                <w:ilvl w:val="1"/>
-                <w:numId w:val="17"/>
+                <w:ilvl w:val="0"/>
+                <w:numId w:val="43"/>
               </w:numPr>
               <w:spacing w:after="0" w:afterAutospacing="0" w:line="240" w:lineRule="auto"/>
-              <w:ind w:left="1440" w:hanging="360"/>
+              <w:ind w:left="720" w:hanging="360"/>
               <w:rPr>
                 <w:rFonts w:ascii="Times" w:cs="Times" w:eastAsia="Times" w:hAnsi="Times"/>
                 <w:sz w:val="24"/>
@@ -546,17 +546,17 @@
                 <w:szCs w:val="24"/>
                 <w:rtl w:val="0"/>
               </w:rPr>
-              <w:t xml:space="preserve">Since when customers make bookings, they’re trying to reserve time</w:t>
+              <w:t xml:space="preserve">Online bookings of status pending payment will appear here for cashiers to mark as paid</w:t>
             </w:r>
           </w:p>
           <w:p>
             <w:pPr>
               <w:numPr>
-                <w:ilvl w:val="1"/>
-                <w:numId w:val="17"/>
+                <w:ilvl w:val="0"/>
+                <w:numId w:val="43"/>
               </w:numPr>
               <w:spacing w:after="0" w:afterAutospacing="0" w:line="240" w:lineRule="auto"/>
-              <w:ind w:left="1440" w:hanging="360"/>
+              <w:ind w:left="720" w:hanging="360"/>
               <w:rPr>
                 <w:rFonts w:ascii="Times" w:cs="Times" w:eastAsia="Times" w:hAnsi="Times"/>
                 <w:sz w:val="24"/>
@@ -570,17 +570,17 @@
                 <w:szCs w:val="24"/>
                 <w:rtl w:val="0"/>
               </w:rPr>
-              <w:t xml:space="preserve">If they don’t show up, the institution loses on money</w:t>
+              <w:t xml:space="preserve">Make other queues pull bookings from payments queue (fully paid or partially paid), instead of relying on bookings queue (status IS NOT pending)</w:t>
             </w:r>
           </w:p>
           <w:p>
             <w:pPr>
               <w:numPr>
-                <w:ilvl w:val="1"/>
-                <w:numId w:val="17"/>
+                <w:ilvl w:val="0"/>
+                <w:numId w:val="43"/>
               </w:numPr>
               <w:spacing w:after="0" w:afterAutospacing="0" w:line="240" w:lineRule="auto"/>
-              <w:ind w:left="1440" w:hanging="360"/>
+              <w:ind w:left="720" w:hanging="360"/>
               <w:rPr>
                 <w:rFonts w:ascii="Times" w:cs="Times" w:eastAsia="Times" w:hAnsi="Times"/>
                 <w:sz w:val="24"/>
@@ -594,17 +594,17 @@
                 <w:szCs w:val="24"/>
                 <w:rtl w:val="0"/>
               </w:rPr>
-              <w:t xml:space="preserve">NO NEED for walk-ins</w:t>
+              <w:t xml:space="preserve">Or perhaps just add an extra status in bookings queue before pending (e.g. unconfirmed), that specifies that an online booking is still not paid</w:t>
             </w:r>
           </w:p>
           <w:p>
             <w:pPr>
               <w:numPr>
-                <w:ilvl w:val="1"/>
-                <w:numId w:val="17"/>
+                <w:ilvl w:val="0"/>
+                <w:numId w:val="43"/>
               </w:numPr>
               <w:spacing w:after="0" w:afterAutospacing="0" w:line="240" w:lineRule="auto"/>
-              <w:ind w:left="1440" w:hanging="360"/>
+              <w:ind w:left="720" w:hanging="360"/>
               <w:rPr>
                 <w:rFonts w:ascii="Times" w:cs="Times" w:eastAsia="Times" w:hAnsi="Times"/>
                 <w:sz w:val="24"/>
@@ -618,17 +618,17 @@
                 <w:szCs w:val="24"/>
                 <w:rtl w:val="0"/>
               </w:rPr>
-              <w:t xml:space="preserve">Online bookings are determined by the booking date (it’s not on the same date and not the current time)</w:t>
+              <w:t xml:space="preserve">Perhaps revamp entire bookings queue status to something like: unconfirmed &gt; confirmed &gt; no show &gt; cancelled</w:t>
             </w:r>
           </w:p>
           <w:p>
             <w:pPr>
               <w:numPr>
-                <w:ilvl w:val="1"/>
-                <w:numId w:val="17"/>
+                <w:ilvl w:val="0"/>
+                <w:numId w:val="43"/>
               </w:numPr>
               <w:spacing w:after="60" w:line="240" w:lineRule="auto"/>
-              <w:ind w:left="1440" w:hanging="360"/>
+              <w:ind w:left="720" w:hanging="360"/>
               <w:rPr>
                 <w:rFonts w:ascii="Times" w:cs="Times" w:eastAsia="Times" w:hAnsi="Times"/>
                 <w:sz w:val="24"/>
@@ -642,7 +642,7 @@
                 <w:szCs w:val="24"/>
                 <w:rtl w:val="0"/>
               </w:rPr>
-              <w:t xml:space="preserve">Does not show up at other queues, only shows up at booking queue as pending, and at payments queue (cashier)</w:t>
+              <w:t xml:space="preserve">While all the other queues will use the standard status: pending &gt; in progress &gt; completed</w:t>
             </w:r>
           </w:p>
         </w:tc>
@@ -661,7 +661,7 @@
             <w:sdt>
               <w:sdtPr>
                 <w:alias w:val="Assignee"/>
-                <w:id w:val="-664847191"/>
+                <w:id w:val="-189372658"/>
                 <w:dropDownList w:lastValue="Matthew">
                   <w:listItem w:displayText="None" w:value="None"/>
                   <w:listItem w:displayText="Alarie" w:value="Alarie"/>
@@ -710,8 +710,8 @@
             <w:sdt>
               <w:sdtPr>
                 <w:alias w:val="Project status"/>
-                <w:id w:val="-1354465599"/>
-                <w:dropDownList w:lastValue="Not Started">
+                <w:id w:val="664893464"/>
+                <w:dropDownList w:lastValue="Completed">
                   <w:listItem w:displayText="Not Started" w:value="Not Started"/>
                   <w:listItem w:displayText="Blocked" w:value="Blocked"/>
                   <w:listItem w:displayText="In Progress" w:value="In Progress"/>
@@ -722,12 +722,12 @@
                 <w:r>
                   <w:rPr>
                     <w:rFonts w:ascii="Times" w:cs="Times" w:eastAsia="Times" w:hAnsi="Times"/>
-                    <w:color w:val="3d3d3d"/>
+                    <w:color w:val="11734b"/>
                     <w:sz w:val="24"/>
                     <w:szCs w:val="24"/>
-                    <w:shd w:fill="e6e6e6" w:val="clear"/>
+                    <w:shd w:fill="d4edbc" w:val="clear"/>
                   </w:rPr>
-                  <w:t xml:space="preserve">Not Started</w:t>
+                  <w:t xml:space="preserve">Completed</w:t>
                 </w:r>
               </w:sdtContent>
             </w:sdt>
@@ -744,7 +744,7 @@
             <w:pPr>
               <w:numPr>
                 <w:ilvl w:val="0"/>
-                <w:numId w:val="12"/>
+                <w:numId w:val="43"/>
               </w:numPr>
               <w:spacing w:after="0" w:afterAutospacing="0" w:line="240" w:lineRule="auto"/>
               <w:ind w:left="720" w:hanging="360"/>
@@ -761,14 +761,134 @@
                 <w:szCs w:val="24"/>
                 <w:rtl w:val="0"/>
               </w:rPr>
-              <w:t xml:space="preserve">Build a dedicated walk-in booking flow: same-day, on-site registration for walk-in customers, distinct from the future-appointment booking flow.</w:t>
+              <w:t xml:space="preserve">Require some form of online payment (full or down payment) on every online booking — do not allow a slot to be reserved with zero payment.</w:t>
+            </w:r>
+          </w:p>
+          <w:p>
+            <w:pPr>
+              <w:numPr>
+                <w:ilvl w:val="0"/>
+                <w:numId w:val="43"/>
+              </w:numPr>
+              <w:spacing w:after="0" w:afterAutospacing="0" w:line="240" w:lineRule="auto"/>
+              <w:ind w:left="720" w:hanging="360"/>
+              <w:rPr>
+                <w:rFonts w:ascii="Times" w:cs="Times" w:eastAsia="Times" w:hAnsi="Times"/>
+                <w:sz w:val="24"/>
+                <w:szCs w:val="24"/>
+              </w:rPr>
+            </w:pPr>
+            <w:r>
+              <w:rPr>
+                <w:rFonts w:ascii="Times" w:cs="Times" w:eastAsia="Times" w:hAnsi="Times"/>
+                <w:sz w:val="24"/>
+                <w:szCs w:val="24"/>
+                <w:rtl w:val="0"/>
+              </w:rPr>
+              <w:t xml:space="preserve">Make the down payment configurable as either a percentage of the total price or a flat fixed amount, set by an admin/owner.</w:t>
+            </w:r>
+          </w:p>
+          <w:p>
+            <w:pPr>
+              <w:numPr>
+                <w:ilvl w:val="0"/>
+                <w:numId w:val="43"/>
+              </w:numPr>
+              <w:spacing w:after="0" w:afterAutospacing="0" w:line="240" w:lineRule="auto"/>
+              <w:ind w:left="720" w:hanging="360"/>
+              <w:rPr>
+                <w:rFonts w:ascii="Times" w:cs="Times" w:eastAsia="Times" w:hAnsi="Times"/>
+                <w:sz w:val="24"/>
+                <w:szCs w:val="24"/>
+              </w:rPr>
+            </w:pPr>
+            <w:r>
+              <w:rPr>
+                <w:rFonts w:ascii="Times" w:cs="Times" w:eastAsia="Times" w:hAnsi="Times"/>
+                <w:sz w:val="24"/>
+                <w:szCs w:val="24"/>
+                <w:rtl w:val="0"/>
+              </w:rPr>
+              <w:t xml:space="preserve">While a down payment is unpaid, keep the booking at 'Pending' and leave that time slot visible and bookable by other customers — it should not lock the queue/schedule.</w:t>
+            </w:r>
+          </w:p>
+          <w:p>
+            <w:pPr>
+              <w:numPr>
+                <w:ilvl w:val="0"/>
+                <w:numId w:val="43"/>
+              </w:numPr>
+              <w:spacing w:after="0" w:afterAutospacing="0" w:line="240" w:lineRule="auto"/>
+              <w:ind w:left="720" w:hanging="360"/>
+              <w:rPr>
+                <w:rFonts w:ascii="Times" w:cs="Times" w:eastAsia="Times" w:hAnsi="Times"/>
+                <w:sz w:val="24"/>
+                <w:szCs w:val="24"/>
+              </w:rPr>
+            </w:pPr>
+            <w:r>
+              <w:rPr>
+                <w:rFonts w:ascii="Times" w:cs="Times" w:eastAsia="Times" w:hAnsi="Times"/>
+                <w:sz w:val="24"/>
+                <w:szCs w:val="24"/>
+                <w:rtl w:val="0"/>
+              </w:rPr>
+              <w:t xml:space="preserve">Add an expiration timer to unpaid down-payment reservations (e.g., due by end of day); auto-release the held slot if the deadline passes unpaid.</w:t>
+            </w:r>
+          </w:p>
+          <w:p>
+            <w:pPr>
+              <w:numPr>
+                <w:ilvl w:val="0"/>
+                <w:numId w:val="43"/>
+              </w:numPr>
+              <w:spacing w:after="0" w:afterAutospacing="0" w:line="240" w:lineRule="auto"/>
+              <w:ind w:left="720" w:hanging="360"/>
+              <w:rPr>
+                <w:rFonts w:ascii="Times" w:cs="Times" w:eastAsia="Times" w:hAnsi="Times"/>
+                <w:sz w:val="24"/>
+                <w:szCs w:val="24"/>
+              </w:rPr>
+            </w:pPr>
+            <w:r>
+              <w:rPr>
+                <w:rFonts w:ascii="Times" w:cs="Times" w:eastAsia="Times" w:hAnsi="Times"/>
+                <w:sz w:val="24"/>
+                <w:szCs w:val="24"/>
+                <w:rtl w:val="0"/>
+              </w:rPr>
+              <w:t xml:space="preserve">At the payment phase of the booking process, add an option for the customer/receptionist to choose either full payment or downpayment for online transaction (NOT IN WALK INS, walkins auto full)</w:t>
+            </w:r>
+          </w:p>
+          <w:p>
+            <w:pPr>
+              <w:numPr>
+                <w:ilvl w:val="0"/>
+                <w:numId w:val="43"/>
+              </w:numPr>
+              <w:spacing w:after="0" w:afterAutospacing="0" w:line="240" w:lineRule="auto"/>
+              <w:ind w:left="720" w:hanging="360"/>
+              <w:rPr>
+                <w:rFonts w:ascii="Times" w:cs="Times" w:eastAsia="Times" w:hAnsi="Times"/>
+                <w:sz w:val="24"/>
+                <w:szCs w:val="24"/>
+              </w:rPr>
+            </w:pPr>
+            <w:r>
+              <w:rPr>
+                <w:rFonts w:ascii="Times" w:cs="Times" w:eastAsia="Times" w:hAnsi="Times"/>
+                <w:sz w:val="24"/>
+                <w:szCs w:val="24"/>
+                <w:rtl w:val="0"/>
+              </w:rPr>
+              <w:t xml:space="preserve">At payments queue, a design the UI in a way that allows cashiers to mark transactions as paid</w:t>
             </w:r>
           </w:p>
           <w:p>
             <w:pPr>
               <w:numPr>
                 <w:ilvl w:val="1"/>
-                <w:numId w:val="12"/>
+                <w:numId w:val="43"/>
               </w:numPr>
               <w:spacing w:after="0" w:afterAutospacing="0" w:line="240" w:lineRule="auto"/>
               <w:ind w:left="1440" w:hanging="360"/>
@@ -785,14 +905,14 @@
                 <w:szCs w:val="24"/>
                 <w:rtl w:val="0"/>
               </w:rPr>
-              <w:t xml:space="preserve">Build this in the booking process (for both receptionist and customer) &gt; date time picker</w:t>
+              <w:t xml:space="preserve">If the transaction is downpayment not full, marking it as paid shows partially paid instead of fully paid</w:t>
             </w:r>
           </w:p>
           <w:p>
             <w:pPr>
               <w:numPr>
                 <w:ilvl w:val="1"/>
-                <w:numId w:val="12"/>
+                <w:numId w:val="43"/>
               </w:numPr>
               <w:spacing w:after="0" w:afterAutospacing="0" w:line="240" w:lineRule="auto"/>
               <w:ind w:left="1440" w:hanging="360"/>
@@ -809,17 +929,17 @@
                 <w:szCs w:val="24"/>
                 <w:rtl w:val="0"/>
               </w:rPr>
-              <w:t xml:space="preserve">They should be able to choose if it’s an online booking or walk-ins</w:t>
+              <w:t xml:space="preserve">Each list item should have a way to view the payment details (e.g. date, amount) for each transaction within the booking)</w:t>
             </w:r>
           </w:p>
           <w:p>
             <w:pPr>
               <w:numPr>
-                <w:ilvl w:val="1"/>
-                <w:numId w:val="12"/>
+                <w:ilvl w:val="0"/>
+                <w:numId w:val="43"/>
               </w:numPr>
-              <w:spacing w:after="0" w:afterAutospacing="0" w:line="240" w:lineRule="auto"/>
-              <w:ind w:left="1440" w:hanging="360"/>
+              <w:spacing w:after="60" w:line="240" w:lineRule="auto"/>
+              <w:ind w:left="720" w:hanging="360"/>
               <w:rPr>
                 <w:rFonts w:ascii="Times" w:cs="Times" w:eastAsia="Times" w:hAnsi="Times"/>
                 <w:sz w:val="24"/>
@@ -833,55 +953,7 @@
                 <w:szCs w:val="24"/>
                 <w:rtl w:val="0"/>
               </w:rPr>
-              <w:t xml:space="preserve">If they’re a walk-in, put them in automatically in the booking queue</w:t>
-            </w:r>
-          </w:p>
-          <w:p>
-            <w:pPr>
-              <w:numPr>
-                <w:ilvl w:val="1"/>
-                <w:numId w:val="12"/>
-              </w:numPr>
-              <w:spacing w:after="0" w:afterAutospacing="0" w:line="240" w:lineRule="auto"/>
-              <w:ind w:left="1440" w:hanging="360"/>
-              <w:rPr>
-                <w:rFonts w:ascii="Times" w:cs="Times" w:eastAsia="Times" w:hAnsi="Times"/>
-                <w:sz w:val="24"/>
-                <w:szCs w:val="24"/>
-              </w:rPr>
-            </w:pPr>
-            <w:r>
-              <w:rPr>
-                <w:rFonts w:ascii="Times" w:cs="Times" w:eastAsia="Times" w:hAnsi="Times"/>
-                <w:sz w:val="24"/>
-                <w:szCs w:val="24"/>
-                <w:rtl w:val="0"/>
-              </w:rPr>
-              <w:t xml:space="preserve">You might need to improve the booking queue status (to differentiate between unfinal online bookings and walk in bookings, or perhaps just make online bookings to pending, and walkin bookings to in progress)</w:t>
-            </w:r>
-          </w:p>
-          <w:p>
-            <w:pPr>
-              <w:numPr>
-                <w:ilvl w:val="1"/>
-                <w:numId w:val="12"/>
-              </w:numPr>
-              <w:spacing w:after="60" w:line="240" w:lineRule="auto"/>
-              <w:ind w:left="1440" w:hanging="360"/>
-              <w:rPr>
-                <w:rFonts w:ascii="Times" w:cs="Times" w:eastAsia="Times" w:hAnsi="Times"/>
-                <w:sz w:val="24"/>
-                <w:szCs w:val="24"/>
-              </w:rPr>
-            </w:pPr>
-            <w:r>
-              <w:rPr>
-                <w:rFonts w:ascii="Times" w:cs="Times" w:eastAsia="Times" w:hAnsi="Times"/>
-                <w:sz w:val="24"/>
-                <w:szCs w:val="24"/>
-                <w:rtl w:val="0"/>
-              </w:rPr>
-              <w:t xml:space="preserve">Only walk-in bookings should show up at the other queues (e.g. grooming, vet, hotel, daycare)</w:t>
+              <w:t xml:space="preserve">Discounts and promos apply before downpayment is calculated</w:t>
             </w:r>
           </w:p>
         </w:tc>
@@ -900,7 +972,7 @@
             <w:sdt>
               <w:sdtPr>
                 <w:alias w:val="Assignee"/>
-                <w:id w:val="1451203923"/>
+                <w:id w:val="-633916422"/>
                 <w:dropDownList w:lastValue="Matthew">
                   <w:listItem w:displayText="None" w:value="None"/>
                   <w:listItem w:displayText="Alarie" w:value="Alarie"/>
@@ -949,7 +1021,7 @@
             <w:sdt>
               <w:sdtPr>
                 <w:alias w:val="Project status"/>
-                <w:id w:val="-1883573038"/>
+                <w:id w:val="-1326477683"/>
                 <w:dropDownList w:lastValue="Completed">
                   <w:listItem w:displayText="Not Started" w:value="Not Started"/>
                   <w:listItem w:displayText="Blocked" w:value="Blocked"/>
@@ -983,9 +1055,9 @@
             <w:pPr>
               <w:numPr>
                 <w:ilvl w:val="0"/>
-                <w:numId w:val="32"/>
+                <w:numId w:val="16"/>
               </w:numPr>
-              <w:spacing w:after="60" w:line="240" w:lineRule="auto"/>
+              <w:spacing w:after="0" w:afterAutospacing="0" w:line="240" w:lineRule="auto"/>
               <w:ind w:left="720" w:hanging="360"/>
               <w:rPr>
                 <w:rFonts w:ascii="Times" w:cs="Times" w:eastAsia="Times" w:hAnsi="Times"/>
@@ -1000,12 +1072,31 @@
                 <w:szCs w:val="24"/>
                 <w:rtl w:val="0"/>
               </w:rPr>
-              <w:t xml:space="preserve">Move the down payment toggle/config so it applies per transaction (all online bookings/services), not per individual service.</w:t>
+              <w:t xml:space="preserve">Confirm that the downpayment config at admin settings only applies to online bookings and not walk ins</w:t>
             </w:r>
+          </w:p>
+          <w:p>
+            <w:pPr>
+              <w:numPr>
+                <w:ilvl w:val="1"/>
+                <w:numId w:val="16"/>
+              </w:numPr>
+              <w:spacing w:after="60" w:line="240" w:lineRule="auto"/>
+              <w:ind w:left="1440" w:hanging="360"/>
+              <w:rPr>
+                <w:rFonts w:ascii="Times" w:cs="Times" w:eastAsia="Times" w:hAnsi="Times"/>
+                <w:sz w:val="24"/>
+                <w:szCs w:val="24"/>
+              </w:rPr>
+            </w:pPr>
             <w:r>
               <w:rPr>
+                <w:rFonts w:ascii="Times" w:cs="Times" w:eastAsia="Times" w:hAnsi="Times"/>
+                <w:sz w:val="24"/>
+                <w:szCs w:val="24"/>
                 <w:rtl w:val="0"/>
               </w:rPr>
+              <w:t xml:space="preserve">Online bookings are identified as bookings made not on the same date and time (any other booking that’s not a walk in)</w:t>
             </w:r>
           </w:p>
         </w:tc>
@@ -1024,7 +1115,7 @@
             <w:sdt>
               <w:sdtPr>
                 <w:alias w:val="Assignee"/>
-                <w:id w:val="-1720581436"/>
+                <w:id w:val="721237909"/>
                 <w:dropDownList w:lastValue="Matthew">
                   <w:listItem w:displayText="None" w:value="None"/>
                   <w:listItem w:displayText="Alarie" w:value="Alarie"/>
@@ -1073,7 +1164,370 @@
             <w:sdt>
               <w:sdtPr>
                 <w:alias w:val="Project status"/>
-                <w:id w:val="1953104382"/>
+                <w:id w:val="2083548175"/>
+                <w:dropDownList w:lastValue="Completed">
+                  <w:listItem w:displayText="Not Started" w:value="Not Started"/>
+                  <w:listItem w:displayText="Blocked" w:value="Blocked"/>
+                  <w:listItem w:displayText="In Progress" w:value="In Progress"/>
+                  <w:listItem w:displayText="Completed" w:value="Completed"/>
+                </w:dropDownList>
+              </w:sdtPr>
+              <w:sdtContent>
+                <w:r>
+                  <w:rPr>
+                    <w:rFonts w:ascii="Times" w:cs="Times" w:eastAsia="Times" w:hAnsi="Times"/>
+                    <w:color w:val="11734b"/>
+                    <w:sz w:val="24"/>
+                    <w:szCs w:val="24"/>
+                    <w:shd w:fill="d4edbc" w:val="clear"/>
+                  </w:rPr>
+                  <w:t xml:space="preserve">Completed</w:t>
+                </w:r>
+              </w:sdtContent>
+            </w:sdt>
+            <w:r>
+              <w:rPr>
+                <w:rtl w:val="0"/>
+              </w:rPr>
+            </w:r>
+          </w:p>
+        </w:tc>
+        <w:tc>
+          <w:tcPr/>
+          <w:p>
+            <w:pPr>
+              <w:numPr>
+                <w:ilvl w:val="0"/>
+                <w:numId w:val="11"/>
+              </w:numPr>
+              <w:spacing w:after="0" w:afterAutospacing="0" w:line="240" w:lineRule="auto"/>
+              <w:ind w:left="720" w:hanging="360"/>
+              <w:rPr>
+                <w:rFonts w:ascii="Times" w:cs="Times" w:eastAsia="Times" w:hAnsi="Times"/>
+                <w:sz w:val="24"/>
+                <w:szCs w:val="24"/>
+              </w:rPr>
+            </w:pPr>
+            <w:r>
+              <w:rPr>
+                <w:rFonts w:ascii="Times" w:cs="Times" w:eastAsia="Times" w:hAnsi="Times"/>
+                <w:sz w:val="24"/>
+                <w:szCs w:val="24"/>
+                <w:rtl w:val="0"/>
+              </w:rPr>
+              <w:t xml:space="preserve">Build a dedicated walk-in booking flow: same-day, on-site registration for walk-in customers, distinct from the future-appointment booking flow.</w:t>
+            </w:r>
+          </w:p>
+          <w:p>
+            <w:pPr>
+              <w:numPr>
+                <w:ilvl w:val="1"/>
+                <w:numId w:val="11"/>
+              </w:numPr>
+              <w:spacing w:after="0" w:afterAutospacing="0" w:line="240" w:lineRule="auto"/>
+              <w:ind w:left="1440" w:hanging="360"/>
+              <w:rPr>
+                <w:rFonts w:ascii="Times" w:cs="Times" w:eastAsia="Times" w:hAnsi="Times"/>
+                <w:sz w:val="24"/>
+                <w:szCs w:val="24"/>
+              </w:rPr>
+            </w:pPr>
+            <w:r>
+              <w:rPr>
+                <w:rFonts w:ascii="Times" w:cs="Times" w:eastAsia="Times" w:hAnsi="Times"/>
+                <w:sz w:val="24"/>
+                <w:szCs w:val="24"/>
+                <w:rtl w:val="0"/>
+              </w:rPr>
+              <w:t xml:space="preserve">Build this in the booking process (for both receptionist and customer) &gt; date time picker</w:t>
+            </w:r>
+          </w:p>
+          <w:p>
+            <w:pPr>
+              <w:numPr>
+                <w:ilvl w:val="1"/>
+                <w:numId w:val="11"/>
+              </w:numPr>
+              <w:spacing w:after="0" w:afterAutospacing="0" w:line="240" w:lineRule="auto"/>
+              <w:ind w:left="1440" w:hanging="360"/>
+              <w:rPr>
+                <w:rFonts w:ascii="Times" w:cs="Times" w:eastAsia="Times" w:hAnsi="Times"/>
+                <w:sz w:val="24"/>
+                <w:szCs w:val="24"/>
+              </w:rPr>
+            </w:pPr>
+            <w:r>
+              <w:rPr>
+                <w:rFonts w:ascii="Times" w:cs="Times" w:eastAsia="Times" w:hAnsi="Times"/>
+                <w:sz w:val="24"/>
+                <w:szCs w:val="24"/>
+                <w:rtl w:val="0"/>
+              </w:rPr>
+              <w:t xml:space="preserve">They should be able to choose if it’s an online booking or walk-ins</w:t>
+            </w:r>
+          </w:p>
+          <w:p>
+            <w:pPr>
+              <w:numPr>
+                <w:ilvl w:val="1"/>
+                <w:numId w:val="11"/>
+              </w:numPr>
+              <w:spacing w:after="0" w:afterAutospacing="0" w:line="240" w:lineRule="auto"/>
+              <w:ind w:left="1440" w:hanging="360"/>
+              <w:rPr>
+                <w:rFonts w:ascii="Times" w:cs="Times" w:eastAsia="Times" w:hAnsi="Times"/>
+                <w:sz w:val="24"/>
+                <w:szCs w:val="24"/>
+              </w:rPr>
+            </w:pPr>
+            <w:r>
+              <w:rPr>
+                <w:rFonts w:ascii="Times" w:cs="Times" w:eastAsia="Times" w:hAnsi="Times"/>
+                <w:sz w:val="24"/>
+                <w:szCs w:val="24"/>
+                <w:rtl w:val="0"/>
+              </w:rPr>
+              <w:t xml:space="preserve">If they’re a walk-in, put them in automatically in the booking queue</w:t>
+            </w:r>
+          </w:p>
+          <w:p>
+            <w:pPr>
+              <w:numPr>
+                <w:ilvl w:val="1"/>
+                <w:numId w:val="11"/>
+              </w:numPr>
+              <w:spacing w:after="0" w:afterAutospacing="0" w:line="240" w:lineRule="auto"/>
+              <w:ind w:left="1440" w:hanging="360"/>
+              <w:rPr>
+                <w:rFonts w:ascii="Times" w:cs="Times" w:eastAsia="Times" w:hAnsi="Times"/>
+                <w:sz w:val="24"/>
+                <w:szCs w:val="24"/>
+              </w:rPr>
+            </w:pPr>
+            <w:r>
+              <w:rPr>
+                <w:rFonts w:ascii="Times" w:cs="Times" w:eastAsia="Times" w:hAnsi="Times"/>
+                <w:sz w:val="24"/>
+                <w:szCs w:val="24"/>
+                <w:rtl w:val="0"/>
+              </w:rPr>
+              <w:t xml:space="preserve">You might need to improve the booking queue status (to differentiate between unfinal online bookings and walk in bookings, or perhaps just make online bookings to pending, and walkin bookings to in progress)</w:t>
+            </w:r>
+          </w:p>
+          <w:p>
+            <w:pPr>
+              <w:numPr>
+                <w:ilvl w:val="1"/>
+                <w:numId w:val="11"/>
+              </w:numPr>
+              <w:spacing w:after="60" w:line="240" w:lineRule="auto"/>
+              <w:ind w:left="1440" w:hanging="360"/>
+              <w:rPr>
+                <w:rFonts w:ascii="Times" w:cs="Times" w:eastAsia="Times" w:hAnsi="Times"/>
+                <w:sz w:val="24"/>
+                <w:szCs w:val="24"/>
+              </w:rPr>
+            </w:pPr>
+            <w:r>
+              <w:rPr>
+                <w:rFonts w:ascii="Times" w:cs="Times" w:eastAsia="Times" w:hAnsi="Times"/>
+                <w:sz w:val="24"/>
+                <w:szCs w:val="24"/>
+                <w:rtl w:val="0"/>
+              </w:rPr>
+              <w:t xml:space="preserve">Only walk-in bookings should show up at the other queues (e.g. grooming, vet, hotel, daycare)</w:t>
+            </w:r>
+          </w:p>
+        </w:tc>
+        <w:tc>
+          <w:tcPr/>
+          <w:p>
+            <w:pPr>
+              <w:widowControl w:val="0"/>
+              <w:spacing w:line="240" w:lineRule="auto"/>
+              <w:rPr>
+                <w:rFonts w:ascii="Times" w:cs="Times" w:eastAsia="Times" w:hAnsi="Times"/>
+                <w:sz w:val="24"/>
+                <w:szCs w:val="24"/>
+              </w:rPr>
+            </w:pPr>
+            <w:sdt>
+              <w:sdtPr>
+                <w:alias w:val="Assignee"/>
+                <w:id w:val="-733079948"/>
+                <w:dropDownList w:lastValue="Matthew">
+                  <w:listItem w:displayText="None" w:value="None"/>
+                  <w:listItem w:displayText="Alarie" w:value="Alarie"/>
+                  <w:listItem w:displayText="James" w:value="James"/>
+                  <w:listItem w:displayText="Matthew" w:value="Matthew"/>
+                </w:dropDownList>
+              </w:sdtPr>
+              <w:sdtContent>
+                <w:r>
+                  <w:rPr>
+                    <w:rFonts w:ascii="Times" w:cs="Times" w:eastAsia="Times" w:hAnsi="Times"/>
+                    <w:color w:val="11734b"/>
+                    <w:sz w:val="24"/>
+                    <w:szCs w:val="24"/>
+                    <w:shd w:fill="d4edbc" w:val="clear"/>
+                  </w:rPr>
+                  <w:t xml:space="preserve">Matthew</w:t>
+                </w:r>
+              </w:sdtContent>
+            </w:sdt>
+            <w:r>
+              <w:rPr>
+                <w:rtl w:val="0"/>
+              </w:rPr>
+            </w:r>
+          </w:p>
+        </w:tc>
+      </w:tr>
+      <w:tr>
+        <w:trPr>
+          <w:cantSplit w:val="0"/>
+          <w:tblHeader w:val="0"/>
+        </w:trPr>
+        <w:tc>
+          <w:tcPr/>
+          <w:p>
+            <w:pPr>
+              <w:widowControl w:val="0"/>
+              <w:spacing w:line="240" w:lineRule="auto"/>
+              <w:rPr>
+                <w:rFonts w:ascii="Times" w:cs="Times" w:eastAsia="Times" w:hAnsi="Times"/>
+                <w:sz w:val="24"/>
+                <w:szCs w:val="24"/>
+              </w:rPr>
+            </w:pPr>
+            <w:sdt>
+              <w:sdtPr>
+                <w:alias w:val="Project status"/>
+                <w:id w:val="857567515"/>
+                <w:dropDownList w:lastValue="Completed">
+                  <w:listItem w:displayText="Not Started" w:value="Not Started"/>
+                  <w:listItem w:displayText="Blocked" w:value="Blocked"/>
+                  <w:listItem w:displayText="In Progress" w:value="In Progress"/>
+                  <w:listItem w:displayText="Completed" w:value="Completed"/>
+                </w:dropDownList>
+              </w:sdtPr>
+              <w:sdtContent>
+                <w:r>
+                  <w:rPr>
+                    <w:rFonts w:ascii="Times" w:cs="Times" w:eastAsia="Times" w:hAnsi="Times"/>
+                    <w:color w:val="11734b"/>
+                    <w:sz w:val="24"/>
+                    <w:szCs w:val="24"/>
+                    <w:shd w:fill="d4edbc" w:val="clear"/>
+                  </w:rPr>
+                  <w:t xml:space="preserve">Completed</w:t>
+                </w:r>
+              </w:sdtContent>
+            </w:sdt>
+            <w:r>
+              <w:rPr>
+                <w:rtl w:val="0"/>
+              </w:rPr>
+            </w:r>
+          </w:p>
+        </w:tc>
+        <w:tc>
+          <w:tcPr/>
+          <w:p>
+            <w:pPr>
+              <w:numPr>
+                <w:ilvl w:val="0"/>
+                <w:numId w:val="29"/>
+              </w:numPr>
+              <w:spacing w:after="60" w:line="240" w:lineRule="auto"/>
+              <w:ind w:left="720" w:hanging="360"/>
+              <w:rPr>
+                <w:rFonts w:ascii="Times" w:cs="Times" w:eastAsia="Times" w:hAnsi="Times"/>
+                <w:sz w:val="24"/>
+                <w:szCs w:val="24"/>
+              </w:rPr>
+            </w:pPr>
+            <w:r>
+              <w:rPr>
+                <w:rFonts w:ascii="Times" w:cs="Times" w:eastAsia="Times" w:hAnsi="Times"/>
+                <w:sz w:val="24"/>
+                <w:szCs w:val="24"/>
+                <w:rtl w:val="0"/>
+              </w:rPr>
+              <w:t xml:space="preserve">Move the down payment toggle/config so it applies per transaction (all online bookings/services), not per individual service.</w:t>
+            </w:r>
+            <w:r>
+              <w:rPr>
+                <w:rtl w:val="0"/>
+              </w:rPr>
+            </w:r>
+          </w:p>
+        </w:tc>
+        <w:tc>
+          <w:tcPr/>
+          <w:p>
+            <w:pPr>
+              <w:widowControl w:val="0"/>
+              <w:spacing w:line="240" w:lineRule="auto"/>
+              <w:rPr>
+                <w:rFonts w:ascii="Times" w:cs="Times" w:eastAsia="Times" w:hAnsi="Times"/>
+                <w:sz w:val="24"/>
+                <w:szCs w:val="24"/>
+              </w:rPr>
+            </w:pPr>
+            <w:sdt>
+              <w:sdtPr>
+                <w:alias w:val="Assignee"/>
+                <w:id w:val="1756989072"/>
+                <w:dropDownList w:lastValue="Matthew">
+                  <w:listItem w:displayText="None" w:value="None"/>
+                  <w:listItem w:displayText="Alarie" w:value="Alarie"/>
+                  <w:listItem w:displayText="James" w:value="James"/>
+                  <w:listItem w:displayText="Matthew" w:value="Matthew"/>
+                </w:dropDownList>
+              </w:sdtPr>
+              <w:sdtContent>
+                <w:r>
+                  <w:rPr>
+                    <w:rFonts w:ascii="Times" w:cs="Times" w:eastAsia="Times" w:hAnsi="Times"/>
+                    <w:color w:val="11734b"/>
+                    <w:sz w:val="24"/>
+                    <w:szCs w:val="24"/>
+                    <w:shd w:fill="d4edbc" w:val="clear"/>
+                  </w:rPr>
+                  <w:t xml:space="preserve">Matthew</w:t>
+                </w:r>
+              </w:sdtContent>
+            </w:sdt>
+            <w:r>
+              <w:rPr>
+                <w:rtl w:val="0"/>
+              </w:rPr>
+            </w:r>
+          </w:p>
+        </w:tc>
+      </w:tr>
+      <w:tr>
+        <w:trPr>
+          <w:cantSplit w:val="0"/>
+          <w:tblHeader w:val="0"/>
+        </w:trPr>
+        <w:tc>
+          <w:tcPr/>
+          <w:p>
+            <w:pPr>
+              <w:widowControl w:val="0"/>
+              <w:spacing w:line="240" w:lineRule="auto"/>
+              <w:rPr>
+                <w:rFonts w:ascii="Times" w:cs="Times" w:eastAsia="Times" w:hAnsi="Times"/>
+                <w:sz w:val="24"/>
+                <w:szCs w:val="24"/>
+              </w:rPr>
+            </w:pPr>
+            <w:sdt>
+              <w:sdtPr>
+                <w:alias w:val="Project status"/>
+                <w:id w:val="564463359"/>
                 <w:dropDownList w:lastValue="Completed">
                   <w:listItem w:displayText="Not Started" w:value="Not Started"/>
                   <w:listItem w:displayText="Blocked" w:value="Blocked"/>
@@ -1109,7 +1563,7 @@
               <w:keepLines w:val="1"/>
               <w:numPr>
                 <w:ilvl w:val="0"/>
-                <w:numId w:val="23"/>
+                <w:numId w:val="21"/>
               </w:numPr>
               <w:spacing w:after="0" w:afterAutospacing="0" w:before="240" w:lineRule="auto"/>
               <w:ind w:left="720" w:hanging="360"/>
@@ -1135,7 +1589,7 @@
               <w:keepLines w:val="1"/>
               <w:numPr>
                 <w:ilvl w:val="1"/>
-                <w:numId w:val="23"/>
+                <w:numId w:val="21"/>
               </w:numPr>
               <w:spacing w:after="0" w:afterAutospacing="0" w:before="0" w:beforeAutospacing="0" w:lineRule="auto"/>
               <w:ind w:left="1440" w:hanging="360"/>
@@ -1161,7 +1615,7 @@
               <w:keepLines w:val="1"/>
               <w:numPr>
                 <w:ilvl w:val="1"/>
-                <w:numId w:val="23"/>
+                <w:numId w:val="21"/>
               </w:numPr>
               <w:spacing w:after="240" w:before="0" w:beforeAutospacing="0" w:lineRule="auto"/>
               <w:ind w:left="1440" w:hanging="360"/>
@@ -1197,7 +1651,7 @@
             <w:sdt>
               <w:sdtPr>
                 <w:alias w:val="Assignee"/>
-                <w:id w:val="987840276"/>
+                <w:id w:val="320019237"/>
                 <w:dropDownList w:lastValue="Matthew">
                   <w:listItem w:displayText="None" w:value="None"/>
                   <w:listItem w:displayText="Alarie" w:value="Alarie"/>
@@ -1277,7 +1731,7 @@
           <w:pgNumType w:start="1"/>
         </w:sectPr>
       </w:pPr>
-      <w:bookmarkStart w:colFirst="0" w:colLast="0" w:name="_hficqx6e0rr4" w:id="1"/>
+      <w:bookmarkStart w:colFirst="0" w:colLast="0" w:name="_yr4u3t7jj9go" w:id="1"/>
       <w:bookmarkEnd w:id="1"/>
       <w:r>
         <w:rPr>
@@ -1296,7 +1750,7 @@
           <w:vertAlign w:val="baseline"/>
           <w:rtl w:val="0"/>
         </w:rPr>
-        <w:t xml:space="preserve">Old (to move)</w:t>
+        <w:t xml:space="preserve">Ideas</w:t>
       </w:r>
       <w:r>
         <w:rPr>
@@ -1355,7 +1809,7 @@
           <w:pgNumType w:start="1"/>
         </w:sectPr>
       </w:pPr>
-      <w:bookmarkStart w:colFirst="0" w:colLast="0" w:name="_1xccw61rwvn3" w:id="2"/>
+      <w:bookmarkStart w:colFirst="0" w:colLast="0" w:name="_6zy4h7z7c1pk" w:id="2"/>
       <w:bookmarkEnd w:id="2"/>
       <w:r>
         <w:rPr>
@@ -1388,7 +1842,7 @@
         <w:keepLines w:val="1"/>
         <w:numPr>
           <w:ilvl w:val="0"/>
-          <w:numId w:val="38"/>
+          <w:numId w:val="36"/>
         </w:numPr>
         <w:spacing w:after="0" w:afterAutospacing="0" w:before="240" w:lineRule="auto"/>
         <w:ind w:left="720" w:hanging="360"/>
@@ -1414,7 +1868,7 @@
         <w:keepLines w:val="1"/>
         <w:numPr>
           <w:ilvl w:val="1"/>
-          <w:numId w:val="38"/>
+          <w:numId w:val="36"/>
         </w:numPr>
         <w:spacing w:after="0" w:afterAutospacing="0" w:before="0" w:beforeAutospacing="0" w:lineRule="auto"/>
         <w:ind w:left="1440" w:hanging="360"/>
@@ -1440,7 +1894,7 @@
         <w:keepLines w:val="1"/>
         <w:numPr>
           <w:ilvl w:val="1"/>
-          <w:numId w:val="38"/>
+          <w:numId w:val="36"/>
         </w:numPr>
         <w:spacing w:after="0" w:afterAutospacing="0" w:before="0" w:beforeAutospacing="0" w:lineRule="auto"/>
         <w:ind w:left="1440" w:hanging="360"/>
@@ -1466,7 +1920,7 @@
         <w:keepLines w:val="1"/>
         <w:numPr>
           <w:ilvl w:val="1"/>
-          <w:numId w:val="38"/>
+          <w:numId w:val="36"/>
         </w:numPr>
         <w:spacing w:after="0" w:afterAutospacing="0" w:before="0" w:beforeAutospacing="0" w:lineRule="auto"/>
         <w:ind w:left="1440" w:hanging="360"/>
@@ -1492,7 +1946,7 @@
         <w:keepLines w:val="1"/>
         <w:numPr>
           <w:ilvl w:val="0"/>
-          <w:numId w:val="27"/>
+          <w:numId w:val="36"/>
         </w:numPr>
         <w:spacing w:after="0" w:afterAutospacing="0" w:before="0" w:beforeAutospacing="0" w:lineRule="auto"/>
         <w:ind w:left="720" w:hanging="360"/>
@@ -1518,7 +1972,7 @@
         <w:keepLines w:val="1"/>
         <w:numPr>
           <w:ilvl w:val="1"/>
-          <w:numId w:val="27"/>
+          <w:numId w:val="36"/>
         </w:numPr>
         <w:spacing w:after="0" w:afterAutospacing="0" w:before="0" w:beforeAutospacing="0" w:lineRule="auto"/>
         <w:ind w:left="1440" w:hanging="360"/>
@@ -1544,7 +1998,7 @@
         <w:keepLines w:val="1"/>
         <w:numPr>
           <w:ilvl w:val="1"/>
-          <w:numId w:val="27"/>
+          <w:numId w:val="36"/>
         </w:numPr>
         <w:spacing w:after="0" w:afterAutospacing="0" w:before="0" w:beforeAutospacing="0" w:lineRule="auto"/>
         <w:ind w:left="1440" w:hanging="360"/>
@@ -1570,7 +2024,7 @@
         <w:keepLines w:val="1"/>
         <w:numPr>
           <w:ilvl w:val="0"/>
-          <w:numId w:val="27"/>
+          <w:numId w:val="36"/>
         </w:numPr>
         <w:spacing w:after="0" w:afterAutospacing="0" w:before="0" w:beforeAutospacing="0" w:lineRule="auto"/>
         <w:ind w:left="720" w:hanging="360"/>
@@ -1618,7 +2072,7 @@
         <w:keepLines w:val="1"/>
         <w:numPr>
           <w:ilvl w:val="1"/>
-          <w:numId w:val="27"/>
+          <w:numId w:val="36"/>
         </w:numPr>
         <w:spacing w:after="0" w:afterAutospacing="0" w:before="0" w:beforeAutospacing="0" w:lineRule="auto"/>
         <w:ind w:left="1440" w:hanging="360"/>
@@ -1662,7 +2116,7 @@
         <w:keepLines w:val="1"/>
         <w:numPr>
           <w:ilvl w:val="1"/>
-          <w:numId w:val="27"/>
+          <w:numId w:val="36"/>
         </w:numPr>
         <w:spacing w:after="0" w:afterAutospacing="0" w:before="0" w:beforeAutospacing="0" w:lineRule="auto"/>
         <w:ind w:left="1440" w:hanging="360"/>
@@ -1710,7 +2164,7 @@
         <w:keepLines w:val="1"/>
         <w:numPr>
           <w:ilvl w:val="1"/>
-          <w:numId w:val="27"/>
+          <w:numId w:val="36"/>
         </w:numPr>
         <w:spacing w:after="0" w:afterAutospacing="0" w:before="0" w:beforeAutospacing="0" w:lineRule="auto"/>
         <w:ind w:left="1440" w:hanging="360"/>
@@ -1736,7 +2190,7 @@
         <w:keepLines w:val="1"/>
         <w:numPr>
           <w:ilvl w:val="2"/>
-          <w:numId w:val="27"/>
+          <w:numId w:val="36"/>
         </w:numPr>
         <w:spacing w:after="0" w:afterAutospacing="0" w:before="0" w:beforeAutospacing="0" w:lineRule="auto"/>
         <w:ind w:left="2160" w:hanging="360"/>
@@ -1756,12 +2210,12 @@
           <wp:inline distB="114300" distT="114300" distL="114300" distR="114300">
             <wp:extent cx="4897167" cy="2629088"/>
             <wp:effectExtent b="0" l="0" r="0" t="0"/>
-            <wp:docPr id="2" name="image1.png"/>
+            <wp:docPr id="1" name="image2.png"/>
             <a:graphic>
               <a:graphicData uri="http://schemas.openxmlformats.org/drawingml/2006/picture">
                 <pic:pic>
                   <pic:nvPicPr>
-                    <pic:cNvPr id="0" name="image1.png"/>
+                    <pic:cNvPr id="0" name="image2.png"/>
                     <pic:cNvPicPr preferRelativeResize="0"/>
                   </pic:nvPicPr>
                   <pic:blipFill>
@@ -1797,7 +2251,7 @@
         <w:keepLines w:val="1"/>
         <w:numPr>
           <w:ilvl w:val="0"/>
-          <w:numId w:val="27"/>
+          <w:numId w:val="36"/>
         </w:numPr>
         <w:spacing w:after="0" w:afterAutospacing="0" w:before="0" w:beforeAutospacing="0" w:lineRule="auto"/>
         <w:ind w:left="720" w:hanging="360"/>
@@ -1845,7 +2299,7 @@
         <w:keepLines w:val="1"/>
         <w:numPr>
           <w:ilvl w:val="1"/>
-          <w:numId w:val="27"/>
+          <w:numId w:val="36"/>
         </w:numPr>
         <w:spacing w:after="0" w:afterAutospacing="0" w:before="0" w:beforeAutospacing="0" w:lineRule="auto"/>
         <w:ind w:left="1440" w:hanging="360"/>
@@ -1867,7 +2321,7 @@
         <w:keepLines w:val="1"/>
         <w:numPr>
           <w:ilvl w:val="1"/>
-          <w:numId w:val="27"/>
+          <w:numId w:val="36"/>
         </w:numPr>
         <w:spacing w:after="0" w:afterAutospacing="0" w:before="0" w:beforeAutospacing="0" w:lineRule="auto"/>
         <w:ind w:left="1440" w:hanging="360"/>
@@ -1893,7 +2347,7 @@
         <w:keepLines w:val="1"/>
         <w:numPr>
           <w:ilvl w:val="1"/>
-          <w:numId w:val="27"/>
+          <w:numId w:val="36"/>
         </w:numPr>
         <w:spacing w:after="0" w:afterAutospacing="0" w:before="0" w:beforeAutospacing="0" w:lineRule="auto"/>
         <w:ind w:left="1440" w:hanging="360"/>
@@ -1919,7 +2373,7 @@
         <w:keepLines w:val="1"/>
         <w:numPr>
           <w:ilvl w:val="1"/>
-          <w:numId w:val="27"/>
+          <w:numId w:val="36"/>
         </w:numPr>
         <w:spacing w:after="0" w:afterAutospacing="0" w:before="0" w:beforeAutospacing="0" w:lineRule="auto"/>
         <w:ind w:left="1440" w:hanging="360"/>
@@ -1945,7 +2399,7 @@
         <w:keepLines w:val="1"/>
         <w:numPr>
           <w:ilvl w:val="1"/>
-          <w:numId w:val="27"/>
+          <w:numId w:val="36"/>
         </w:numPr>
         <w:spacing w:after="0" w:afterAutospacing="0" w:before="0" w:beforeAutospacing="0" w:lineRule="auto"/>
         <w:ind w:left="1440" w:hanging="360"/>
@@ -1971,7 +2425,7 @@
         <w:keepLines w:val="1"/>
         <w:numPr>
           <w:ilvl w:val="1"/>
-          <w:numId w:val="27"/>
+          <w:numId w:val="36"/>
         </w:numPr>
         <w:spacing w:after="0" w:afterAutospacing="0" w:before="0" w:beforeAutospacing="0" w:lineRule="auto"/>
         <w:ind w:left="1440" w:hanging="360"/>
@@ -2019,7 +2473,7 @@
         <w:keepLines w:val="1"/>
         <w:numPr>
           <w:ilvl w:val="1"/>
-          <w:numId w:val="27"/>
+          <w:numId w:val="36"/>
         </w:numPr>
         <w:spacing w:after="0" w:afterAutospacing="0" w:before="0" w:beforeAutospacing="0" w:lineRule="auto"/>
         <w:ind w:left="1440" w:hanging="360"/>
@@ -2045,7 +2499,7 @@
         <w:keepLines w:val="1"/>
         <w:numPr>
           <w:ilvl w:val="1"/>
-          <w:numId w:val="27"/>
+          <w:numId w:val="36"/>
         </w:numPr>
         <w:spacing w:after="0" w:afterAutospacing="0" w:before="0" w:beforeAutospacing="0" w:lineRule="auto"/>
         <w:ind w:left="1440" w:hanging="360"/>
@@ -2065,12 +2519,12 @@
           <wp:inline distB="114300" distT="114300" distL="114300" distR="114300">
             <wp:extent cx="5370985" cy="2892069"/>
             <wp:effectExtent b="0" l="0" r="0" t="0"/>
-            <wp:docPr id="1" name="image2.png"/>
+            <wp:docPr id="2" name="image1.png"/>
             <a:graphic>
               <a:graphicData uri="http://schemas.openxmlformats.org/drawingml/2006/picture">
                 <pic:pic>
                   <pic:nvPicPr>
-                    <pic:cNvPr id="0" name="image2.png"/>
+                    <pic:cNvPr id="0" name="image1.png"/>
                     <pic:cNvPicPr preferRelativeResize="0"/>
                   </pic:nvPicPr>
                   <pic:blipFill>
@@ -2106,10 +2560,62 @@
         <w:keepLines w:val="1"/>
         <w:numPr>
           <w:ilvl w:val="0"/>
-          <w:numId w:val="27"/>
+          <w:numId w:val="36"/>
+        </w:numPr>
+        <w:spacing w:after="0" w:afterAutospacing="0" w:before="0" w:beforeAutospacing="0" w:lineRule="auto"/>
+        <w:ind w:left="720" w:hanging="360"/>
+        <w:rPr>
+          <w:rFonts w:ascii="Times" w:cs="Times" w:eastAsia="Times" w:hAnsi="Times"/>
+          <w:sz w:val="24"/>
+          <w:szCs w:val="24"/>
+        </w:rPr>
+      </w:pPr>
+      <w:r>
+        <w:rPr>
+          <w:rFonts w:ascii="Times" w:cs="Times" w:eastAsia="Times" w:hAnsi="Times"/>
+          <w:sz w:val="24"/>
+          <w:szCs w:val="24"/>
+          <w:rtl w:val="0"/>
+        </w:rPr>
+        <w:t xml:space="preserve">Add an auto configure monthly schedule feature</w:t>
+      </w:r>
+    </w:p>
+    <w:p>
+      <w:pPr>
+        <w:keepNext w:val="1"/>
+        <w:keepLines w:val="1"/>
+        <w:numPr>
+          <w:ilvl w:val="1"/>
+          <w:numId w:val="36"/>
+        </w:numPr>
+        <w:spacing w:after="0" w:afterAutospacing="0" w:before="0" w:beforeAutospacing="0" w:lineRule="auto"/>
+        <w:ind w:left="1440" w:hanging="360"/>
+        <w:rPr>
+          <w:rFonts w:ascii="Times" w:cs="Times" w:eastAsia="Times" w:hAnsi="Times"/>
+          <w:sz w:val="24"/>
+          <w:szCs w:val="24"/>
+        </w:rPr>
+      </w:pPr>
+      <w:r>
+        <w:rPr>
+          <w:rFonts w:ascii="Times" w:cs="Times" w:eastAsia="Times" w:hAnsi="Times"/>
+          <w:sz w:val="24"/>
+          <w:szCs w:val="24"/>
+          <w:rtl w:val="0"/>
+        </w:rPr>
+        <w:t xml:space="preserve">Automatically chooses rest days, etc. for all staff</w:t>
+      </w:r>
+    </w:p>
+    <w:p>
+      <w:pPr>
+        <w:keepNext w:val="1"/>
+        <w:keepLines w:val="1"/>
+        <w:numPr>
+          <w:ilvl w:val="1"/>
+          <w:numId w:val="36"/>
         </w:numPr>
         <w:spacing w:after="240" w:before="0" w:beforeAutospacing="0" w:lineRule="auto"/>
-        <w:ind w:left="720" w:hanging="360"/>
+        <w:ind w:left="1440" w:hanging="360"/>
         <w:rPr>
           <w:rFonts w:ascii="Times" w:cs="Times" w:eastAsia="Times" w:hAnsi="Times"/>
           <w:sz w:val="24"/>
@@ -2124,8 +2630,12 @@
       </w:pPr>
       <w:r>
         <w:rPr>
-          <w:rtl w:val="0"/>
-        </w:rPr>
+          <w:rFonts w:ascii="Times" w:cs="Times" w:eastAsia="Times" w:hAnsi="Times"/>
+          <w:sz w:val="24"/>
+          <w:szCs w:val="24"/>
+          <w:rtl w:val="0"/>
+        </w:rPr>
+        <w:t xml:space="preserve">Available in the monthly schedule UI</w:t>
       </w:r>
     </w:p>
     <w:p>
@@ -2158,7 +2668,7 @@
           <w:pgNumType w:start="1"/>
         </w:sectPr>
       </w:pPr>
-      <w:bookmarkStart w:colFirst="0" w:colLast="0" w:name="_d4zhgsgch57d" w:id="3"/>
+      <w:bookmarkStart w:colFirst="0" w:colLast="0" w:name="_59syje7ckxgi" w:id="3"/>
       <w:bookmarkEnd w:id="3"/>
       <w:r>
         <w:rPr>
@@ -2191,7 +2701,7 @@
         <w:keepLines w:val="1"/>
         <w:numPr>
           <w:ilvl w:val="0"/>
-          <w:numId w:val="22"/>
+          <w:numId w:val="34"/>
         </w:numPr>
         <w:spacing w:after="0" w:afterAutospacing="0" w:before="240" w:lineRule="auto"/>
         <w:ind w:left="720" w:hanging="360"/>
@@ -2217,7 +2727,7 @@
         <w:keepLines w:val="1"/>
         <w:numPr>
           <w:ilvl w:val="1"/>
-          <w:numId w:val="22"/>
+          <w:numId w:val="34"/>
         </w:numPr>
         <w:spacing w:after="0" w:afterAutospacing="0" w:before="0" w:beforeAutospacing="0" w:lineRule="auto"/>
         <w:ind w:left="1440" w:hanging="360"/>
@@ -2243,7 +2753,7 @@
         <w:keepLines w:val="1"/>
         <w:numPr>
           <w:ilvl w:val="1"/>
-          <w:numId w:val="22"/>
+          <w:numId w:val="34"/>
         </w:numPr>
         <w:spacing w:after="0" w:afterAutospacing="0" w:before="0" w:beforeAutospacing="0" w:lineRule="auto"/>
         <w:ind w:left="1440" w:hanging="360"/>
@@ -2269,7 +2779,7 @@
         <w:keepLines w:val="1"/>
         <w:numPr>
           <w:ilvl w:val="1"/>
-          <w:numId w:val="22"/>
+          <w:numId w:val="34"/>
         </w:numPr>
         <w:spacing w:after="0" w:afterAutospacing="0" w:before="0" w:beforeAutospacing="0" w:lineRule="auto"/>
         <w:ind w:left="1440" w:hanging="360"/>
@@ -2295,7 +2805,7 @@
         <w:keepLines w:val="1"/>
         <w:numPr>
           <w:ilvl w:val="1"/>
-          <w:numId w:val="22"/>
+          <w:numId w:val="34"/>
         </w:numPr>
         <w:spacing w:after="0" w:afterAutospacing="0" w:before="0" w:beforeAutospacing="0" w:lineRule="auto"/>
         <w:ind w:left="1440" w:hanging="360"/>
@@ -2321,9 +2831,9 @@
         <w:keepLines w:val="1"/>
         <w:numPr>
           <w:ilvl w:val="1"/>
-          <w:numId w:val="22"/>
-        </w:numPr>
-        <w:spacing w:after="240" w:before="0" w:beforeAutospacing="0" w:lineRule="auto"/>
+          <w:numId w:val="34"/>
+        </w:numPr>
+        <w:spacing w:after="0" w:afterAutospacing="0" w:before="0" w:beforeAutospacing="0" w:lineRule="auto"/>
         <w:ind w:left="1440" w:hanging="360"/>
         <w:rPr>
           <w:rFonts w:ascii="Times" w:cs="Times" w:eastAsia="Times" w:hAnsi="Times"/>
@@ -2345,7 +2855,12 @@
       <w:pPr>
         <w:keepNext w:val="1"/>
         <w:keepLines w:val="1"/>
-        <w:spacing w:after="240" w:before="240" w:lineRule="auto"/>
+        <w:numPr>
+          <w:ilvl w:val="0"/>
+          <w:numId w:val="34"/>
+        </w:numPr>
+        <w:spacing w:after="0" w:afterAutospacing="0" w:before="0" w:beforeAutospacing="0" w:lineRule="auto"/>
+        <w:ind w:left="720" w:hanging="360"/>
         <w:rPr>
           <w:rFonts w:ascii="Times" w:cs="Times" w:eastAsia="Times" w:hAnsi="Times"/>
           <w:sz w:val="24"/>
@@ -2369,9 +2884,9 @@
         <w:keepLines w:val="1"/>
         <w:numPr>
           <w:ilvl w:val="0"/>
-          <w:numId w:val="42"/>
-        </w:numPr>
-        <w:spacing w:after="0" w:afterAutospacing="0" w:before="240" w:lineRule="auto"/>
+          <w:numId w:val="34"/>
+        </w:numPr>
+        <w:spacing w:after="0" w:afterAutospacing="0" w:before="0" w:beforeAutospacing="0" w:lineRule="auto"/>
         <w:ind w:left="720" w:hanging="360"/>
         <w:rPr>
           <w:rFonts w:ascii="Times" w:cs="Times" w:eastAsia="Times" w:hAnsi="Times"/>
@@ -2395,9 +2910,9 @@
         <w:keepLines w:val="1"/>
         <w:numPr>
           <w:ilvl w:val="1"/>
-          <w:numId w:val="42"/>
-        </w:numPr>
-        <w:spacing w:after="240" w:before="0" w:beforeAutospacing="0" w:lineRule="auto"/>
+          <w:numId w:val="34"/>
+        </w:numPr>
+        <w:spacing w:after="0" w:afterAutospacing="0" w:before="0" w:beforeAutospacing="0" w:lineRule="auto"/>
         <w:ind w:left="1440" w:hanging="360"/>
         <w:rPr>
           <w:rFonts w:ascii="Times" w:cs="Times" w:eastAsia="Times" w:hAnsi="Times"/>
@@ -2419,7 +2934,12 @@
       <w:pPr>
         <w:keepNext w:val="1"/>
         <w:keepLines w:val="1"/>
-        <w:spacing w:after="240" w:before="240" w:lineRule="auto"/>
+        <w:numPr>
+          <w:ilvl w:val="0"/>
+          <w:numId w:val="34"/>
+        </w:numPr>
+        <w:spacing w:after="0" w:afterAutospacing="0" w:before="0" w:beforeAutospacing="0" w:lineRule="auto"/>
+        <w:ind w:left="720" w:hanging="360"/>
         <w:rPr>
           <w:rFonts w:ascii="Times" w:cs="Times" w:eastAsia="Times" w:hAnsi="Times"/>
           <w:sz w:val="24"/>
@@ -2443,9 +2963,9 @@
         <w:keepLines w:val="1"/>
         <w:numPr>
           <w:ilvl w:val="0"/>
-          <w:numId w:val="42"/>
-        </w:numPr>
-        <w:spacing w:after="0" w:afterAutospacing="0" w:before="240" w:lineRule="auto"/>
+          <w:numId w:val="34"/>
+        </w:numPr>
+        <w:spacing w:after="0" w:afterAutospacing="0" w:before="0" w:beforeAutospacing="0" w:lineRule="auto"/>
         <w:ind w:left="720" w:hanging="360"/>
         <w:rPr>
           <w:rFonts w:ascii="Times" w:cs="Times" w:eastAsia="Times" w:hAnsi="Times"/>
@@ -2469,7 +2989,7 @@
         <w:keepLines w:val="1"/>
         <w:numPr>
           <w:ilvl w:val="1"/>
-          <w:numId w:val="42"/>
+          <w:numId w:val="34"/>
         </w:numPr>
         <w:spacing w:after="0" w:afterAutospacing="0" w:before="0" w:beforeAutospacing="0" w:lineRule="auto"/>
         <w:ind w:left="1440" w:hanging="360"/>
@@ -2495,7 +3015,7 @@
         <w:keepLines w:val="1"/>
         <w:numPr>
           <w:ilvl w:val="1"/>
-          <w:numId w:val="42"/>
+          <w:numId w:val="34"/>
         </w:numPr>
         <w:spacing w:after="0" w:afterAutospacing="0" w:before="0" w:beforeAutospacing="0" w:lineRule="auto"/>
         <w:ind w:left="1440" w:hanging="360"/>
@@ -2521,9 +3041,9 @@
         <w:keepLines w:val="1"/>
         <w:numPr>
           <w:ilvl w:val="1"/>
-          <w:numId w:val="42"/>
-        </w:numPr>
-        <w:spacing w:after="240" w:before="0" w:beforeAutospacing="0" w:lineRule="auto"/>
+          <w:numId w:val="34"/>
+        </w:numPr>
+        <w:spacing w:after="0" w:afterAutospacing="0" w:before="0" w:beforeAutospacing="0" w:lineRule="auto"/>
         <w:ind w:left="1440" w:hanging="360"/>
         <w:rPr>
           <w:rFonts w:ascii="Times" w:cs="Times" w:eastAsia="Times" w:hAnsi="Times"/>
@@ -2545,7 +3065,12 @@
       <w:pPr>
         <w:keepNext w:val="1"/>
         <w:keepLines w:val="1"/>
-        <w:spacing w:after="240" w:before="240" w:lineRule="auto"/>
+        <w:numPr>
+          <w:ilvl w:val="0"/>
+          <w:numId w:val="34"/>
+        </w:numPr>
+        <w:spacing w:after="0" w:afterAutospacing="0" w:before="0" w:beforeAutospacing="0" w:lineRule="auto"/>
+        <w:ind w:left="720" w:hanging="360"/>
         <w:rPr>
           <w:rFonts w:ascii="Times" w:cs="Times" w:eastAsia="Times" w:hAnsi="Times"/>
           <w:sz w:val="24"/>
@@ -2569,9 +3094,9 @@
         <w:keepLines w:val="1"/>
         <w:numPr>
           <w:ilvl w:val="0"/>
-          <w:numId w:val="5"/>
-        </w:numPr>
-        <w:spacing w:after="0" w:afterAutospacing="0" w:before="240" w:lineRule="auto"/>
+          <w:numId w:val="34"/>
+        </w:numPr>
+        <w:spacing w:after="0" w:afterAutospacing="0" w:before="0" w:beforeAutospacing="0" w:lineRule="auto"/>
         <w:ind w:left="720" w:hanging="360"/>
         <w:rPr>
           <w:rFonts w:ascii="Times" w:cs="Times" w:eastAsia="Times" w:hAnsi="Times"/>
@@ -2595,7 +3120,7 @@
         <w:keepLines w:val="1"/>
         <w:numPr>
           <w:ilvl w:val="0"/>
-          <w:numId w:val="5"/>
+          <w:numId w:val="34"/>
         </w:numPr>
         <w:spacing w:after="0" w:afterAutospacing="0" w:before="0" w:beforeAutospacing="0" w:lineRule="auto"/>
         <w:ind w:left="720" w:hanging="360"/>
@@ -2621,7 +3146,7 @@
         <w:keepLines w:val="1"/>
         <w:numPr>
           <w:ilvl w:val="1"/>
-          <w:numId w:val="5"/>
+          <w:numId w:val="34"/>
         </w:numPr>
         <w:spacing w:after="0" w:afterAutospacing="0" w:before="0" w:beforeAutospacing="0" w:lineRule="auto"/>
         <w:ind w:left="1440" w:hanging="360"/>
@@ -2647,7 +3172,7 @@
         <w:keepLines w:val="1"/>
         <w:numPr>
           <w:ilvl w:val="1"/>
-          <w:numId w:val="5"/>
+          <w:numId w:val="34"/>
         </w:numPr>
         <w:spacing w:after="0" w:afterAutospacing="0" w:before="0" w:beforeAutospacing="0" w:lineRule="auto"/>
         <w:ind w:left="1440" w:hanging="360"/>
@@ -2673,9 +3198,9 @@
         <w:keepLines w:val="1"/>
         <w:numPr>
           <w:ilvl w:val="1"/>
-          <w:numId w:val="5"/>
-        </w:numPr>
-        <w:spacing w:after="240" w:before="0" w:beforeAutospacing="0" w:lineRule="auto"/>
+          <w:numId w:val="34"/>
+        </w:numPr>
+        <w:spacing w:after="0" w:afterAutospacing="0" w:before="0" w:beforeAutospacing="0" w:lineRule="auto"/>
         <w:ind w:left="1440" w:hanging="360"/>
         <w:rPr>
           <w:rFonts w:ascii="Times" w:cs="Times" w:eastAsia="Times" w:hAnsi="Times"/>
@@ -2697,8 +3222,12 @@
       <w:pPr>
         <w:keepNext w:val="1"/>
         <w:keepLines w:val="1"/>
-        <w:spacing w:after="240" w:before="240" w:lineRule="auto"/>
-        <w:ind w:left="720" w:firstLine="0"/>
+        <w:numPr>
+          <w:ilvl w:val="1"/>
+          <w:numId w:val="34"/>
+        </w:numPr>
+        <w:spacing w:after="240" w:before="0" w:beforeAutospacing="0" w:lineRule="auto"/>
+        <w:ind w:left="1440" w:hanging="360"/>
         <w:rPr>
           <w:rFonts w:ascii="Times" w:cs="Times" w:eastAsia="Times" w:hAnsi="Times"/>
           <w:sz w:val="24"/>
@@ -2747,7 +3276,7 @@
           <w:pgNumType w:start="1"/>
         </w:sectPr>
       </w:pPr>
-      <w:bookmarkStart w:colFirst="0" w:colLast="0" w:name="_lw70rytfzytg" w:id="4"/>
+      <w:bookmarkStart w:colFirst="0" w:colLast="0" w:name="_xf672d4kn9kv" w:id="4"/>
       <w:bookmarkEnd w:id="4"/>
       <w:r>
         <w:rPr>
@@ -3541,7 +4070,7 @@
       <w:pPr>
         <w:numPr>
           <w:ilvl w:val="0"/>
-          <w:numId w:val="8"/>
+          <w:numId w:val="7"/>
         </w:numPr>
         <w:spacing w:after="0" w:afterAutospacing="0" w:line="240" w:lineRule="auto"/>
         <w:ind w:left="720" w:hanging="360"/>
@@ -3555,6 +4084,68 @@
           <w:rtl w:val="0"/>
         </w:rPr>
         <w:t xml:space="preserve">Coordinate with the business owner (Sir Mike) to complete PayMongo's Business Verification / KYC requirements before continuing integration work.</w:t>
+      </w:r>
+    </w:p>
+    <w:p>
+      <w:pPr>
+        <w:numPr>
+          <w:ilvl w:val="0"/>
+          <w:numId w:val="7"/>
+        </w:numPr>
+        <w:spacing w:after="0" w:afterAutospacing="0" w:line="240" w:lineRule="auto"/>
+        <w:ind w:left="720" w:hanging="360"/>
+        <w:rPr>
+          <w:rFonts w:ascii="Calibri" w:cs="Calibri" w:eastAsia="Calibri" w:hAnsi="Calibri"/>
+        </w:rPr>
+      </w:pPr>
+      <w:r>
+        <w:rPr>
+          <w:rFonts w:ascii="Calibri" w:cs="Calibri" w:eastAsia="Calibri" w:hAnsi="Calibri"/>
+          <w:rtl w:val="0"/>
+        </w:rPr>
+        <w:t xml:space="preserve">Prepare and store the required verification documents (business permit, IDs, etc.) in the shared Google Drive per PayMongo's checklist.</w:t>
+      </w:r>
+    </w:p>
+    <w:p>
+      <w:pPr>
+        <w:numPr>
+          <w:ilvl w:val="0"/>
+          <w:numId w:val="7"/>
+        </w:numPr>
+        <w:spacing w:after="60" w:line="240" w:lineRule="auto"/>
+        <w:ind w:left="720" w:hanging="360"/>
+        <w:rPr>
+          <w:rFonts w:ascii="Calibri" w:cs="Calibri" w:eastAsia="Calibri" w:hAnsi="Calibri"/>
+        </w:rPr>
+      </w:pPr>
+      <w:r>
+        <w:rPr>
+          <w:rFonts w:ascii="Calibri" w:cs="Calibri" w:eastAsia="Calibri" w:hAnsi="Calibri"/>
+          <w:rtl w:val="0"/>
+        </w:rPr>
+        <w:t xml:space="preserve">Define a fallback plan/scope in case business verification is denied or delayed (e.g., cash-only or manual payment recording as an interim option).</w:t>
+      </w:r>
+    </w:p>
+    <w:p>
+      <w:pPr>
+        <w:spacing w:after="80" w:before="240" w:line="240" w:lineRule="auto"/>
+        <w:rPr>
+          <w:rFonts w:ascii="Calibri" w:cs="Calibri" w:eastAsia="Calibri" w:hAnsi="Calibri"/>
+        </w:rPr>
+      </w:pPr>
+      <w:r>
+        <w:rPr>
+          <w:rFonts w:ascii="Calibri" w:cs="Calibri" w:eastAsia="Calibri" w:hAnsi="Calibri"/>
+          <w:b w:val="1"/>
+          <w:bCs w:val="1"/>
+          <w:rtl w:val="0"/>
+        </w:rPr>
+        <w:t xml:space="preserve">On Facebook Login (Meta OAuth):</w:t>
+      </w:r>
+      <w:r>
+        <w:rPr>
+          <w:rtl w:val="0"/>
+        </w:rPr>
       </w:r>
     </w:p>
     <w:p>
@@ -3574,7 +4165,7 @@
           <w:rFonts w:ascii="Calibri" w:cs="Calibri" w:eastAsia="Calibri" w:hAnsi="Calibri"/>
           <w:rtl w:val="0"/>
         </w:rPr>
-        <w:t xml:space="preserve">Prepare and store the required verification documents (business permit, IDs, etc.) in the shared Google Drive per PayMongo's checklist.</w:t>
+        <w:t xml:space="preserve">Confirm with the business owner whether pursuing Meta Business Verification for Facebook Login is worth the added compliance overhead.</w:t>
       </w:r>
     </w:p>
     <w:p>
@@ -3594,7 +4185,7 @@
           <w:rFonts w:ascii="Calibri" w:cs="Calibri" w:eastAsia="Calibri" w:hAnsi="Calibri"/>
           <w:rtl w:val="0"/>
         </w:rPr>
-        <w:t xml:space="preserve">Define a fallback plan/scope in case business verification is denied or delayed (e.g., cash-only or manual payment recording as an interim option).</w:t>
+        <w:t xml:space="preserve">If deprioritized, update the proposal/scope documentation to reflect Google/Gmail OAuth as the primary third-party login method, with Facebook as optional/future work.</w:t>
       </w:r>
     </w:p>
     <w:p>
@@ -3611,7 +4202,340 @@
           <w:bCs w:val="1"/>
           <w:rtl w:val="0"/>
         </w:rPr>
-        <w:t xml:space="preserve">On Facebook Login (Meta OAuth):</w:t>
+        <w:t xml:space="preserve">On admin settings → down payment configuration:</w:t>
+      </w:r>
+      <w:r>
+        <w:rPr>
+          <w:rtl w:val="0"/>
+        </w:rPr>
+      </w:r>
+    </w:p>
+    <w:p>
+      <w:pPr>
+        <w:numPr>
+          <w:ilvl w:val="0"/>
+          <w:numId w:val="20"/>
+        </w:numPr>
+        <w:spacing w:after="0" w:afterAutospacing="0" w:line="240" w:lineRule="auto"/>
+        <w:ind w:left="720" w:hanging="360"/>
+        <w:rPr>
+          <w:rFonts w:ascii="Calibri" w:cs="Calibri" w:eastAsia="Calibri" w:hAnsi="Calibri"/>
+        </w:rPr>
+      </w:pPr>
+      <w:r>
+        <w:rPr>
+          <w:rFonts w:ascii="Calibri" w:cs="Calibri" w:eastAsia="Calibri" w:hAnsi="Calibri"/>
+          <w:strike w:val="1"/>
+          <w:rtl w:val="0"/>
+        </w:rPr>
+        <w:t xml:space="preserve">Move the down payment toggle/config so it applies per transaction (all online bookings/services), not per individual service.</w:t>
+      </w:r>
+    </w:p>
+    <w:p>
+      <w:pPr>
+        <w:numPr>
+          <w:ilvl w:val="0"/>
+          <w:numId w:val="20"/>
+        </w:numPr>
+        <w:spacing w:after="60" w:line="240" w:lineRule="auto"/>
+        <w:ind w:left="720" w:hanging="360"/>
+        <w:rPr>
+          <w:rFonts w:ascii="Calibri" w:cs="Calibri" w:eastAsia="Calibri" w:hAnsi="Calibri"/>
+        </w:rPr>
+      </w:pPr>
+      <w:r>
+        <w:rPr>
+          <w:rFonts w:ascii="Calibri" w:cs="Calibri" w:eastAsia="Calibri" w:hAnsi="Calibri"/>
+          <w:rtl w:val="0"/>
+        </w:rPr>
+        <w:t xml:space="preserve">Re-test down payment enforcement across grooming, hotel, daycare, and vet booking types after the fix.</w:t>
+      </w:r>
+    </w:p>
+    <w:p>
+      <w:pPr>
+        <w:spacing w:after="80" w:before="240" w:line="240" w:lineRule="auto"/>
+        <w:rPr>
+          <w:rFonts w:ascii="Calibri" w:cs="Calibri" w:eastAsia="Calibri" w:hAnsi="Calibri"/>
+        </w:rPr>
+      </w:pPr>
+      <w:r>
+        <w:rPr>
+          <w:rFonts w:ascii="Calibri" w:cs="Calibri" w:eastAsia="Calibri" w:hAnsi="Calibri"/>
+          <w:b w:val="1"/>
+          <w:bCs w:val="1"/>
+          <w:rtl w:val="0"/>
+        </w:rPr>
+        <w:t xml:space="preserve">On staff/customer reschedule flow:</w:t>
+      </w:r>
+      <w:r>
+        <w:rPr>
+          <w:rtl w:val="0"/>
+        </w:rPr>
+      </w:r>
+    </w:p>
+    <w:p>
+      <w:pPr>
+        <w:numPr>
+          <w:ilvl w:val="0"/>
+          <w:numId w:val="23"/>
+        </w:numPr>
+        <w:spacing w:after="0" w:afterAutospacing="0" w:line="240" w:lineRule="auto"/>
+        <w:ind w:left="720" w:hanging="360"/>
+        <w:rPr>
+          <w:rFonts w:ascii="Calibri" w:cs="Calibri" w:eastAsia="Calibri" w:hAnsi="Calibri"/>
+        </w:rPr>
+      </w:pPr>
+      <w:r>
+        <w:rPr>
+          <w:rFonts w:ascii="Calibri" w:cs="Calibri" w:eastAsia="Calibri" w:hAnsi="Calibri"/>
+          <w:rtl w:val="0"/>
+        </w:rPr>
+        <w:t xml:space="preserve">Disable date options earlier than the booking's current effective date in the reschedule date picker.</w:t>
+      </w:r>
+    </w:p>
+    <w:p>
+      <w:pPr>
+        <w:numPr>
+          <w:ilvl w:val="0"/>
+          <w:numId w:val="23"/>
+        </w:numPr>
+        <w:spacing w:after="60" w:line="240" w:lineRule="auto"/>
+        <w:ind w:left="720" w:hanging="360"/>
+        <w:rPr>
+          <w:rFonts w:ascii="Calibri" w:cs="Calibri" w:eastAsia="Calibri" w:hAnsi="Calibri"/>
+        </w:rPr>
+      </w:pPr>
+      <w:r>
+        <w:rPr>
+          <w:rFonts w:ascii="Calibri" w:cs="Calibri" w:eastAsia="Calibri" w:hAnsi="Calibri"/>
+          <w:rtl w:val="0"/>
+        </w:rPr>
+        <w:t xml:space="preserve">Add a regression test: after moving a booking to a later date, confirm the previously available earlier dates are no longer selectable.</w:t>
+      </w:r>
+    </w:p>
+    <w:p>
+      <w:pPr>
+        <w:spacing w:after="80" w:before="240" w:line="240" w:lineRule="auto"/>
+        <w:rPr>
+          <w:rFonts w:ascii="Calibri" w:cs="Calibri" w:eastAsia="Calibri" w:hAnsi="Calibri"/>
+        </w:rPr>
+      </w:pPr>
+      <w:r>
+        <w:rPr>
+          <w:rFonts w:ascii="Calibri" w:cs="Calibri" w:eastAsia="Calibri" w:hAnsi="Calibri"/>
+          <w:b w:val="1"/>
+          <w:bCs w:val="1"/>
+          <w:rtl w:val="0"/>
+        </w:rPr>
+        <w:t xml:space="preserve">On multi-day (hotel) booking configuration:</w:t>
+      </w:r>
+      <w:r>
+        <w:rPr>
+          <w:rtl w:val="0"/>
+        </w:rPr>
+      </w:r>
+    </w:p>
+    <w:p>
+      <w:pPr>
+        <w:numPr>
+          <w:ilvl w:val="0"/>
+          <w:numId w:val="38"/>
+        </w:numPr>
+        <w:spacing w:after="0" w:afterAutospacing="0" w:line="240" w:lineRule="auto"/>
+        <w:ind w:left="720" w:hanging="360"/>
+        <w:rPr>
+          <w:rFonts w:ascii="Calibri" w:cs="Calibri" w:eastAsia="Calibri" w:hAnsi="Calibri"/>
+        </w:rPr>
+      </w:pPr>
+      <w:r>
+        <w:rPr>
+          <w:rFonts w:ascii="Calibri" w:cs="Calibri" w:eastAsia="Calibri" w:hAnsi="Calibri"/>
+          <w:strike w:val="1"/>
+          <w:rtl w:val="0"/>
+        </w:rPr>
+        <w:t xml:space="preserve">Investigate and fix the 3-day-minimum (or N-day) booking filter/configuration — verify it correctly applies date ranges instead of appearing to lock/pin schedules.</w:t>
+      </w:r>
+    </w:p>
+    <w:p>
+      <w:pPr>
+        <w:numPr>
+          <w:ilvl w:val="0"/>
+          <w:numId w:val="38"/>
+        </w:numPr>
+        <w:spacing w:after="60" w:line="240" w:lineRule="auto"/>
+        <w:ind w:left="720" w:hanging="360"/>
+        <w:rPr>
+          <w:rFonts w:ascii="Calibri" w:cs="Calibri" w:eastAsia="Calibri" w:hAnsi="Calibri"/>
+        </w:rPr>
+      </w:pPr>
+      <w:r>
+        <w:rPr>
+          <w:rFonts w:ascii="Calibri" w:cs="Calibri" w:eastAsia="Calibri" w:hAnsi="Calibri"/>
+          <w:rtl w:val="0"/>
+        </w:rPr>
+        <w:t xml:space="preserve">Add test cases covering multi-day ranges (e.g., 3 nights, 5 nights) to confirm no unintended schedule locking.</w:t>
+      </w:r>
+    </w:p>
+    <w:p>
+      <w:pPr>
+        <w:spacing w:after="80" w:before="240" w:line="240" w:lineRule="auto"/>
+        <w:rPr>
+          <w:rFonts w:ascii="Calibri" w:cs="Calibri" w:eastAsia="Calibri" w:hAnsi="Calibri"/>
+        </w:rPr>
+      </w:pPr>
+      <w:r>
+        <w:rPr>
+          <w:rFonts w:ascii="Calibri" w:cs="Calibri" w:eastAsia="Calibri" w:hAnsi="Calibri"/>
+          <w:b w:val="1"/>
+          <w:bCs w:val="1"/>
+          <w:rtl w:val="0"/>
+        </w:rPr>
+        <w:t xml:space="preserve">On Book a Service step (customer/staff booking flow):</w:t>
+      </w:r>
+      <w:r>
+        <w:rPr>
+          <w:rtl w:val="0"/>
+        </w:rPr>
+      </w:r>
+    </w:p>
+    <w:p>
+      <w:pPr>
+        <w:numPr>
+          <w:ilvl w:val="0"/>
+          <w:numId w:val="4"/>
+        </w:numPr>
+        <w:spacing w:after="0" w:afterAutospacing="0" w:line="240" w:lineRule="auto"/>
+        <w:ind w:left="720" w:hanging="360"/>
+        <w:rPr>
+          <w:rFonts w:ascii="Calibri" w:cs="Calibri" w:eastAsia="Calibri" w:hAnsi="Calibri"/>
+        </w:rPr>
+      </w:pPr>
+      <w:r>
+        <w:rPr>
+          <w:rFonts w:ascii="Calibri" w:cs="Calibri" w:eastAsia="Calibri" w:hAnsi="Calibri"/>
+          <w:strike w:val="1"/>
+          <w:rtl w:val="0"/>
+        </w:rPr>
+        <w:t xml:space="preserve">Fix the bug preventing a newly created and activated service type from appearing in the service selection list.</w:t>
+      </w:r>
+    </w:p>
+    <w:p>
+      <w:pPr>
+        <w:numPr>
+          <w:ilvl w:val="0"/>
+          <w:numId w:val="4"/>
+        </w:numPr>
+        <w:spacing w:after="60" w:line="240" w:lineRule="auto"/>
+        <w:ind w:left="720" w:hanging="360"/>
+        <w:rPr>
+          <w:rFonts w:ascii="Calibri" w:cs="Calibri" w:eastAsia="Calibri" w:hAnsi="Calibri"/>
+        </w:rPr>
+      </w:pPr>
+      <w:r>
+        <w:rPr>
+          <w:rFonts w:ascii="Calibri" w:cs="Calibri" w:eastAsia="Calibri" w:hAnsi="Calibri"/>
+          <w:rtl w:val="0"/>
+        </w:rPr>
+        <w:t xml:space="preserve">Add a QA checklist step: verify any new service is immediately visible/selectable in the booking flow once marked active.</w:t>
+      </w:r>
+    </w:p>
+    <w:p>
+      <w:pPr>
+        <w:spacing w:after="80" w:before="240" w:line="240" w:lineRule="auto"/>
+        <w:rPr>
+          <w:rFonts w:ascii="Calibri" w:cs="Calibri" w:eastAsia="Calibri" w:hAnsi="Calibri"/>
+        </w:rPr>
+      </w:pPr>
+      <w:r>
+        <w:rPr>
+          <w:rFonts w:ascii="Calibri" w:cs="Calibri" w:eastAsia="Calibri" w:hAnsi="Calibri"/>
+          <w:b w:val="1"/>
+          <w:bCs w:val="1"/>
+          <w:rtl w:val="0"/>
+        </w:rPr>
+        <w:t xml:space="preserve">On booking process — multi-pet / multi-branch support:</w:t>
+      </w:r>
+      <w:r>
+        <w:rPr>
+          <w:rtl w:val="0"/>
+        </w:rPr>
+      </w:r>
+    </w:p>
+    <w:p>
+      <w:pPr>
+        <w:numPr>
+          <w:ilvl w:val="0"/>
+          <w:numId w:val="6"/>
+        </w:numPr>
+        <w:spacing w:after="0" w:afterAutospacing="0" w:line="240" w:lineRule="auto"/>
+        <w:ind w:left="720" w:hanging="360"/>
+        <w:rPr>
+          <w:rFonts w:ascii="Calibri" w:cs="Calibri" w:eastAsia="Calibri" w:hAnsi="Calibri"/>
+        </w:rPr>
+      </w:pPr>
+      <w:r>
+        <w:rPr>
+          <w:rFonts w:ascii="Calibri" w:cs="Calibri" w:eastAsia="Calibri" w:hAnsi="Calibri"/>
+          <w:rtl w:val="0"/>
+        </w:rPr>
+        <w:t xml:space="preserve">Document the current one-pet-per-booking-session limitation as a known constraint if it will not be resolved within capstone scope.</w:t>
+      </w:r>
+    </w:p>
+    <w:p>
+      <w:pPr>
+        <w:numPr>
+          <w:ilvl w:val="0"/>
+          <w:numId w:val="6"/>
+        </w:numPr>
+        <w:spacing w:after="0" w:afterAutospacing="0" w:line="240" w:lineRule="auto"/>
+        <w:ind w:left="720" w:hanging="360"/>
+        <w:rPr>
+          <w:rFonts w:ascii="Calibri" w:cs="Calibri" w:eastAsia="Calibri" w:hAnsi="Calibri"/>
+        </w:rPr>
+      </w:pPr>
+      <w:r>
+        <w:rPr>
+          <w:rFonts w:ascii="Calibri" w:cs="Calibri" w:eastAsia="Calibri" w:hAnsi="Calibri"/>
+          <w:rtl w:val="0"/>
+        </w:rPr>
+        <w:t xml:space="preserve">If pursued, scope a design for handling multiple pets within one session as sequential per-pet bookings (not true simultaneous multi-select), reusing shared booking context (date range, branch) where applicable.</w:t>
+      </w:r>
+    </w:p>
+    <w:p>
+      <w:pPr>
+        <w:numPr>
+          <w:ilvl w:val="0"/>
+          <w:numId w:val="6"/>
+        </w:numPr>
+        <w:spacing w:after="60" w:line="240" w:lineRule="auto"/>
+        <w:ind w:left="720" w:hanging="360"/>
+        <w:rPr>
+          <w:rFonts w:ascii="Calibri" w:cs="Calibri" w:eastAsia="Calibri" w:hAnsi="Calibri"/>
+        </w:rPr>
+      </w:pPr>
+      <w:r>
+        <w:rPr>
+          <w:rFonts w:ascii="Calibri" w:cs="Calibri" w:eastAsia="Calibri" w:hAnsi="Calibri"/>
+          <w:rtl w:val="0"/>
+        </w:rPr>
+        <w:t xml:space="preserve">For hotel-type bookings specifically, resolve the cage-assignment limitation so multiple pets in one transaction can each be assigned a separate cage.</w:t>
+      </w:r>
+    </w:p>
+    <w:p>
+      <w:pPr>
+        <w:spacing w:after="80" w:before="240" w:line="240" w:lineRule="auto"/>
+        <w:rPr>
+          <w:rFonts w:ascii="Calibri" w:cs="Calibri" w:eastAsia="Calibri" w:hAnsi="Calibri"/>
+        </w:rPr>
+      </w:pPr>
+      <w:r>
+        <w:rPr>
+          <w:rFonts w:ascii="Calibri" w:cs="Calibri" w:eastAsia="Calibri" w:hAnsi="Calibri"/>
+          <w:b w:val="1"/>
+          <w:bCs w:val="1"/>
+          <w:rtl w:val="0"/>
+        </w:rPr>
+        <w:t xml:space="preserve">On service/package selection UI (booking → services step):</w:t>
       </w:r>
       <w:r>
         <w:rPr>
@@ -3636,7 +4560,7 @@
           <w:rFonts w:ascii="Calibri" w:cs="Calibri" w:eastAsia="Calibri" w:hAnsi="Calibri"/>
           <w:rtl w:val="0"/>
         </w:rPr>
-        <w:t xml:space="preserve">Confirm with the business owner whether pursuing Meta Business Verification for Facebook Login is worth the added compliance overhead.</w:t>
+        <w:t xml:space="preserve">When a service is disabled because it's already included in a selected package, show a label or tooltip naming that package (not just a greyed-out state).</w:t>
       </w:r>
     </w:p>
     <w:p>
@@ -3645,6 +4569,26 @@
           <w:ilvl w:val="0"/>
           <w:numId w:val="9"/>
         </w:numPr>
+        <w:spacing w:after="0" w:afterAutospacing="0" w:line="240" w:lineRule="auto"/>
+        <w:ind w:left="720" w:hanging="360"/>
+        <w:rPr>
+          <w:rFonts w:ascii="Calibri" w:cs="Calibri" w:eastAsia="Calibri" w:hAnsi="Calibri"/>
+        </w:rPr>
+      </w:pPr>
+      <w:r>
+        <w:rPr>
+          <w:rFonts w:ascii="Calibri" w:cs="Calibri" w:eastAsia="Calibri" w:hAnsi="Calibri"/>
+          <w:rtl w:val="0"/>
+        </w:rPr>
+        <w:t xml:space="preserve">Fix the running-total computation bug that occurs when a service overlaps between an individual selection and a package selection.</w:t>
+      </w:r>
+    </w:p>
+    <w:p>
+      <w:pPr>
+        <w:numPr>
+          <w:ilvl w:val="0"/>
+          <w:numId w:val="9"/>
+        </w:numPr>
         <w:spacing w:after="60" w:line="240" w:lineRule="auto"/>
         <w:ind w:left="720" w:hanging="360"/>
         <w:rPr>
@@ -3656,7 +4600,7 @@
           <w:rFonts w:ascii="Calibri" w:cs="Calibri" w:eastAsia="Calibri" w:hAnsi="Calibri"/>
           <w:rtl w:val="0"/>
         </w:rPr>
-        <w:t xml:space="preserve">If deprioritized, update the proposal/scope documentation to reflect Google/Gmail OAuth as the primary third-party login method, with Facebook as optional/future work.</w:t>
+        <w:t xml:space="preserve">Decide and document the intended UX order (individual service selection vs. package selection first) and apply it consistently across the booking flow.</w:t>
       </w:r>
     </w:p>
     <w:p>
@@ -3673,7 +4617,7 @@
           <w:bCs w:val="1"/>
           <w:rtl w:val="0"/>
         </w:rPr>
-        <w:t xml:space="preserve">On admin settings → down payment configuration:</w:t>
+        <w:t xml:space="preserve">On cancellation policy (admin settings → maintenance → policies):</w:t>
       </w:r>
       <w:r>
         <w:rPr>
@@ -3685,7 +4629,7 @@
       <w:pPr>
         <w:numPr>
           <w:ilvl w:val="0"/>
-          <w:numId w:val="21"/>
+          <w:numId w:val="22"/>
         </w:numPr>
         <w:spacing w:after="0" w:afterAutospacing="0" w:line="240" w:lineRule="auto"/>
         <w:ind w:left="720" w:hanging="360"/>
@@ -3696,17 +4640,36 @@
       <w:r>
         <w:rPr>
           <w:rFonts w:ascii="Calibri" w:cs="Calibri" w:eastAsia="Calibri" w:hAnsi="Calibri"/>
-          <w:strike w:val="1"/>
-          <w:rtl w:val="0"/>
-        </w:rPr>
-        <w:t xml:space="preserve">Move the down payment toggle/config so it applies per transaction (all online bookings/services), not per individual service.</w:t>
+          <w:rtl w:val="0"/>
+        </w:rPr>
+        <w:t xml:space="preserve">Add a configurable cancellation-to-credit conversion rate (default 100%, admin-adjustable, e.g. down to 50%) instead of a hardcoded full conversion.</w:t>
       </w:r>
     </w:p>
     <w:p>
       <w:pPr>
         <w:numPr>
           <w:ilvl w:val="0"/>
-          <w:numId w:val="21"/>
+          <w:numId w:val="22"/>
+        </w:numPr>
+        <w:spacing w:after="0" w:afterAutospacing="0" w:line="240" w:lineRule="auto"/>
+        <w:ind w:left="720" w:hanging="360"/>
+        <w:rPr>
+          <w:rFonts w:ascii="Calibri" w:cs="Calibri" w:eastAsia="Calibri" w:hAnsi="Calibri"/>
+        </w:rPr>
+      </w:pPr>
+      <w:r>
+        <w:rPr>
+          <w:rFonts w:ascii="Calibri" w:cs="Calibri" w:eastAsia="Calibri" w:hAnsi="Calibri"/>
+          <w:rtl w:val="0"/>
+        </w:rPr>
+        <w:t xml:space="preserve">Fix the bug where credits were not generated after a cancellation during testing — verify the down-payment-to-credit pipeline end-to-end.</w:t>
+      </w:r>
+    </w:p>
+    <w:p>
+      <w:pPr>
+        <w:numPr>
+          <w:ilvl w:val="0"/>
+          <w:numId w:val="22"/>
         </w:numPr>
         <w:spacing w:after="60" w:line="240" w:lineRule="auto"/>
         <w:ind w:left="720" w:hanging="360"/>
@@ -3719,7 +4682,7 @@
           <w:rFonts w:ascii="Calibri" w:cs="Calibri" w:eastAsia="Calibri" w:hAnsi="Calibri"/>
           <w:rtl w:val="0"/>
         </w:rPr>
-        <w:t xml:space="preserve">Re-test down payment enforcement across grooming, hotel, daycare, and vet booking types after the fix.</w:t>
+        <w:t xml:space="preserve">Re-verify that the reschedule flow correctly reflects updated booking status and resulting credit balance after a cancellation.</w:t>
       </w:r>
     </w:p>
     <w:p>
@@ -3736,7 +4699,7 @@
           <w:bCs w:val="1"/>
           <w:rtl w:val="0"/>
         </w:rPr>
-        <w:t xml:space="preserve">On staff/customer reschedule flow:</w:t>
+        <w:t xml:space="preserve">Deployment / test environment:</w:t>
       </w:r>
       <w:r>
         <w:rPr>
@@ -3748,7 +4711,7 @@
       <w:pPr>
         <w:numPr>
           <w:ilvl w:val="0"/>
-          <w:numId w:val="25"/>
+          <w:numId w:val="13"/>
         </w:numPr>
         <w:spacing w:after="0" w:afterAutospacing="0" w:line="240" w:lineRule="auto"/>
         <w:ind w:left="720" w:hanging="360"/>
@@ -3761,448 +4724,14 @@
           <w:rFonts w:ascii="Calibri" w:cs="Calibri" w:eastAsia="Calibri" w:hAnsi="Calibri"/>
           <w:rtl w:val="0"/>
         </w:rPr>
-        <w:t xml:space="preserve">Disable date options earlier than the booking's current effective date in the reschedule date picker.</w:t>
+        <w:t xml:space="preserve">Deploy the system to a live/staging environment (beyond localhost) to properly test payment provider integrations (PayMongo) and OAuth logins end-to-end.</w:t>
       </w:r>
     </w:p>
     <w:p>
       <w:pPr>
         <w:numPr>
           <w:ilvl w:val="0"/>
-          <w:numId w:val="25"/>
-        </w:numPr>
-        <w:spacing w:after="60" w:line="240" w:lineRule="auto"/>
-        <w:ind w:left="720" w:hanging="360"/>
-        <w:rPr>
-          <w:rFonts w:ascii="Calibri" w:cs="Calibri" w:eastAsia="Calibri" w:hAnsi="Calibri"/>
-        </w:rPr>
-      </w:pPr>
-      <w:r>
-        <w:rPr>
-          <w:rFonts w:ascii="Calibri" w:cs="Calibri" w:eastAsia="Calibri" w:hAnsi="Calibri"/>
-          <w:rtl w:val="0"/>
-        </w:rPr>
-        <w:t xml:space="preserve">Add a regression test: after moving a booking to a later date, confirm the previously available earlier dates are no longer selectable.</w:t>
-      </w:r>
-    </w:p>
-    <w:p>
-      <w:pPr>
-        <w:spacing w:after="80" w:before="240" w:line="240" w:lineRule="auto"/>
-        <w:rPr>
-          <w:rFonts w:ascii="Calibri" w:cs="Calibri" w:eastAsia="Calibri" w:hAnsi="Calibri"/>
-        </w:rPr>
-      </w:pPr>
-      <w:r>
-        <w:rPr>
-          <w:rFonts w:ascii="Calibri" w:cs="Calibri" w:eastAsia="Calibri" w:hAnsi="Calibri"/>
-          <w:b w:val="1"/>
-          <w:bCs w:val="1"/>
-          <w:rtl w:val="0"/>
-        </w:rPr>
-        <w:t xml:space="preserve">On multi-day (hotel) booking configuration:</w:t>
-      </w:r>
-      <w:r>
-        <w:rPr>
-          <w:rtl w:val="0"/>
-        </w:rPr>
-      </w:r>
-    </w:p>
-    <w:p>
-      <w:pPr>
-        <w:numPr>
-          <w:ilvl w:val="0"/>
-          <w:numId w:val="40"/>
-        </w:numPr>
-        <w:spacing w:after="0" w:afterAutospacing="0" w:line="240" w:lineRule="auto"/>
-        <w:ind w:left="720" w:hanging="360"/>
-        <w:rPr>
-          <w:rFonts w:ascii="Calibri" w:cs="Calibri" w:eastAsia="Calibri" w:hAnsi="Calibri"/>
-        </w:rPr>
-      </w:pPr>
-      <w:r>
-        <w:rPr>
-          <w:rFonts w:ascii="Calibri" w:cs="Calibri" w:eastAsia="Calibri" w:hAnsi="Calibri"/>
-          <w:strike w:val="1"/>
-          <w:rtl w:val="0"/>
-        </w:rPr>
-        <w:t xml:space="preserve">Investigate and fix the 3-day-minimum (or N-day) booking filter/configuration — verify it correctly applies date ranges instead of appearing to lock/pin schedules.</w:t>
-      </w:r>
-    </w:p>
-    <w:p>
-      <w:pPr>
-        <w:numPr>
-          <w:ilvl w:val="0"/>
-          <w:numId w:val="40"/>
-        </w:numPr>
-        <w:spacing w:after="60" w:line="240" w:lineRule="auto"/>
-        <w:ind w:left="720" w:hanging="360"/>
-        <w:rPr>
-          <w:rFonts w:ascii="Calibri" w:cs="Calibri" w:eastAsia="Calibri" w:hAnsi="Calibri"/>
-        </w:rPr>
-      </w:pPr>
-      <w:r>
-        <w:rPr>
-          <w:rFonts w:ascii="Calibri" w:cs="Calibri" w:eastAsia="Calibri" w:hAnsi="Calibri"/>
-          <w:rtl w:val="0"/>
-        </w:rPr>
-        <w:t xml:space="preserve">Add test cases covering multi-day ranges (e.g., 3 nights, 5 nights) to confirm no unintended schedule locking.</w:t>
-      </w:r>
-    </w:p>
-    <w:p>
-      <w:pPr>
-        <w:spacing w:after="80" w:before="240" w:line="240" w:lineRule="auto"/>
-        <w:rPr>
-          <w:rFonts w:ascii="Calibri" w:cs="Calibri" w:eastAsia="Calibri" w:hAnsi="Calibri"/>
-        </w:rPr>
-      </w:pPr>
-      <w:r>
-        <w:rPr>
-          <w:rFonts w:ascii="Calibri" w:cs="Calibri" w:eastAsia="Calibri" w:hAnsi="Calibri"/>
-          <w:b w:val="1"/>
-          <w:bCs w:val="1"/>
-          <w:rtl w:val="0"/>
-        </w:rPr>
-        <w:t xml:space="preserve">On Book a Service step (customer/staff booking flow):</w:t>
-      </w:r>
-      <w:r>
-        <w:rPr>
-          <w:rtl w:val="0"/>
-        </w:rPr>
-      </w:r>
-    </w:p>
-    <w:p>
-      <w:pPr>
-        <w:numPr>
-          <w:ilvl w:val="0"/>
-          <w:numId w:val="4"/>
-        </w:numPr>
-        <w:spacing w:after="0" w:afterAutospacing="0" w:line="240" w:lineRule="auto"/>
-        <w:ind w:left="720" w:hanging="360"/>
-        <w:rPr>
-          <w:rFonts w:ascii="Calibri" w:cs="Calibri" w:eastAsia="Calibri" w:hAnsi="Calibri"/>
-        </w:rPr>
-      </w:pPr>
-      <w:r>
-        <w:rPr>
-          <w:rFonts w:ascii="Calibri" w:cs="Calibri" w:eastAsia="Calibri" w:hAnsi="Calibri"/>
-          <w:strike w:val="1"/>
-          <w:rtl w:val="0"/>
-        </w:rPr>
-        <w:t xml:space="preserve">Fix the bug preventing a newly created and activated service type from appearing in the service selection list.</w:t>
-      </w:r>
-    </w:p>
-    <w:p>
-      <w:pPr>
-        <w:numPr>
-          <w:ilvl w:val="0"/>
-          <w:numId w:val="4"/>
-        </w:numPr>
-        <w:spacing w:after="60" w:line="240" w:lineRule="auto"/>
-        <w:ind w:left="720" w:hanging="360"/>
-        <w:rPr>
-          <w:rFonts w:ascii="Calibri" w:cs="Calibri" w:eastAsia="Calibri" w:hAnsi="Calibri"/>
-        </w:rPr>
-      </w:pPr>
-      <w:r>
-        <w:rPr>
-          <w:rFonts w:ascii="Calibri" w:cs="Calibri" w:eastAsia="Calibri" w:hAnsi="Calibri"/>
-          <w:rtl w:val="0"/>
-        </w:rPr>
-        <w:t xml:space="preserve">Add a QA checklist step: verify any new service is immediately visible/selectable in the booking flow once marked active.</w:t>
-      </w:r>
-    </w:p>
-    <w:p>
-      <w:pPr>
-        <w:spacing w:after="80" w:before="240" w:line="240" w:lineRule="auto"/>
-        <w:rPr>
-          <w:rFonts w:ascii="Calibri" w:cs="Calibri" w:eastAsia="Calibri" w:hAnsi="Calibri"/>
-        </w:rPr>
-      </w:pPr>
-      <w:r>
-        <w:rPr>
-          <w:rFonts w:ascii="Calibri" w:cs="Calibri" w:eastAsia="Calibri" w:hAnsi="Calibri"/>
-          <w:b w:val="1"/>
-          <w:bCs w:val="1"/>
-          <w:rtl w:val="0"/>
-        </w:rPr>
-        <w:t xml:space="preserve">On booking process — multi-pet / multi-branch support:</w:t>
-      </w:r>
-      <w:r>
-        <w:rPr>
-          <w:rtl w:val="0"/>
-        </w:rPr>
-      </w:r>
-    </w:p>
-    <w:p>
-      <w:pPr>
-        <w:numPr>
-          <w:ilvl w:val="0"/>
-          <w:numId w:val="7"/>
-        </w:numPr>
-        <w:spacing w:after="0" w:afterAutospacing="0" w:line="240" w:lineRule="auto"/>
-        <w:ind w:left="720" w:hanging="360"/>
-        <w:rPr>
-          <w:rFonts w:ascii="Calibri" w:cs="Calibri" w:eastAsia="Calibri" w:hAnsi="Calibri"/>
-        </w:rPr>
-      </w:pPr>
-      <w:r>
-        <w:rPr>
-          <w:rFonts w:ascii="Calibri" w:cs="Calibri" w:eastAsia="Calibri" w:hAnsi="Calibri"/>
-          <w:rtl w:val="0"/>
-        </w:rPr>
-        <w:t xml:space="preserve">Document the current one-pet-per-booking-session limitation as a known constraint if it will not be resolved within capstone scope.</w:t>
-      </w:r>
-    </w:p>
-    <w:p>
-      <w:pPr>
-        <w:numPr>
-          <w:ilvl w:val="0"/>
-          <w:numId w:val="7"/>
-        </w:numPr>
-        <w:spacing w:after="0" w:afterAutospacing="0" w:line="240" w:lineRule="auto"/>
-        <w:ind w:left="720" w:hanging="360"/>
-        <w:rPr>
-          <w:rFonts w:ascii="Calibri" w:cs="Calibri" w:eastAsia="Calibri" w:hAnsi="Calibri"/>
-        </w:rPr>
-      </w:pPr>
-      <w:r>
-        <w:rPr>
-          <w:rFonts w:ascii="Calibri" w:cs="Calibri" w:eastAsia="Calibri" w:hAnsi="Calibri"/>
-          <w:rtl w:val="0"/>
-        </w:rPr>
-        <w:t xml:space="preserve">If pursued, scope a design for handling multiple pets within one session as sequential per-pet bookings (not true simultaneous multi-select), reusing shared booking context (date range, branch) where applicable.</w:t>
-      </w:r>
-    </w:p>
-    <w:p>
-      <w:pPr>
-        <w:numPr>
-          <w:ilvl w:val="0"/>
-          <w:numId w:val="7"/>
-        </w:numPr>
-        <w:spacing w:after="60" w:line="240" w:lineRule="auto"/>
-        <w:ind w:left="720" w:hanging="360"/>
-        <w:rPr>
-          <w:rFonts w:ascii="Calibri" w:cs="Calibri" w:eastAsia="Calibri" w:hAnsi="Calibri"/>
-        </w:rPr>
-      </w:pPr>
-      <w:r>
-        <w:rPr>
-          <w:rFonts w:ascii="Calibri" w:cs="Calibri" w:eastAsia="Calibri" w:hAnsi="Calibri"/>
-          <w:rtl w:val="0"/>
-        </w:rPr>
-        <w:t xml:space="preserve">For hotel-type bookings specifically, resolve the cage-assignment limitation so multiple pets in one transaction can each be assigned a separate cage.</w:t>
-      </w:r>
-    </w:p>
-    <w:p>
-      <w:pPr>
-        <w:spacing w:after="80" w:before="240" w:line="240" w:lineRule="auto"/>
-        <w:rPr>
-          <w:rFonts w:ascii="Calibri" w:cs="Calibri" w:eastAsia="Calibri" w:hAnsi="Calibri"/>
-        </w:rPr>
-      </w:pPr>
-      <w:r>
-        <w:rPr>
-          <w:rFonts w:ascii="Calibri" w:cs="Calibri" w:eastAsia="Calibri" w:hAnsi="Calibri"/>
-          <w:b w:val="1"/>
-          <w:bCs w:val="1"/>
-          <w:rtl w:val="0"/>
-        </w:rPr>
-        <w:t xml:space="preserve">On service/package selection UI (booking → services step):</w:t>
-      </w:r>
-      <w:r>
-        <w:rPr>
-          <w:rtl w:val="0"/>
-        </w:rPr>
-      </w:r>
-    </w:p>
-    <w:p>
-      <w:pPr>
-        <w:numPr>
-          <w:ilvl w:val="0"/>
-          <w:numId w:val="10"/>
-        </w:numPr>
-        <w:spacing w:after="0" w:afterAutospacing="0" w:line="240" w:lineRule="auto"/>
-        <w:ind w:left="720" w:hanging="360"/>
-        <w:rPr>
-          <w:rFonts w:ascii="Calibri" w:cs="Calibri" w:eastAsia="Calibri" w:hAnsi="Calibri"/>
-        </w:rPr>
-      </w:pPr>
-      <w:r>
-        <w:rPr>
-          <w:rFonts w:ascii="Calibri" w:cs="Calibri" w:eastAsia="Calibri" w:hAnsi="Calibri"/>
-          <w:rtl w:val="0"/>
-        </w:rPr>
-        <w:t xml:space="preserve">When a service is disabled because it's already included in a selected package, show a label or tooltip naming that package (not just a greyed-out state).</w:t>
-      </w:r>
-    </w:p>
-    <w:p>
-      <w:pPr>
-        <w:numPr>
-          <w:ilvl w:val="0"/>
-          <w:numId w:val="10"/>
-        </w:numPr>
-        <w:spacing w:after="0" w:afterAutospacing="0" w:line="240" w:lineRule="auto"/>
-        <w:ind w:left="720" w:hanging="360"/>
-        <w:rPr>
-          <w:rFonts w:ascii="Calibri" w:cs="Calibri" w:eastAsia="Calibri" w:hAnsi="Calibri"/>
-        </w:rPr>
-      </w:pPr>
-      <w:r>
-        <w:rPr>
-          <w:rFonts w:ascii="Calibri" w:cs="Calibri" w:eastAsia="Calibri" w:hAnsi="Calibri"/>
-          <w:rtl w:val="0"/>
-        </w:rPr>
-        <w:t xml:space="preserve">Fix the running-total computation bug that occurs when a service overlaps between an individual selection and a package selection.</w:t>
-      </w:r>
-    </w:p>
-    <w:p>
-      <w:pPr>
-        <w:numPr>
-          <w:ilvl w:val="0"/>
-          <w:numId w:val="10"/>
-        </w:numPr>
-        <w:spacing w:after="60" w:line="240" w:lineRule="auto"/>
-        <w:ind w:left="720" w:hanging="360"/>
-        <w:rPr>
-          <w:rFonts w:ascii="Calibri" w:cs="Calibri" w:eastAsia="Calibri" w:hAnsi="Calibri"/>
-        </w:rPr>
-      </w:pPr>
-      <w:r>
-        <w:rPr>
-          <w:rFonts w:ascii="Calibri" w:cs="Calibri" w:eastAsia="Calibri" w:hAnsi="Calibri"/>
-          <w:rtl w:val="0"/>
-        </w:rPr>
-        <w:t xml:space="preserve">Decide and document the intended UX order (individual service selection vs. package selection first) and apply it consistently across the booking flow.</w:t>
-      </w:r>
-    </w:p>
-    <w:p>
-      <w:pPr>
-        <w:spacing w:after="80" w:before="240" w:line="240" w:lineRule="auto"/>
-        <w:rPr>
-          <w:rFonts w:ascii="Calibri" w:cs="Calibri" w:eastAsia="Calibri" w:hAnsi="Calibri"/>
-        </w:rPr>
-      </w:pPr>
-      <w:r>
-        <w:rPr>
-          <w:rFonts w:ascii="Calibri" w:cs="Calibri" w:eastAsia="Calibri" w:hAnsi="Calibri"/>
-          <w:b w:val="1"/>
-          <w:bCs w:val="1"/>
-          <w:rtl w:val="0"/>
-        </w:rPr>
-        <w:t xml:space="preserve">On cancellation policy (admin settings → maintenance → policies):</w:t>
-      </w:r>
-      <w:r>
-        <w:rPr>
-          <w:rtl w:val="0"/>
-        </w:rPr>
-      </w:r>
-    </w:p>
-    <w:p>
-      <w:pPr>
-        <w:numPr>
-          <w:ilvl w:val="0"/>
-          <w:numId w:val="24"/>
-        </w:numPr>
-        <w:spacing w:after="0" w:afterAutospacing="0" w:line="240" w:lineRule="auto"/>
-        <w:ind w:left="720" w:hanging="360"/>
-        <w:rPr>
-          <w:rFonts w:ascii="Calibri" w:cs="Calibri" w:eastAsia="Calibri" w:hAnsi="Calibri"/>
-        </w:rPr>
-      </w:pPr>
-      <w:r>
-        <w:rPr>
-          <w:rFonts w:ascii="Calibri" w:cs="Calibri" w:eastAsia="Calibri" w:hAnsi="Calibri"/>
-          <w:rtl w:val="0"/>
-        </w:rPr>
-        <w:t xml:space="preserve">Add a configurable cancellation-to-credit conversion rate (default 100%, admin-adjustable, e.g. down to 50%) instead of a hardcoded full conversion.</w:t>
-      </w:r>
-    </w:p>
-    <w:p>
-      <w:pPr>
-        <w:numPr>
-          <w:ilvl w:val="0"/>
-          <w:numId w:val="24"/>
-        </w:numPr>
-        <w:spacing w:after="0" w:afterAutospacing="0" w:line="240" w:lineRule="auto"/>
-        <w:ind w:left="720" w:hanging="360"/>
-        <w:rPr>
-          <w:rFonts w:ascii="Calibri" w:cs="Calibri" w:eastAsia="Calibri" w:hAnsi="Calibri"/>
-        </w:rPr>
-      </w:pPr>
-      <w:r>
-        <w:rPr>
-          <w:rFonts w:ascii="Calibri" w:cs="Calibri" w:eastAsia="Calibri" w:hAnsi="Calibri"/>
-          <w:rtl w:val="0"/>
-        </w:rPr>
-        <w:t xml:space="preserve">Fix the bug where credits were not generated after a cancellation during testing — verify the down-payment-to-credit pipeline end-to-end.</w:t>
-      </w:r>
-    </w:p>
-    <w:p>
-      <w:pPr>
-        <w:numPr>
-          <w:ilvl w:val="0"/>
-          <w:numId w:val="24"/>
-        </w:numPr>
-        <w:spacing w:after="60" w:line="240" w:lineRule="auto"/>
-        <w:ind w:left="720" w:hanging="360"/>
-        <w:rPr>
-          <w:rFonts w:ascii="Calibri" w:cs="Calibri" w:eastAsia="Calibri" w:hAnsi="Calibri"/>
-        </w:rPr>
-      </w:pPr>
-      <w:r>
-        <w:rPr>
-          <w:rFonts w:ascii="Calibri" w:cs="Calibri" w:eastAsia="Calibri" w:hAnsi="Calibri"/>
-          <w:rtl w:val="0"/>
-        </w:rPr>
-        <w:t xml:space="preserve">Re-verify that the reschedule flow correctly reflects updated booking status and resulting credit balance after a cancellation.</w:t>
-      </w:r>
-    </w:p>
-    <w:p>
-      <w:pPr>
-        <w:spacing w:after="80" w:before="240" w:line="240" w:lineRule="auto"/>
-        <w:rPr>
-          <w:rFonts w:ascii="Calibri" w:cs="Calibri" w:eastAsia="Calibri" w:hAnsi="Calibri"/>
-        </w:rPr>
-      </w:pPr>
-      <w:r>
-        <w:rPr>
-          <w:rFonts w:ascii="Calibri" w:cs="Calibri" w:eastAsia="Calibri" w:hAnsi="Calibri"/>
-          <w:b w:val="1"/>
-          <w:bCs w:val="1"/>
-          <w:rtl w:val="0"/>
-        </w:rPr>
-        <w:t xml:space="preserve">Deployment / test environment:</w:t>
-      </w:r>
-      <w:r>
-        <w:rPr>
-          <w:rtl w:val="0"/>
-        </w:rPr>
-      </w:r>
-    </w:p>
-    <w:p>
-      <w:pPr>
-        <w:numPr>
-          <w:ilvl w:val="0"/>
-          <w:numId w:val="14"/>
-        </w:numPr>
-        <w:spacing w:after="0" w:afterAutospacing="0" w:line="240" w:lineRule="auto"/>
-        <w:ind w:left="720" w:hanging="360"/>
-        <w:rPr>
-          <w:rFonts w:ascii="Calibri" w:cs="Calibri" w:eastAsia="Calibri" w:hAnsi="Calibri"/>
-        </w:rPr>
-      </w:pPr>
-      <w:r>
-        <w:rPr>
-          <w:rFonts w:ascii="Calibri" w:cs="Calibri" w:eastAsia="Calibri" w:hAnsi="Calibri"/>
-          <w:rtl w:val="0"/>
-        </w:rPr>
-        <w:t xml:space="preserve">Deploy the system to a live/staging environment (beyond localhost) to properly test payment provider integrations (PayMongo) and OAuth logins end-to-end.</w:t>
-      </w:r>
-    </w:p>
-    <w:p>
-      <w:pPr>
-        <w:numPr>
-          <w:ilvl w:val="0"/>
-          <w:numId w:val="14"/>
+          <w:numId w:val="13"/>
         </w:numPr>
         <w:spacing w:after="60" w:line="240" w:lineRule="auto"/>
         <w:ind w:left="720" w:hanging="360"/>
@@ -4260,7 +4789,7 @@
           <w:pgNumType w:start="1"/>
         </w:sectPr>
       </w:pPr>
-      <w:bookmarkStart w:colFirst="0" w:colLast="0" w:name="_upkt7xhpxhk" w:id="5"/>
+      <w:bookmarkStart w:colFirst="0" w:colLast="0" w:name="_h47rs5ppl103" w:id="5"/>
       <w:bookmarkEnd w:id="5"/>
       <w:r>
         <w:rPr>
@@ -4345,7 +4874,7 @@
       <w:pPr>
         <w:numPr>
           <w:ilvl w:val="0"/>
-          <w:numId w:val="19"/>
+          <w:numId w:val="18"/>
         </w:numPr>
         <w:spacing w:after="0" w:afterAutospacing="0" w:before="240" w:lineRule="auto"/>
         <w:ind w:left="720" w:hanging="360"/>
@@ -4375,7 +4904,7 @@
       <w:pPr>
         <w:numPr>
           <w:ilvl w:val="0"/>
-          <w:numId w:val="19"/>
+          <w:numId w:val="18"/>
         </w:numPr>
         <w:spacing w:after="0" w:afterAutospacing="0" w:before="0" w:beforeAutospacing="0" w:lineRule="auto"/>
         <w:ind w:left="720" w:hanging="360"/>
@@ -4405,7 +4934,7 @@
       <w:pPr>
         <w:numPr>
           <w:ilvl w:val="0"/>
-          <w:numId w:val="19"/>
+          <w:numId w:val="18"/>
         </w:numPr>
         <w:spacing w:after="0" w:afterAutospacing="0" w:before="0" w:beforeAutospacing="0" w:lineRule="auto"/>
         <w:ind w:left="720" w:hanging="360"/>
@@ -4435,7 +4964,7 @@
       <w:pPr>
         <w:numPr>
           <w:ilvl w:val="0"/>
-          <w:numId w:val="19"/>
+          <w:numId w:val="18"/>
         </w:numPr>
         <w:spacing w:after="0" w:afterAutospacing="0" w:before="0" w:beforeAutospacing="0" w:lineRule="auto"/>
         <w:ind w:left="720" w:hanging="360"/>
@@ -4451,7 +4980,7 @@
       <w:pPr>
         <w:numPr>
           <w:ilvl w:val="1"/>
-          <w:numId w:val="19"/>
+          <w:numId w:val="18"/>
         </w:numPr>
         <w:spacing w:after="0" w:afterAutospacing="0" w:before="0" w:beforeAutospacing="0" w:lineRule="auto"/>
         <w:ind w:left="1440" w:hanging="360"/>
@@ -4467,7 +4996,7 @@
       <w:pPr>
         <w:numPr>
           <w:ilvl w:val="1"/>
-          <w:numId w:val="19"/>
+          <w:numId w:val="18"/>
         </w:numPr>
         <w:spacing w:after="240" w:before="0" w:beforeAutospacing="0" w:lineRule="auto"/>
         <w:ind w:left="1440" w:hanging="360"/>
@@ -4511,7 +5040,7 @@
       <w:pPr>
         <w:numPr>
           <w:ilvl w:val="0"/>
-          <w:numId w:val="13"/>
+          <w:numId w:val="12"/>
         </w:numPr>
         <w:spacing w:after="0" w:afterAutospacing="0" w:before="240" w:lineRule="auto"/>
         <w:ind w:left="720" w:hanging="360"/>
@@ -4555,7 +5084,7 @@
       <w:pPr>
         <w:numPr>
           <w:ilvl w:val="0"/>
-          <w:numId w:val="13"/>
+          <w:numId w:val="12"/>
         </w:numPr>
         <w:spacing w:after="0" w:afterAutospacing="0" w:before="0" w:beforeAutospacing="0" w:lineRule="auto"/>
         <w:ind w:left="720" w:hanging="360"/>
@@ -4571,7 +5100,7 @@
       <w:pPr>
         <w:numPr>
           <w:ilvl w:val="0"/>
-          <w:numId w:val="13"/>
+          <w:numId w:val="12"/>
         </w:numPr>
         <w:spacing w:after="240" w:before="0" w:beforeAutospacing="0" w:lineRule="auto"/>
         <w:ind w:left="720" w:hanging="360"/>
@@ -4615,7 +5144,7 @@
       <w:pPr>
         <w:numPr>
           <w:ilvl w:val="0"/>
-          <w:numId w:val="43"/>
+          <w:numId w:val="40"/>
         </w:numPr>
         <w:spacing w:after="0" w:afterAutospacing="0" w:before="240" w:lineRule="auto"/>
         <w:ind w:left="720" w:hanging="360"/>
@@ -4631,7 +5160,7 @@
       <w:pPr>
         <w:numPr>
           <w:ilvl w:val="0"/>
-          <w:numId w:val="43"/>
+          <w:numId w:val="40"/>
         </w:numPr>
         <w:spacing w:after="0" w:afterAutospacing="0" w:before="0" w:beforeAutospacing="0" w:lineRule="auto"/>
         <w:ind w:left="720" w:hanging="360"/>
@@ -4661,7 +5190,7 @@
       <w:pPr>
         <w:numPr>
           <w:ilvl w:val="0"/>
-          <w:numId w:val="43"/>
+          <w:numId w:val="40"/>
         </w:numPr>
         <w:spacing w:after="0" w:afterAutospacing="0" w:before="0" w:beforeAutospacing="0" w:lineRule="auto"/>
         <w:ind w:left="720" w:hanging="360"/>
@@ -4677,7 +5206,7 @@
       <w:pPr>
         <w:numPr>
           <w:ilvl w:val="1"/>
-          <w:numId w:val="43"/>
+          <w:numId w:val="40"/>
         </w:numPr>
         <w:spacing w:after="0" w:afterAutospacing="0" w:before="0" w:beforeAutospacing="0" w:lineRule="auto"/>
         <w:ind w:left="1440" w:hanging="360"/>
@@ -4701,7 +5230,7 @@
       <w:pPr>
         <w:numPr>
           <w:ilvl w:val="1"/>
-          <w:numId w:val="43"/>
+          <w:numId w:val="40"/>
         </w:numPr>
         <w:spacing w:after="0" w:afterAutospacing="0" w:before="0" w:beforeAutospacing="0" w:lineRule="auto"/>
         <w:ind w:left="1440" w:hanging="360"/>
@@ -4725,7 +5254,7 @@
       <w:pPr>
         <w:numPr>
           <w:ilvl w:val="1"/>
-          <w:numId w:val="43"/>
+          <w:numId w:val="40"/>
         </w:numPr>
         <w:spacing w:after="0" w:afterAutospacing="0" w:before="0" w:beforeAutospacing="0" w:lineRule="auto"/>
         <w:ind w:left="1440" w:hanging="360"/>
@@ -4749,7 +5278,7 @@
       <w:pPr>
         <w:numPr>
           <w:ilvl w:val="0"/>
-          <w:numId w:val="43"/>
+          <w:numId w:val="40"/>
         </w:numPr>
         <w:spacing w:after="240" w:before="0" w:beforeAutospacing="0" w:lineRule="auto"/>
         <w:ind w:left="720" w:hanging="360"/>
@@ -4965,7 +5494,7 @@
       <w:pPr>
         <w:numPr>
           <w:ilvl w:val="0"/>
-          <w:numId w:val="16"/>
+          <w:numId w:val="15"/>
         </w:numPr>
         <w:spacing w:after="0" w:afterAutospacing="0" w:before="240" w:lineRule="auto"/>
         <w:ind w:left="720" w:hanging="360"/>
@@ -4995,7 +5524,7 @@
       <w:pPr>
         <w:numPr>
           <w:ilvl w:val="1"/>
-          <w:numId w:val="16"/>
+          <w:numId w:val="15"/>
         </w:numPr>
         <w:spacing w:after="0" w:afterAutospacing="0" w:before="0" w:beforeAutospacing="0" w:lineRule="auto"/>
         <w:ind w:left="1440" w:hanging="360"/>
@@ -5011,7 +5540,7 @@
       <w:pPr>
         <w:numPr>
           <w:ilvl w:val="1"/>
-          <w:numId w:val="16"/>
+          <w:numId w:val="15"/>
         </w:numPr>
         <w:spacing w:after="0" w:afterAutospacing="0" w:before="0" w:beforeAutospacing="0" w:lineRule="auto"/>
         <w:ind w:left="1440" w:hanging="360"/>
@@ -5027,7 +5556,7 @@
       <w:pPr>
         <w:numPr>
           <w:ilvl w:val="1"/>
-          <w:numId w:val="16"/>
+          <w:numId w:val="15"/>
         </w:numPr>
         <w:spacing w:after="0" w:afterAutospacing="0" w:before="0" w:beforeAutospacing="0" w:lineRule="auto"/>
         <w:ind w:left="1440" w:hanging="360"/>
@@ -5043,7 +5572,7 @@
       <w:pPr>
         <w:numPr>
           <w:ilvl w:val="0"/>
-          <w:numId w:val="16"/>
+          <w:numId w:val="15"/>
         </w:numPr>
         <w:spacing w:after="0" w:afterAutospacing="0" w:before="0" w:beforeAutospacing="0" w:lineRule="auto"/>
         <w:ind w:left="720" w:hanging="360"/>
@@ -5073,7 +5602,7 @@
       <w:pPr>
         <w:numPr>
           <w:ilvl w:val="0"/>
-          <w:numId w:val="16"/>
+          <w:numId w:val="15"/>
         </w:numPr>
         <w:spacing w:after="0" w:afterAutospacing="0" w:before="0" w:beforeAutospacing="0" w:lineRule="auto"/>
         <w:ind w:left="720" w:hanging="360"/>
@@ -5103,7 +5632,7 @@
       <w:pPr>
         <w:numPr>
           <w:ilvl w:val="0"/>
-          <w:numId w:val="16"/>
+          <w:numId w:val="15"/>
         </w:numPr>
         <w:spacing w:after="240" w:before="0" w:beforeAutospacing="0" w:lineRule="auto"/>
         <w:ind w:left="720" w:hanging="360"/>
@@ -5147,7 +5676,7 @@
       <w:pPr>
         <w:numPr>
           <w:ilvl w:val="0"/>
-          <w:numId w:val="34"/>
+          <w:numId w:val="31"/>
         </w:numPr>
         <w:spacing w:after="0" w:afterAutospacing="0" w:before="240" w:lineRule="auto"/>
         <w:ind w:left="720" w:hanging="360"/>
@@ -5177,7 +5706,7 @@
       <w:pPr>
         <w:numPr>
           <w:ilvl w:val="0"/>
-          <w:numId w:val="34"/>
+          <w:numId w:val="31"/>
         </w:numPr>
         <w:spacing w:after="0" w:afterAutospacing="0" w:before="0" w:beforeAutospacing="0" w:lineRule="auto"/>
         <w:ind w:left="720" w:hanging="360"/>
@@ -5207,7 +5736,7 @@
       <w:pPr>
         <w:numPr>
           <w:ilvl w:val="0"/>
-          <w:numId w:val="34"/>
+          <w:numId w:val="31"/>
         </w:numPr>
         <w:spacing w:after="0" w:afterAutospacing="0" w:before="0" w:beforeAutospacing="0" w:lineRule="auto"/>
         <w:ind w:left="720" w:hanging="360"/>
@@ -5223,7 +5752,7 @@
       <w:pPr>
         <w:numPr>
           <w:ilvl w:val="1"/>
-          <w:numId w:val="34"/>
+          <w:numId w:val="31"/>
         </w:numPr>
         <w:spacing w:after="0" w:afterAutospacing="0" w:before="0" w:beforeAutospacing="0" w:lineRule="auto"/>
         <w:ind w:left="1440" w:hanging="360"/>
@@ -5239,7 +5768,7 @@
       <w:pPr>
         <w:numPr>
           <w:ilvl w:val="1"/>
-          <w:numId w:val="34"/>
+          <w:numId w:val="31"/>
         </w:numPr>
         <w:spacing w:after="0" w:afterAutospacing="0" w:before="0" w:beforeAutospacing="0" w:lineRule="auto"/>
         <w:ind w:left="1440" w:hanging="360"/>
@@ -5255,7 +5784,7 @@
       <w:pPr>
         <w:numPr>
           <w:ilvl w:val="1"/>
-          <w:numId w:val="34"/>
+          <w:numId w:val="31"/>
         </w:numPr>
         <w:spacing w:after="0" w:afterAutospacing="0" w:before="0" w:beforeAutospacing="0" w:lineRule="auto"/>
         <w:ind w:left="1440" w:hanging="360"/>
@@ -5273,7 +5802,7 @@
       <w:pPr>
         <w:numPr>
           <w:ilvl w:val="0"/>
-          <w:numId w:val="34"/>
+          <w:numId w:val="31"/>
         </w:numPr>
         <w:spacing w:after="240" w:before="0" w:beforeAutospacing="0" w:lineRule="auto"/>
         <w:ind w:left="720" w:hanging="360"/>
@@ -5332,7 +5861,7 @@
       <w:pPr>
         <w:numPr>
           <w:ilvl w:val="0"/>
-          <w:numId w:val="31"/>
+          <w:numId w:val="28"/>
         </w:numPr>
         <w:spacing w:after="0" w:afterAutospacing="0" w:before="240" w:lineRule="auto"/>
         <w:ind w:left="720" w:hanging="360"/>
@@ -5362,7 +5891,7 @@
       <w:pPr>
         <w:numPr>
           <w:ilvl w:val="0"/>
-          <w:numId w:val="31"/>
+          <w:numId w:val="28"/>
         </w:numPr>
         <w:spacing w:after="0" w:afterAutospacing="0" w:before="0" w:beforeAutospacing="0" w:lineRule="auto"/>
         <w:ind w:left="720" w:hanging="360"/>
@@ -5392,7 +5921,7 @@
       <w:pPr>
         <w:numPr>
           <w:ilvl w:val="0"/>
-          <w:numId w:val="31"/>
+          <w:numId w:val="28"/>
         </w:numPr>
         <w:spacing w:after="240" w:before="0" w:beforeAutospacing="0" w:lineRule="auto"/>
         <w:ind w:left="720" w:hanging="360"/>
@@ -5448,7 +5977,7 @@
       <w:pPr>
         <w:numPr>
           <w:ilvl w:val="0"/>
-          <w:numId w:val="36"/>
+          <w:numId w:val="33"/>
         </w:numPr>
         <w:spacing w:after="0" w:afterAutospacing="0" w:before="240" w:lineRule="auto"/>
         <w:ind w:left="720" w:hanging="360"/>
@@ -5464,7 +5993,7 @@
       <w:pPr>
         <w:numPr>
           <w:ilvl w:val="0"/>
-          <w:numId w:val="36"/>
+          <w:numId w:val="33"/>
         </w:numPr>
         <w:spacing w:after="0" w:afterAutospacing="0" w:before="0" w:beforeAutospacing="0" w:lineRule="auto"/>
         <w:ind w:left="720" w:hanging="360"/>
@@ -5480,7 +6009,7 @@
       <w:pPr>
         <w:numPr>
           <w:ilvl w:val="0"/>
-          <w:numId w:val="36"/>
+          <w:numId w:val="33"/>
         </w:numPr>
         <w:spacing w:after="0" w:afterAutospacing="0" w:before="0" w:beforeAutospacing="0" w:lineRule="auto"/>
         <w:ind w:left="720" w:hanging="360"/>
@@ -5496,7 +6025,7 @@
       <w:pPr>
         <w:numPr>
           <w:ilvl w:val="0"/>
-          <w:numId w:val="36"/>
+          <w:numId w:val="33"/>
         </w:numPr>
         <w:spacing w:after="0" w:afterAutospacing="0" w:before="0" w:beforeAutospacing="0" w:lineRule="auto"/>
         <w:ind w:left="720" w:hanging="360"/>
@@ -5512,7 +6041,7 @@
       <w:pPr>
         <w:numPr>
           <w:ilvl w:val="0"/>
-          <w:numId w:val="36"/>
+          <w:numId w:val="33"/>
         </w:numPr>
         <w:spacing w:after="0" w:afterAutospacing="0" w:before="0" w:beforeAutospacing="0" w:lineRule="auto"/>
         <w:ind w:left="720" w:hanging="360"/>
@@ -5528,7 +6057,7 @@
       <w:pPr>
         <w:numPr>
           <w:ilvl w:val="0"/>
-          <w:numId w:val="36"/>
+          <w:numId w:val="33"/>
         </w:numPr>
         <w:spacing w:after="240" w:before="0" w:beforeAutospacing="0" w:lineRule="auto"/>
         <w:ind w:left="720" w:hanging="360"/>
@@ -5598,7 +6127,7 @@
       <w:pPr>
         <w:numPr>
           <w:ilvl w:val="0"/>
-          <w:numId w:val="11"/>
+          <w:numId w:val="10"/>
         </w:numPr>
         <w:spacing w:after="0" w:afterAutospacing="0" w:before="240" w:lineRule="auto"/>
         <w:ind w:left="720" w:hanging="360"/>
@@ -5628,7 +6157,7 @@
       <w:pPr>
         <w:numPr>
           <w:ilvl w:val="0"/>
-          <w:numId w:val="11"/>
+          <w:numId w:val="10"/>
         </w:numPr>
         <w:spacing w:after="0" w:afterAutospacing="0" w:before="0" w:beforeAutospacing="0" w:lineRule="auto"/>
         <w:ind w:left="720" w:hanging="360"/>
@@ -5644,7 +6173,7 @@
       <w:pPr>
         <w:numPr>
           <w:ilvl w:val="1"/>
-          <w:numId w:val="11"/>
+          <w:numId w:val="10"/>
         </w:numPr>
         <w:spacing w:after="0" w:afterAutospacing="0" w:before="0" w:beforeAutospacing="0" w:lineRule="auto"/>
         <w:ind w:left="1440" w:hanging="360"/>
@@ -5660,7 +6189,7 @@
       <w:pPr>
         <w:numPr>
           <w:ilvl w:val="1"/>
-          <w:numId w:val="11"/>
+          <w:numId w:val="10"/>
         </w:numPr>
         <w:spacing w:after="0" w:afterAutospacing="0" w:before="0" w:beforeAutospacing="0" w:lineRule="auto"/>
         <w:ind w:left="1440" w:hanging="360"/>
@@ -5676,7 +6205,7 @@
       <w:pPr>
         <w:numPr>
           <w:ilvl w:val="1"/>
-          <w:numId w:val="11"/>
+          <w:numId w:val="10"/>
         </w:numPr>
         <w:spacing w:after="0" w:afterAutospacing="0" w:before="0" w:beforeAutospacing="0" w:lineRule="auto"/>
         <w:ind w:left="1440" w:hanging="360"/>
@@ -5692,7 +6221,7 @@
       <w:pPr>
         <w:numPr>
           <w:ilvl w:val="0"/>
-          <w:numId w:val="11"/>
+          <w:numId w:val="10"/>
         </w:numPr>
         <w:spacing w:after="0" w:afterAutospacing="0" w:before="0" w:beforeAutospacing="0" w:lineRule="auto"/>
         <w:ind w:left="720" w:hanging="360"/>
@@ -5722,7 +6251,7 @@
       <w:pPr>
         <w:numPr>
           <w:ilvl w:val="0"/>
-          <w:numId w:val="11"/>
+          <w:numId w:val="10"/>
         </w:numPr>
         <w:spacing w:after="0" w:afterAutospacing="0" w:before="0" w:beforeAutospacing="0" w:lineRule="auto"/>
         <w:ind w:left="720" w:hanging="360"/>
@@ -5752,7 +6281,7 @@
       <w:pPr>
         <w:numPr>
           <w:ilvl w:val="0"/>
-          <w:numId w:val="11"/>
+          <w:numId w:val="10"/>
         </w:numPr>
         <w:spacing w:after="0" w:afterAutospacing="0" w:before="0" w:beforeAutospacing="0" w:lineRule="auto"/>
         <w:ind w:left="720" w:hanging="360"/>
@@ -5768,7 +6297,7 @@
       <w:pPr>
         <w:numPr>
           <w:ilvl w:val="0"/>
-          <w:numId w:val="11"/>
+          <w:numId w:val="10"/>
         </w:numPr>
         <w:spacing w:after="240" w:before="0" w:beforeAutospacing="0" w:lineRule="auto"/>
         <w:ind w:left="720" w:hanging="360"/>
@@ -5812,7 +6341,7 @@
       <w:pPr>
         <w:numPr>
           <w:ilvl w:val="0"/>
-          <w:numId w:val="46"/>
+          <w:numId w:val="44"/>
         </w:numPr>
         <w:spacing w:after="0" w:afterAutospacing="0" w:before="240" w:lineRule="auto"/>
         <w:ind w:left="720" w:hanging="360"/>
@@ -5842,7 +6371,7 @@
       <w:pPr>
         <w:numPr>
           <w:ilvl w:val="0"/>
-          <w:numId w:val="46"/>
+          <w:numId w:val="44"/>
         </w:numPr>
         <w:spacing w:after="0" w:afterAutospacing="0" w:before="0" w:beforeAutospacing="0" w:lineRule="auto"/>
         <w:ind w:left="720" w:hanging="360"/>
@@ -5858,7 +6387,7 @@
       <w:pPr>
         <w:numPr>
           <w:ilvl w:val="1"/>
-          <w:numId w:val="46"/>
+          <w:numId w:val="44"/>
         </w:numPr>
         <w:spacing w:after="0" w:afterAutospacing="0" w:before="0" w:beforeAutospacing="0" w:lineRule="auto"/>
         <w:ind w:left="1440" w:hanging="360"/>
@@ -5874,7 +6403,7 @@
       <w:pPr>
         <w:numPr>
           <w:ilvl w:val="1"/>
-          <w:numId w:val="46"/>
+          <w:numId w:val="44"/>
         </w:numPr>
         <w:spacing w:after="0" w:afterAutospacing="0" w:before="0" w:beforeAutospacing="0" w:lineRule="auto"/>
         <w:ind w:left="1440" w:hanging="360"/>
@@ -5890,7 +6419,7 @@
       <w:pPr>
         <w:numPr>
           <w:ilvl w:val="0"/>
-          <w:numId w:val="46"/>
+          <w:numId w:val="44"/>
         </w:numPr>
         <w:spacing w:after="240" w:before="0" w:beforeAutospacing="0" w:lineRule="auto"/>
         <w:ind w:left="720" w:hanging="360"/>
@@ -5934,7 +6463,7 @@
       <w:pPr>
         <w:numPr>
           <w:ilvl w:val="0"/>
-          <w:numId w:val="20"/>
+          <w:numId w:val="19"/>
         </w:numPr>
         <w:spacing w:after="0" w:afterAutospacing="0" w:before="240" w:lineRule="auto"/>
         <w:ind w:left="720" w:hanging="360"/>
@@ -5964,7 +6493,7 @@
       <w:pPr>
         <w:numPr>
           <w:ilvl w:val="0"/>
-          <w:numId w:val="20"/>
+          <w:numId w:val="19"/>
         </w:numPr>
         <w:spacing w:after="0" w:afterAutospacing="0" w:before="0" w:beforeAutospacing="0" w:lineRule="auto"/>
         <w:ind w:left="720" w:hanging="360"/>
@@ -5980,7 +6509,7 @@
       <w:pPr>
         <w:numPr>
           <w:ilvl w:val="0"/>
-          <w:numId w:val="20"/>
+          <w:numId w:val="19"/>
         </w:numPr>
         <w:spacing w:after="0" w:afterAutospacing="0" w:before="0" w:beforeAutospacing="0" w:lineRule="auto"/>
         <w:ind w:left="720" w:hanging="360"/>
@@ -5996,7 +6525,7 @@
       <w:pPr>
         <w:numPr>
           <w:ilvl w:val="0"/>
-          <w:numId w:val="20"/>
+          <w:numId w:val="19"/>
         </w:numPr>
         <w:spacing w:after="240" w:before="0" w:beforeAutospacing="0" w:lineRule="auto"/>
         <w:ind w:left="720" w:hanging="360"/>
@@ -6054,7 +6583,7 @@
       <w:pPr>
         <w:numPr>
           <w:ilvl w:val="0"/>
-          <w:numId w:val="6"/>
+          <w:numId w:val="5"/>
         </w:numPr>
         <w:spacing w:after="0" w:afterAutospacing="0" w:before="240" w:lineRule="auto"/>
         <w:ind w:left="720" w:hanging="360"/>
@@ -6084,7 +6613,7 @@
       <w:pPr>
         <w:numPr>
           <w:ilvl w:val="0"/>
-          <w:numId w:val="6"/>
+          <w:numId w:val="5"/>
         </w:numPr>
         <w:spacing w:after="0" w:afterAutospacing="0" w:before="0" w:beforeAutospacing="0" w:lineRule="auto"/>
         <w:ind w:left="720" w:hanging="360"/>
@@ -6114,7 +6643,7 @@
       <w:pPr>
         <w:numPr>
           <w:ilvl w:val="0"/>
-          <w:numId w:val="6"/>
+          <w:numId w:val="5"/>
         </w:numPr>
         <w:spacing w:after="0" w:afterAutospacing="0" w:before="0" w:beforeAutospacing="0" w:lineRule="auto"/>
         <w:ind w:left="720" w:hanging="360"/>
@@ -6130,7 +6659,7 @@
       <w:pPr>
         <w:numPr>
           <w:ilvl w:val="0"/>
-          <w:numId w:val="6"/>
+          <w:numId w:val="5"/>
         </w:numPr>
         <w:spacing w:after="240" w:before="0" w:beforeAutospacing="0" w:lineRule="auto"/>
         <w:ind w:left="720" w:hanging="360"/>
@@ -6198,7 +6727,7 @@
           <w:pgNumType w:start="1"/>
         </w:sectPr>
       </w:pPr>
-      <w:bookmarkStart w:colFirst="0" w:colLast="0" w:name="_i7l0urm7839z" w:id="18"/>
+      <w:bookmarkStart w:colFirst="0" w:colLast="0" w:name="_heh3vzd7y3w5" w:id="18"/>
       <w:bookmarkEnd w:id="18"/>
       <w:r>
         <w:rPr>
@@ -7488,7 +8017,7 @@
           <w:szCs w:val="32"/>
         </w:rPr>
       </w:pPr>
-      <w:bookmarkStart w:colFirst="0" w:colLast="0" w:name="_42gx7fhdcx90" w:id="19"/>
+      <w:bookmarkStart w:colFirst="0" w:colLast="0" w:name="_4pvvtbu6www8" w:id="19"/>
       <w:bookmarkEnd w:id="19"/>
       <w:r>
         <w:rPr>
@@ -7542,7 +8071,7 @@
       <w:pPr>
         <w:numPr>
           <w:ilvl w:val="0"/>
-          <w:numId w:val="28"/>
+          <w:numId w:val="25"/>
         </w:numPr>
         <w:spacing w:after="0" w:afterAutospacing="0" w:line="240" w:lineRule="auto"/>
         <w:ind w:left="720" w:hanging="360"/>
@@ -7562,7 +8091,7 @@
       <w:pPr>
         <w:numPr>
           <w:ilvl w:val="0"/>
-          <w:numId w:val="28"/>
+          <w:numId w:val="25"/>
         </w:numPr>
         <w:spacing w:after="0" w:afterAutospacing="0" w:line="240" w:lineRule="auto"/>
         <w:ind w:left="720" w:hanging="360"/>
@@ -7582,7 +8111,7 @@
       <w:pPr>
         <w:numPr>
           <w:ilvl w:val="0"/>
-          <w:numId w:val="28"/>
+          <w:numId w:val="25"/>
         </w:numPr>
         <w:spacing w:after="0" w:afterAutospacing="0" w:line="240" w:lineRule="auto"/>
         <w:ind w:left="720" w:hanging="360"/>
@@ -7602,7 +8131,7 @@
       <w:pPr>
         <w:numPr>
           <w:ilvl w:val="0"/>
-          <w:numId w:val="28"/>
+          <w:numId w:val="25"/>
         </w:numPr>
         <w:spacing w:after="0" w:afterAutospacing="0" w:line="240" w:lineRule="auto"/>
         <w:ind w:left="720" w:hanging="360"/>
@@ -7622,7 +8151,7 @@
       <w:pPr>
         <w:numPr>
           <w:ilvl w:val="0"/>
-          <w:numId w:val="28"/>
+          <w:numId w:val="25"/>
         </w:numPr>
         <w:spacing w:after="0" w:afterAutospacing="0" w:line="240" w:lineRule="auto"/>
         <w:ind w:left="720" w:hanging="360"/>
@@ -7642,7 +8171,7 @@
       <w:pPr>
         <w:numPr>
           <w:ilvl w:val="0"/>
-          <w:numId w:val="28"/>
+          <w:numId w:val="25"/>
         </w:numPr>
         <w:spacing w:after="60" w:line="240" w:lineRule="auto"/>
         <w:ind w:left="720" w:hanging="360"/>
@@ -7700,7 +8229,7 @@
       <w:pPr>
         <w:numPr>
           <w:ilvl w:val="0"/>
-          <w:numId w:val="30"/>
+          <w:numId w:val="27"/>
         </w:numPr>
         <w:spacing w:after="60" w:line="240" w:lineRule="auto"/>
         <w:ind w:left="720" w:hanging="360"/>
@@ -7742,7 +8271,7 @@
       <w:pPr>
         <w:numPr>
           <w:ilvl w:val="0"/>
-          <w:numId w:val="39"/>
+          <w:numId w:val="37"/>
         </w:numPr>
         <w:spacing w:after="60" w:line="240" w:lineRule="auto"/>
         <w:ind w:left="720" w:hanging="360"/>
@@ -7784,7 +8313,7 @@
       <w:pPr>
         <w:numPr>
           <w:ilvl w:val="0"/>
-          <w:numId w:val="35"/>
+          <w:numId w:val="32"/>
         </w:numPr>
         <w:spacing w:after="60" w:line="240" w:lineRule="auto"/>
         <w:ind w:left="720" w:hanging="360"/>
@@ -7826,7 +8355,7 @@
       <w:pPr>
         <w:numPr>
           <w:ilvl w:val="0"/>
-          <w:numId w:val="26"/>
+          <w:numId w:val="24"/>
         </w:numPr>
         <w:spacing w:after="60" w:line="240" w:lineRule="auto"/>
         <w:ind w:left="720" w:hanging="360"/>
@@ -7868,7 +8397,7 @@
       <w:pPr>
         <w:numPr>
           <w:ilvl w:val="0"/>
-          <w:numId w:val="15"/>
+          <w:numId w:val="14"/>
         </w:numPr>
         <w:spacing w:after="0" w:afterAutospacing="0" w:line="240" w:lineRule="auto"/>
         <w:ind w:left="720" w:hanging="360"/>
@@ -7888,7 +8417,7 @@
       <w:pPr>
         <w:numPr>
           <w:ilvl w:val="0"/>
-          <w:numId w:val="15"/>
+          <w:numId w:val="14"/>
         </w:numPr>
         <w:spacing w:after="60" w:line="240" w:lineRule="auto"/>
         <w:ind w:left="720" w:hanging="360"/>
@@ -7930,7 +8459,7 @@
       <w:pPr>
         <w:numPr>
           <w:ilvl w:val="0"/>
-          <w:numId w:val="33"/>
+          <w:numId w:val="30"/>
         </w:numPr>
         <w:spacing w:after="60" w:line="240" w:lineRule="auto"/>
         <w:ind w:left="720" w:hanging="360"/>
@@ -7972,7 +8501,7 @@
       <w:pPr>
         <w:numPr>
           <w:ilvl w:val="0"/>
-          <w:numId w:val="47"/>
+          <w:numId w:val="45"/>
         </w:numPr>
         <w:spacing w:after="0" w:afterAutospacing="0" w:line="240" w:lineRule="auto"/>
         <w:ind w:left="720" w:hanging="360"/>
@@ -7992,7 +8521,7 @@
       <w:pPr>
         <w:numPr>
           <w:ilvl w:val="0"/>
-          <w:numId w:val="47"/>
+          <w:numId w:val="45"/>
         </w:numPr>
         <w:spacing w:after="60" w:line="240" w:lineRule="auto"/>
         <w:ind w:left="720" w:hanging="360"/>
@@ -8076,7 +8605,7 @@
       <w:pPr>
         <w:numPr>
           <w:ilvl w:val="0"/>
-          <w:numId w:val="37"/>
+          <w:numId w:val="35"/>
         </w:numPr>
         <w:spacing w:after="60" w:line="240" w:lineRule="auto"/>
         <w:ind w:left="720" w:hanging="360"/>
@@ -8180,7 +8709,7 @@
       <w:pPr>
         <w:numPr>
           <w:ilvl w:val="0"/>
-          <w:numId w:val="44"/>
+          <w:numId w:val="41"/>
         </w:numPr>
         <w:spacing w:after="0" w:afterAutospacing="0" w:line="240" w:lineRule="auto"/>
         <w:ind w:left="720" w:hanging="360"/>
@@ -8200,7 +8729,7 @@
       <w:pPr>
         <w:numPr>
           <w:ilvl w:val="0"/>
-          <w:numId w:val="44"/>
+          <w:numId w:val="41"/>
         </w:numPr>
         <w:spacing w:after="60" w:line="240" w:lineRule="auto"/>
         <w:ind w:left="720" w:hanging="360"/>
@@ -8242,7 +8771,7 @@
       <w:pPr>
         <w:numPr>
           <w:ilvl w:val="0"/>
-          <w:numId w:val="45"/>
+          <w:numId w:val="42"/>
         </w:numPr>
         <w:spacing w:after="0" w:afterAutospacing="0" w:line="240" w:lineRule="auto"/>
         <w:ind w:left="720" w:hanging="360"/>
@@ -8262,7 +8791,7 @@
       <w:pPr>
         <w:numPr>
           <w:ilvl w:val="0"/>
-          <w:numId w:val="45"/>
+          <w:numId w:val="42"/>
         </w:numPr>
         <w:spacing w:after="60" w:line="240" w:lineRule="auto"/>
         <w:ind w:left="720" w:hanging="360"/>
@@ -8304,7 +8833,7 @@
       <w:pPr>
         <w:numPr>
           <w:ilvl w:val="0"/>
-          <w:numId w:val="18"/>
+          <w:numId w:val="17"/>
         </w:numPr>
         <w:spacing w:after="60" w:line="240" w:lineRule="auto"/>
         <w:ind w:left="720" w:hanging="360"/>
@@ -8810,7 +9339,7 @@
     <w:lvl w:ilvl="2">
       <w:start w:val="1"/>
       <w:numFmt w:val="bullet"/>
-      <w:lvlText w:val="●"/>
+      <w:lvlText w:val="■"/>
       <w:lvlJc w:val="left"/>
       <w:pPr>
         <w:ind w:left="2160" w:hanging="360"/>
@@ -8834,7 +9363,7 @@
     <w:lvl w:ilvl="4">
       <w:start w:val="1"/>
       <w:numFmt w:val="bullet"/>
-      <w:lvlText w:val="●"/>
+      <w:lvlText w:val="○"/>
       <w:lvlJc w:val="left"/>
       <w:pPr>
         <w:ind w:left="3600" w:hanging="360"/>
@@ -8846,7 +9375,7 @@
     <w:lvl w:ilvl="5">
       <w:start w:val="1"/>
       <w:numFmt w:val="bullet"/>
-      <w:lvlText w:val="●"/>
+      <w:lvlText w:val="■"/>
       <w:lvlJc w:val="left"/>
       <w:pPr>
         <w:ind w:left="4320" w:hanging="360"/>
@@ -8870,7 +9399,7 @@
     <w:lvl w:ilvl="7">
       <w:start w:val="1"/>
       <w:numFmt w:val="bullet"/>
-      <w:lvlText w:val="●"/>
+      <w:lvlText w:val="○"/>
       <w:lvlJc w:val="left"/>
       <w:pPr>
         <w:ind w:left="5760" w:hanging="360"/>
@@ -8882,7 +9411,7 @@
     <w:lvl w:ilvl="8">
       <w:start w:val="1"/>
       <w:numFmt w:val="bullet"/>
-      <w:lvlText w:val="●"/>
+      <w:lvlText w:val="■"/>
       <w:lvlJc w:val="left"/>
       <w:pPr>
         <w:ind w:left="6480" w:hanging="360"/>
@@ -8908,7 +9437,7 @@
     <w:lvl w:ilvl="1">
       <w:start w:val="1"/>
       <w:numFmt w:val="bullet"/>
-      <w:lvlText w:val="○"/>
+      <w:lvlText w:val="●"/>
       <w:lvlJc w:val="left"/>
       <w:pPr>
         <w:ind w:left="1440" w:hanging="360"/>
@@ -8920,7 +9449,7 @@
     <w:lvl w:ilvl="2">
       <w:start w:val="1"/>
       <w:numFmt w:val="bullet"/>
-      <w:lvlText w:val="■"/>
+      <w:lvlText w:val="●"/>
       <w:lvlJc w:val="left"/>
       <w:pPr>
         <w:ind w:left="2160" w:hanging="360"/>
@@ -8944,7 +9473,7 @@
     <w:lvl w:ilvl="4">
       <w:start w:val="1"/>
       <w:numFmt w:val="bullet"/>
-      <w:lvlText w:val="○"/>
+      <w:lvlText w:val="●"/>
       <w:lvlJc w:val="left"/>
       <w:pPr>
         <w:ind w:left="3600" w:hanging="360"/>
@@ -8956,7 +9485,7 @@
     <w:lvl w:ilvl="5">
       <w:start w:val="1"/>
       <w:numFmt w:val="bullet"/>
-      <w:lvlText w:val="■"/>
+      <w:lvlText w:val="●"/>
       <w:lvlJc w:val="left"/>
       <w:pPr>
         <w:ind w:left="4320" w:hanging="360"/>
@@ -8980,7 +9509,7 @@
     <w:lvl w:ilvl="7">
       <w:start w:val="1"/>
       <w:numFmt w:val="bullet"/>
-      <w:lvlText w:val="○"/>
+      <w:lvlText w:val="●"/>
       <w:lvlJc w:val="left"/>
       <w:pPr>
         <w:ind w:left="5760" w:hanging="360"/>
@@ -8992,7 +9521,7 @@
     <w:lvl w:ilvl="8">
       <w:start w:val="1"/>
       <w:numFmt w:val="bullet"/>
-      <w:lvlText w:val="■"/>
+      <w:lvlText w:val="●"/>
       <w:lvlJc w:val="left"/>
       <w:pPr>
         <w:ind w:left="6480" w:hanging="360"/>
@@ -9348,7 +9877,7 @@
     <w:lvl w:ilvl="1">
       <w:start w:val="1"/>
       <w:numFmt w:val="bullet"/>
-      <w:lvlText w:val="●"/>
+      <w:lvlText w:val="○"/>
       <w:lvlJc w:val="left"/>
       <w:pPr>
         <w:ind w:left="1440" w:hanging="360"/>
@@ -9360,7 +9889,7 @@
     <w:lvl w:ilvl="2">
       <w:start w:val="1"/>
       <w:numFmt w:val="bullet"/>
-      <w:lvlText w:val="●"/>
+      <w:lvlText w:val="■"/>
       <w:lvlJc w:val="left"/>
       <w:pPr>
         <w:ind w:left="2160" w:hanging="360"/>
@@ -9384,7 +9913,7 @@
     <w:lvl w:ilvl="4">
       <w:start w:val="1"/>
       <w:numFmt w:val="bullet"/>
-      <w:lvlText w:val="●"/>
+      <w:lvlText w:val="○"/>
       <w:lvlJc w:val="left"/>
       <w:pPr>
         <w:ind w:left="3600" w:hanging="360"/>
@@ -9396,7 +9925,7 @@
     <w:lvl w:ilvl="5">
       <w:start w:val="1"/>
       <w:numFmt w:val="bullet"/>
-      <w:lvlText w:val="●"/>
+      <w:lvlText w:val="■"/>
       <w:lvlJc w:val="left"/>
       <w:pPr>
         <w:ind w:left="4320" w:hanging="360"/>
@@ -9420,7 +9949,7 @@
     <w:lvl w:ilvl="7">
       <w:start w:val="1"/>
       <w:numFmt w:val="bullet"/>
-      <w:lvlText w:val="●"/>
+      <w:lvlText w:val="○"/>
       <w:lvlJc w:val="left"/>
       <w:pPr>
         <w:ind w:left="5760" w:hanging="360"/>
@@ -9432,7 +9961,7 @@
     <w:lvl w:ilvl="8">
       <w:start w:val="1"/>
       <w:numFmt w:val="bullet"/>
-      <w:lvlText w:val="●"/>
+      <w:lvlText w:val="■"/>
       <w:lvlJc w:val="left"/>
       <w:pPr>
         <w:ind w:left="6480" w:hanging="360"/>
@@ -9678,7 +10207,7 @@
     <w:lvl w:ilvl="1">
       <w:start w:val="1"/>
       <w:numFmt w:val="bullet"/>
-      <w:lvlText w:val="○"/>
+      <w:lvlText w:val="●"/>
       <w:lvlJc w:val="left"/>
       <w:pPr>
         <w:ind w:left="1440" w:hanging="360"/>
@@ -9690,7 +10219,7 @@
     <w:lvl w:ilvl="2">
       <w:start w:val="1"/>
       <w:numFmt w:val="bullet"/>
-      <w:lvlText w:val="■"/>
+      <w:lvlText w:val="●"/>
       <w:lvlJc w:val="left"/>
       <w:pPr>
         <w:ind w:left="2160" w:hanging="360"/>
@@ -9714,7 +10243,7 @@
     <w:lvl w:ilvl="4">
       <w:start w:val="1"/>
       <w:numFmt w:val="bullet"/>
-      <w:lvlText w:val="○"/>
+      <w:lvlText w:val="●"/>
       <w:lvlJc w:val="left"/>
       <w:pPr>
         <w:ind w:left="3600" w:hanging="360"/>
@@ -9726,7 +10255,7 @@
     <w:lvl w:ilvl="5">
       <w:start w:val="1"/>
       <w:numFmt w:val="bullet"/>
-      <w:lvlText w:val="■"/>
+      <w:lvlText w:val="●"/>
       <w:lvlJc w:val="left"/>
       <w:pPr>
         <w:ind w:left="4320" w:hanging="360"/>
@@ -9750,7 +10279,7 @@
     <w:lvl w:ilvl="7">
       <w:start w:val="1"/>
       <w:numFmt w:val="bullet"/>
-      <w:lvlText w:val="○"/>
+      <w:lvlText w:val="●"/>
       <w:lvlJc w:val="left"/>
       <w:pPr>
         <w:ind w:left="5760" w:hanging="360"/>
@@ -9762,7 +10291,7 @@
     <w:lvl w:ilvl="8">
       <w:start w:val="1"/>
       <w:numFmt w:val="bullet"/>
-      <w:lvlText w:val="■"/>
+      <w:lvlText w:val="●"/>
       <w:lvlJc w:val="left"/>
       <w:pPr>
         <w:ind w:left="6480" w:hanging="360"/>
@@ -9898,7 +10427,7 @@
     <w:lvl w:ilvl="1">
       <w:start w:val="1"/>
       <w:numFmt w:val="bullet"/>
-      <w:lvlText w:val="●"/>
+      <w:lvlText w:val="○"/>
       <w:lvlJc w:val="left"/>
       <w:pPr>
         <w:ind w:left="1440" w:hanging="360"/>
@@ -9910,7 +10439,7 @@
     <w:lvl w:ilvl="2">
       <w:start w:val="1"/>
       <w:numFmt w:val="bullet"/>
-      <w:lvlText w:val="●"/>
+      <w:lvlText w:val="■"/>
       <w:lvlJc w:val="left"/>
       <w:pPr>
         <w:ind w:left="2160" w:hanging="360"/>
@@ -9934,7 +10463,7 @@
     <w:lvl w:ilvl="4">
       <w:start w:val="1"/>
       <w:numFmt w:val="bullet"/>
-      <w:lvlText w:val="●"/>
+      <w:lvlText w:val="○"/>
       <w:lvlJc w:val="left"/>
       <w:pPr>
         <w:ind w:left="3600" w:hanging="360"/>
@@ -9946,7 +10475,7 @@
     <w:lvl w:ilvl="5">
       <w:start w:val="1"/>
       <w:numFmt w:val="bullet"/>
-      <w:lvlText w:val="●"/>
+      <w:lvlText w:val="■"/>
       <w:lvlJc w:val="left"/>
       <w:pPr>
         <w:ind w:left="4320" w:hanging="360"/>
@@ -9970,7 +10499,7 @@
     <w:lvl w:ilvl="7">
       <w:start w:val="1"/>
       <w:numFmt w:val="bullet"/>
-      <w:lvlText w:val="●"/>
+      <w:lvlText w:val="○"/>
       <w:lvlJc w:val="left"/>
       <w:pPr>
         <w:ind w:left="5760" w:hanging="360"/>
@@ -9982,7 +10511,7 @@
     <w:lvl w:ilvl="8">
       <w:start w:val="1"/>
       <w:numFmt w:val="bullet"/>
-      <w:lvlText w:val="●"/>
+      <w:lvlText w:val="■"/>
       <w:lvlJc w:val="left"/>
       <w:pPr>
         <w:ind w:left="6480" w:hanging="360"/>
@@ -10118,7 +10647,7 @@
     <w:lvl w:ilvl="1">
       <w:start w:val="1"/>
       <w:numFmt w:val="bullet"/>
-      <w:lvlText w:val="○"/>
+      <w:lvlText w:val="●"/>
       <w:lvlJc w:val="left"/>
       <w:pPr>
         <w:ind w:left="1440" w:hanging="360"/>
@@ -10130,7 +10659,7 @@
     <w:lvl w:ilvl="2">
       <w:start w:val="1"/>
       <w:numFmt w:val="bullet"/>
-      <w:lvlText w:val="■"/>
+      <w:lvlText w:val="●"/>
       <w:lvlJc w:val="left"/>
       <w:pPr>
         <w:ind w:left="2160" w:hanging="360"/>
@@ -10154,7 +10683,7 @@
     <w:lvl w:ilvl="4">
       <w:start w:val="1"/>
       <w:numFmt w:val="bullet"/>
-      <w:lvlText w:val="○"/>
+      <w:lvlText w:val="●"/>
       <w:lvlJc w:val="left"/>
       <w:pPr>
         <w:ind w:left="3600" w:hanging="360"/>
@@ -10166,7 +10695,7 @@
     <w:lvl w:ilvl="5">
       <w:start w:val="1"/>
       <w:numFmt w:val="bullet"/>
-      <w:lvlText w:val="■"/>
+      <w:lvlText w:val="●"/>
       <w:lvlJc w:val="left"/>
       <w:pPr>
         <w:ind w:left="4320" w:hanging="360"/>
@@ -10190,7 +10719,7 @@
     <w:lvl w:ilvl="7">
       <w:start w:val="1"/>
       <w:numFmt w:val="bullet"/>
-      <w:lvlText w:val="○"/>
+      <w:lvlText w:val="●"/>
       <w:lvlJc w:val="left"/>
       <w:pPr>
         <w:ind w:left="5760" w:hanging="360"/>
@@ -10202,7 +10731,7 @@
     <w:lvl w:ilvl="8">
       <w:start w:val="1"/>
       <w:numFmt w:val="bullet"/>
-      <w:lvlText w:val="■"/>
+      <w:lvlText w:val="●"/>
       <w:lvlJc w:val="left"/>
       <w:pPr>
         <w:ind w:left="6480" w:hanging="360"/>
@@ -10228,7 +10757,7 @@
     <w:lvl w:ilvl="1">
       <w:start w:val="1"/>
       <w:numFmt w:val="bullet"/>
-      <w:lvlText w:val="●"/>
+      <w:lvlText w:val="○"/>
       <w:lvlJc w:val="left"/>
       <w:pPr>
         <w:ind w:left="1440" w:hanging="360"/>
@@ -10240,7 +10769,7 @@
     <w:lvl w:ilvl="2">
       <w:start w:val="1"/>
       <w:numFmt w:val="bullet"/>
-      <w:lvlText w:val="●"/>
+      <w:lvlText w:val="■"/>
       <w:lvlJc w:val="left"/>
       <w:pPr>
         <w:ind w:left="2160" w:hanging="360"/>
@@ -10264,7 +10793,7 @@
     <w:lvl w:ilvl="4">
       <w:start w:val="1"/>
       <w:numFmt w:val="bullet"/>
-      <w:lvlText w:val="●"/>
+      <w:lvlText w:val="○"/>
       <w:lvlJc w:val="left"/>
       <w:pPr>
         <w:ind w:left="3600" w:hanging="360"/>
@@ -10276,7 +10805,7 @@
     <w:lvl w:ilvl="5">
       <w:start w:val="1"/>
       <w:numFmt w:val="bullet"/>
-      <w:lvlText w:val="●"/>
+      <w:lvlText w:val="■"/>
       <w:lvlJc w:val="left"/>
       <w:pPr>
         <w:ind w:left="4320" w:hanging="360"/>
@@ -10300,7 +10829,7 @@
     <w:lvl w:ilvl="7">
       <w:start w:val="1"/>
       <w:numFmt w:val="bullet"/>
-      <w:lvlText w:val="●"/>
+      <w:lvlText w:val="○"/>
       <w:lvlJc w:val="left"/>
       <w:pPr>
         <w:ind w:left="5760" w:hanging="360"/>
@@ -10312,7 +10841,7 @@
     <w:lvl w:ilvl="8">
       <w:start w:val="1"/>
       <w:numFmt w:val="bullet"/>
-      <w:lvlText w:val="●"/>
+      <w:lvlText w:val="■"/>
       <w:lvlJc w:val="left"/>
       <w:pPr>
         <w:ind w:left="6480" w:hanging="360"/>
@@ -10448,7 +10977,7 @@
     <w:lvl w:ilvl="1">
       <w:start w:val="1"/>
       <w:numFmt w:val="bullet"/>
-      <w:lvlText w:val="○"/>
+      <w:lvlText w:val="●"/>
       <w:lvlJc w:val="left"/>
       <w:pPr>
         <w:ind w:left="1440" w:hanging="360"/>
@@ -10460,7 +10989,7 @@
     <w:lvl w:ilvl="2">
       <w:start w:val="1"/>
       <w:numFmt w:val="bullet"/>
-      <w:lvlText w:val="■"/>
+      <w:lvlText w:val="●"/>
       <w:lvlJc w:val="left"/>
       <w:pPr>
         <w:ind w:left="2160" w:hanging="360"/>
@@ -10484,7 +11013,7 @@
     <w:lvl w:ilvl="4">
       <w:start w:val="1"/>
       <w:numFmt w:val="bullet"/>
-      <w:lvlText w:val="○"/>
+      <w:lvlText w:val="●"/>
       <w:lvlJc w:val="left"/>
       <w:pPr>
         <w:ind w:left="3600" w:hanging="360"/>
@@ -10496,7 +11025,7 @@
     <w:lvl w:ilvl="5">
       <w:start w:val="1"/>
       <w:numFmt w:val="bullet"/>
-      <w:lvlText w:val="■"/>
+      <w:lvlText w:val="●"/>
       <w:lvlJc w:val="left"/>
       <w:pPr>
         <w:ind w:left="4320" w:hanging="360"/>
@@ -10520,7 +11049,7 @@
     <w:lvl w:ilvl="7">
       <w:start w:val="1"/>
       <w:numFmt w:val="bullet"/>
-      <w:lvlText w:val="○"/>
+      <w:lvlText w:val="●"/>
       <w:lvlJc w:val="left"/>
       <w:pPr>
         <w:ind w:left="5760" w:hanging="360"/>
@@ -10532,7 +11061,7 @@
     <w:lvl w:ilvl="8">
       <w:start w:val="1"/>
       <w:numFmt w:val="bullet"/>
-      <w:lvlText w:val="■"/>
+      <w:lvlText w:val="●"/>
       <w:lvlJc w:val="left"/>
       <w:pPr>
         <w:ind w:left="6480" w:hanging="360"/>
@@ -10558,7 +11087,7 @@
     <w:lvl w:ilvl="1">
       <w:start w:val="1"/>
       <w:numFmt w:val="bullet"/>
-      <w:lvlText w:val="●"/>
+      <w:lvlText w:val="○"/>
       <w:lvlJc w:val="left"/>
       <w:pPr>
         <w:ind w:left="1440" w:hanging="360"/>
@@ -10570,7 +11099,7 @@
     <w:lvl w:ilvl="2">
       <w:start w:val="1"/>
       <w:numFmt w:val="bullet"/>
-      <w:lvlText w:val="●"/>
+      <w:lvlText w:val="■"/>
       <w:lvlJc w:val="left"/>
       <w:pPr>
         <w:ind w:left="2160" w:hanging="360"/>
@@ -10594,7 +11123,7 @@
     <w:lvl w:ilvl="4">
       <w:start w:val="1"/>
       <w:numFmt w:val="bullet"/>
-      <w:lvlText w:val="●"/>
+      <w:lvlText w:val="○"/>
       <w:lvlJc w:val="left"/>
       <w:pPr>
         <w:ind w:left="3600" w:hanging="360"/>
@@ -10606,7 +11135,7 @@
     <w:lvl w:ilvl="5">
       <w:start w:val="1"/>
       <w:numFmt w:val="bullet"/>
-      <w:lvlText w:val="●"/>
+      <w:lvlText w:val="■"/>
       <w:lvlJc w:val="left"/>
       <w:pPr>
         <w:ind w:left="4320" w:hanging="360"/>
@@ -10630,7 +11159,7 @@
     <w:lvl w:ilvl="7">
       <w:start w:val="1"/>
       <w:numFmt w:val="bullet"/>
-      <w:lvlText w:val="●"/>
+      <w:lvlText w:val="○"/>
       <w:lvlJc w:val="left"/>
       <w:pPr>
         <w:ind w:left="5760" w:hanging="360"/>
@@ -10642,7 +11171,7 @@
     <w:lvl w:ilvl="8">
       <w:start w:val="1"/>
       <w:numFmt w:val="bullet"/>
-      <w:lvlText w:val="●"/>
+      <w:lvlText w:val="■"/>
       <w:lvlJc w:val="left"/>
       <w:pPr>
         <w:ind w:left="6480" w:hanging="360"/>
@@ -10668,7 +11197,7 @@
     <w:lvl w:ilvl="1">
       <w:start w:val="1"/>
       <w:numFmt w:val="bullet"/>
-      <w:lvlText w:val="○"/>
+      <w:lvlText w:val="●"/>
       <w:lvlJc w:val="left"/>
       <w:pPr>
         <w:ind w:left="1440" w:hanging="360"/>
@@ -10778,7 +11307,7 @@
     <w:lvl w:ilvl="1">
       <w:start w:val="1"/>
       <w:numFmt w:val="bullet"/>
-      <w:lvlText w:val="○"/>
+      <w:lvlText w:val="●"/>
       <w:lvlJc w:val="left"/>
       <w:pPr>
         <w:ind w:left="1440" w:hanging="360"/>
@@ -10790,7 +11319,7 @@
     <w:lvl w:ilvl="2">
       <w:start w:val="1"/>
       <w:numFmt w:val="bullet"/>
-      <w:lvlText w:val="■"/>
+      <w:lvlText w:val="●"/>
       <w:lvlJc w:val="left"/>
       <w:pPr>
         <w:ind w:left="2160" w:hanging="360"/>
@@ -10814,7 +11343,7 @@
     <w:lvl w:ilvl="4">
       <w:start w:val="1"/>
       <w:numFmt w:val="bullet"/>
-      <w:lvlText w:val="○"/>
+      <w:lvlText w:val="●"/>
       <w:lvlJc w:val="left"/>
       <w:pPr>
         <w:ind w:left="3600" w:hanging="360"/>
@@ -10826,7 +11355,7 @@
     <w:lvl w:ilvl="5">
       <w:start w:val="1"/>
       <w:numFmt w:val="bullet"/>
-      <w:lvlText w:val="■"/>
+      <w:lvlText w:val="●"/>
       <w:lvlJc w:val="left"/>
       <w:pPr>
         <w:ind w:left="4320" w:hanging="360"/>
@@ -10850,7 +11379,7 @@
     <w:lvl w:ilvl="7">
       <w:start w:val="1"/>
       <w:numFmt w:val="bullet"/>
-      <w:lvlText w:val="○"/>
+      <w:lvlText w:val="●"/>
       <w:lvlJc w:val="left"/>
       <w:pPr>
         <w:ind w:left="5760" w:hanging="360"/>
@@ -10862,7 +11391,7 @@
     <w:lvl w:ilvl="8">
       <w:start w:val="1"/>
       <w:numFmt w:val="bullet"/>
-      <w:lvlText w:val="■"/>
+      <w:lvlText w:val="●"/>
       <w:lvlJc w:val="left"/>
       <w:pPr>
         <w:ind w:left="6480" w:hanging="360"/>
@@ -11108,7 +11637,7 @@
     <w:lvl w:ilvl="1">
       <w:start w:val="1"/>
       <w:numFmt w:val="bullet"/>
-      <w:lvlText w:val="●"/>
+      <w:lvlText w:val="○"/>
       <w:lvlJc w:val="left"/>
       <w:pPr>
         <w:ind w:left="1440" w:hanging="360"/>
@@ -11120,7 +11649,7 @@
     <w:lvl w:ilvl="2">
       <w:start w:val="1"/>
       <w:numFmt w:val="bullet"/>
-      <w:lvlText w:val="●"/>
+      <w:lvlText w:val="■"/>
       <w:lvlJc w:val="left"/>
       <w:pPr>
         <w:ind w:left="2160" w:hanging="360"/>
@@ -11144,7 +11673,7 @@
     <w:lvl w:ilvl="4">
       <w:start w:val="1"/>
       <w:numFmt w:val="bullet"/>
-      <w:lvlText w:val="●"/>
+      <w:lvlText w:val="○"/>
       <w:lvlJc w:val="left"/>
       <w:pPr>
         <w:ind w:left="3600" w:hanging="360"/>
@@ -11156,7 +11685,7 @@
     <w:lvl w:ilvl="5">
       <w:start w:val="1"/>
       <w:numFmt w:val="bullet"/>
-      <w:lvlText w:val="●"/>
+      <w:lvlText w:val="■"/>
       <w:lvlJc w:val="left"/>
       <w:pPr>
         <w:ind w:left="4320" w:hanging="360"/>
@@ -11180,7 +11709,7 @@
     <w:lvl w:ilvl="7">
       <w:start w:val="1"/>
       <w:numFmt w:val="bullet"/>
-      <w:lvlText w:val="●"/>
+      <w:lvlText w:val="○"/>
       <w:lvlJc w:val="left"/>
       <w:pPr>
         <w:ind w:left="5760" w:hanging="360"/>
@@ -11192,7 +11721,7 @@
     <w:lvl w:ilvl="8">
       <w:start w:val="1"/>
       <w:numFmt w:val="bullet"/>
-      <w:lvlText w:val="●"/>
+      <w:lvlText w:val="■"/>
       <w:lvlJc w:val="left"/>
       <w:pPr>
         <w:ind w:left="6480" w:hanging="360"/>
@@ -11218,7 +11747,7 @@
     <w:lvl w:ilvl="1">
       <w:start w:val="1"/>
       <w:numFmt w:val="bullet"/>
-      <w:lvlText w:val="○"/>
+      <w:lvlText w:val="●"/>
       <w:lvlJc w:val="left"/>
       <w:pPr>
         <w:ind w:left="1440" w:hanging="360"/>
@@ -11230,7 +11759,7 @@
     <w:lvl w:ilvl="2">
       <w:start w:val="1"/>
       <w:numFmt w:val="bullet"/>
-      <w:lvlText w:val="■"/>
+      <w:lvlText w:val="●"/>
       <w:lvlJc w:val="left"/>
       <w:pPr>
         <w:ind w:left="2160" w:hanging="360"/>
@@ -11328,7 +11857,7 @@
     <w:lvl w:ilvl="1">
       <w:start w:val="1"/>
       <w:numFmt w:val="bullet"/>
-      <w:lvlText w:val="●"/>
+      <w:lvlText w:val="○"/>
       <w:lvlJc w:val="left"/>
       <w:pPr>
         <w:ind w:left="1440" w:hanging="360"/>
@@ -11340,7 +11869,7 @@
     <w:lvl w:ilvl="2">
       <w:start w:val="1"/>
       <w:numFmt w:val="bullet"/>
-      <w:lvlText w:val="●"/>
+      <w:lvlText w:val="■"/>
       <w:lvlJc w:val="left"/>
       <w:pPr>
         <w:ind w:left="2160" w:hanging="360"/>
@@ -11364,7 +11893,7 @@
     <w:lvl w:ilvl="4">
       <w:start w:val="1"/>
       <w:numFmt w:val="bullet"/>
-      <w:lvlText w:val="●"/>
+      <w:lvlText w:val="○"/>
       <w:lvlJc w:val="left"/>
       <w:pPr>
         <w:ind w:left="3600" w:hanging="360"/>
@@ -11376,7 +11905,7 @@
     <w:lvl w:ilvl="5">
       <w:start w:val="1"/>
       <w:numFmt w:val="bullet"/>
-      <w:lvlText w:val="●"/>
+      <w:lvlText w:val="■"/>
       <w:lvlJc w:val="left"/>
       <w:pPr>
         <w:ind w:left="4320" w:hanging="360"/>
@@ -11400,7 +11929,7 @@
     <w:lvl w:ilvl="7">
       <w:start w:val="1"/>
       <w:numFmt w:val="bullet"/>
-      <w:lvlText w:val="●"/>
+      <w:lvlText w:val="○"/>
       <w:lvlJc w:val="left"/>
       <w:pPr>
         <w:ind w:left="5760" w:hanging="360"/>
@@ -11412,7 +11941,7 @@
     <w:lvl w:ilvl="8">
       <w:start w:val="1"/>
       <w:numFmt w:val="bullet"/>
-      <w:lvlText w:val="●"/>
+      <w:lvlText w:val="■"/>
       <w:lvlJc w:val="left"/>
       <w:pPr>
         <w:ind w:left="6480" w:hanging="360"/>
@@ -11768,7 +12297,7 @@
     <w:lvl w:ilvl="1">
       <w:start w:val="1"/>
       <w:numFmt w:val="bullet"/>
-      <w:lvlText w:val="○"/>
+      <w:lvlText w:val="●"/>
       <w:lvlJc w:val="left"/>
       <w:pPr>
         <w:ind w:left="1440" w:hanging="360"/>
@@ -11780,7 +12309,7 @@
     <w:lvl w:ilvl="2">
       <w:start w:val="1"/>
       <w:numFmt w:val="bullet"/>
-      <w:lvlText w:val="■"/>
+      <w:lvlText w:val="●"/>
       <w:lvlJc w:val="left"/>
       <w:pPr>
         <w:ind w:left="2160" w:hanging="360"/>
@@ -11804,7 +12333,7 @@
     <w:lvl w:ilvl="4">
       <w:start w:val="1"/>
       <w:numFmt w:val="bullet"/>
-      <w:lvlText w:val="○"/>
+      <w:lvlText w:val="●"/>
       <w:lvlJc w:val="left"/>
       <w:pPr>
         <w:ind w:left="3600" w:hanging="360"/>
@@ -11816,7 +12345,7 @@
     <w:lvl w:ilvl="5">
       <w:start w:val="1"/>
       <w:numFmt w:val="bullet"/>
-      <w:lvlText w:val="■"/>
+      <w:lvlText w:val="●"/>
       <w:lvlJc w:val="left"/>
       <w:pPr>
         <w:ind w:left="4320" w:hanging="360"/>
@@ -11840,7 +12369,7 @@
     <w:lvl w:ilvl="7">
       <w:start w:val="1"/>
       <w:numFmt w:val="bullet"/>
-      <w:lvlText w:val="○"/>
+      <w:lvlText w:val="●"/>
       <w:lvlJc w:val="left"/>
       <w:pPr>
         <w:ind w:left="5760" w:hanging="360"/>
@@ -11852,7 +12381,7 @@
     <w:lvl w:ilvl="8">
       <w:start w:val="1"/>
       <w:numFmt w:val="bullet"/>
-      <w:lvlText w:val="■"/>
+      <w:lvlText w:val="●"/>
       <w:lvlJc w:val="left"/>
       <w:pPr>
         <w:ind w:left="6480" w:hanging="360"/>
@@ -11878,7 +12407,7 @@
     <w:lvl w:ilvl="1">
       <w:start w:val="1"/>
       <w:numFmt w:val="bullet"/>
-      <w:lvlText w:val="●"/>
+      <w:lvlText w:val="○"/>
       <w:lvlJc w:val="left"/>
       <w:pPr>
         <w:ind w:left="1440" w:hanging="360"/>
@@ -11890,7 +12419,7 @@
     <w:lvl w:ilvl="2">
       <w:start w:val="1"/>
       <w:numFmt w:val="bullet"/>
-      <w:lvlText w:val="●"/>
+      <w:lvlText w:val="■"/>
       <w:lvlJc w:val="left"/>
       <w:pPr>
         <w:ind w:left="2160" w:hanging="360"/>
@@ -11914,7 +12443,7 @@
     <w:lvl w:ilvl="4">
       <w:start w:val="1"/>
       <w:numFmt w:val="bullet"/>
-      <w:lvlText w:val="●"/>
+      <w:lvlText w:val="○"/>
       <w:lvlJc w:val="left"/>
       <w:pPr>
         <w:ind w:left="3600" w:hanging="360"/>
@@ -11926,7 +12455,7 @@
     <w:lvl w:ilvl="5">
       <w:start w:val="1"/>
       <w:numFmt w:val="bullet"/>
-      <w:lvlText w:val="●"/>
+      <w:lvlText w:val="■"/>
       <w:lvlJc w:val="left"/>
       <w:pPr>
         <w:ind w:left="4320" w:hanging="360"/>
@@ -11950,7 +12479,7 @@
     <w:lvl w:ilvl="7">
       <w:start w:val="1"/>
       <w:numFmt w:val="bullet"/>
-      <w:lvlText w:val="●"/>
+      <w:lvlText w:val="○"/>
       <w:lvlJc w:val="left"/>
       <w:pPr>
         <w:ind w:left="5760" w:hanging="360"/>
@@ -11962,7 +12491,7 @@
     <w:lvl w:ilvl="8">
       <w:start w:val="1"/>
       <w:numFmt w:val="bullet"/>
-      <w:lvlText w:val="●"/>
+      <w:lvlText w:val="■"/>
       <w:lvlJc w:val="left"/>
       <w:pPr>
         <w:ind w:left="6480" w:hanging="360"/>
@@ -12428,7 +12957,7 @@
     <w:lvl w:ilvl="1">
       <w:start w:val="1"/>
       <w:numFmt w:val="bullet"/>
-      <w:lvlText w:val="○"/>
+      <w:lvlText w:val="●"/>
       <w:lvlJc w:val="left"/>
       <w:pPr>
         <w:ind w:left="1440" w:hanging="360"/>
@@ -12538,7 +13067,7 @@
     <w:lvl w:ilvl="1">
       <w:start w:val="1"/>
       <w:numFmt w:val="bullet"/>
-      <w:lvlText w:val="●"/>
+      <w:lvlText w:val="○"/>
       <w:lvlJc w:val="left"/>
       <w:pPr>
         <w:ind w:left="1440" w:hanging="360"/>
@@ -12550,7 +13079,7 @@
     <w:lvl w:ilvl="2">
       <w:start w:val="1"/>
       <w:numFmt w:val="bullet"/>
-      <w:lvlText w:val="●"/>
+      <w:lvlText w:val="■"/>
       <w:lvlJc w:val="left"/>
       <w:pPr>
         <w:ind w:left="2160" w:hanging="360"/>
@@ -12574,7 +13103,7 @@
     <w:lvl w:ilvl="4">
       <w:start w:val="1"/>
       <w:numFmt w:val="bullet"/>
-      <w:lvlText w:val="●"/>
+      <w:lvlText w:val="○"/>
       <w:lvlJc w:val="left"/>
       <w:pPr>
         <w:ind w:left="3600" w:hanging="360"/>
@@ -12586,7 +13115,7 @@
     <w:lvl w:ilvl="5">
       <w:start w:val="1"/>
       <w:numFmt w:val="bullet"/>
-      <w:lvlText w:val="●"/>
+      <w:lvlText w:val="■"/>
       <w:lvlJc w:val="left"/>
       <w:pPr>
         <w:ind w:left="4320" w:hanging="360"/>
@@ -12610,7 +13139,7 @@
     <w:lvl w:ilvl="7">
       <w:start w:val="1"/>
       <w:numFmt w:val="bullet"/>
-      <w:lvlText w:val="●"/>
+      <w:lvlText w:val="○"/>
       <w:lvlJc w:val="left"/>
       <w:pPr>
         <w:ind w:left="5760" w:hanging="360"/>
@@ -12622,7 +13151,7 @@
     <w:lvl w:ilvl="8">
       <w:start w:val="1"/>
       <w:numFmt w:val="bullet"/>
-      <w:lvlText w:val="●"/>
+      <w:lvlText w:val="■"/>
       <w:lvlJc w:val="left"/>
       <w:pPr>
         <w:ind w:left="6480" w:hanging="360"/>
@@ -12648,7 +13177,7 @@
     <w:lvl w:ilvl="1">
       <w:start w:val="1"/>
       <w:numFmt w:val="bullet"/>
-      <w:lvlText w:val="●"/>
+      <w:lvlText w:val="○"/>
       <w:lvlJc w:val="left"/>
       <w:pPr>
         <w:ind w:left="1440" w:hanging="360"/>
@@ -12660,7 +13189,7 @@
     <w:lvl w:ilvl="2">
       <w:start w:val="1"/>
       <w:numFmt w:val="bullet"/>
-      <w:lvlText w:val="●"/>
+      <w:lvlText w:val="■"/>
       <w:lvlJc w:val="left"/>
       <w:pPr>
         <w:ind w:left="2160" w:hanging="360"/>
@@ -12684,7 +13213,7 @@
     <w:lvl w:ilvl="4">
       <w:start w:val="1"/>
       <w:numFmt w:val="bullet"/>
-      <w:lvlText w:val="●"/>
+      <w:lvlText w:val="○"/>
       <w:lvlJc w:val="left"/>
       <w:pPr>
         <w:ind w:left="3600" w:hanging="360"/>
@@ -12696,7 +13225,7 @@
     <w:lvl w:ilvl="5">
       <w:start w:val="1"/>
       <w:numFmt w:val="bullet"/>
-      <w:lvlText w:val="●"/>
+      <w:lvlText w:val="■"/>
       <w:lvlJc w:val="left"/>
       <w:pPr>
         <w:ind w:left="4320" w:hanging="360"/>
@@ -12720,7 +13249,7 @@
     <w:lvl w:ilvl="7">
       <w:start w:val="1"/>
       <w:numFmt w:val="bullet"/>
-      <w:lvlText w:val="●"/>
+      <w:lvlText w:val="○"/>
       <w:lvlJc w:val="left"/>
       <w:pPr>
         <w:ind w:left="5760" w:hanging="360"/>
@@ -12732,7 +13261,7 @@
     <w:lvl w:ilvl="8">
       <w:start w:val="1"/>
       <w:numFmt w:val="bullet"/>
-      <w:lvlText w:val="●"/>
+      <w:lvlText w:val="■"/>
       <w:lvlJc w:val="left"/>
       <w:pPr>
         <w:ind w:left="6480" w:hanging="360"/>
@@ -12758,7 +13287,7 @@
     <w:lvl w:ilvl="1">
       <w:start w:val="1"/>
       <w:numFmt w:val="bullet"/>
-      <w:lvlText w:val="○"/>
+      <w:lvlText w:val="●"/>
       <w:lvlJc w:val="left"/>
       <w:pPr>
         <w:ind w:left="1440" w:hanging="360"/>
@@ -12770,7 +13299,7 @@
     <w:lvl w:ilvl="2">
       <w:start w:val="1"/>
       <w:numFmt w:val="bullet"/>
-      <w:lvlText w:val="■"/>
+      <w:lvlText w:val="●"/>
       <w:lvlJc w:val="left"/>
       <w:pPr>
         <w:ind w:left="2160" w:hanging="360"/>
@@ -12794,7 +13323,7 @@
     <w:lvl w:ilvl="4">
       <w:start w:val="1"/>
       <w:numFmt w:val="bullet"/>
-      <w:lvlText w:val="○"/>
+      <w:lvlText w:val="●"/>
       <w:lvlJc w:val="left"/>
       <w:pPr>
         <w:ind w:left="3600" w:hanging="360"/>
@@ -12806,7 +13335,7 @@
     <w:lvl w:ilvl="5">
       <w:start w:val="1"/>
       <w:numFmt w:val="bullet"/>
-      <w:lvlText w:val="■"/>
+      <w:lvlText w:val="●"/>
       <w:lvlJc w:val="left"/>
       <w:pPr>
         <w:ind w:left="4320" w:hanging="360"/>
@@ -12830,7 +13359,7 @@
     <w:lvl w:ilvl="7">
       <w:start w:val="1"/>
       <w:numFmt w:val="bullet"/>
-      <w:lvlText w:val="○"/>
+      <w:lvlText w:val="●"/>
       <w:lvlJc w:val="left"/>
       <w:pPr>
         <w:ind w:left="5760" w:hanging="360"/>
@@ -12842,7 +13371,7 @@
     <w:lvl w:ilvl="8">
       <w:start w:val="1"/>
       <w:numFmt w:val="bullet"/>
-      <w:lvlText w:val="■"/>
+      <w:lvlText w:val="●"/>
       <w:lvlJc w:val="left"/>
       <w:pPr>
         <w:ind w:left="6480" w:hanging="360"/>
@@ -12868,7 +13397,7 @@
     <w:lvl w:ilvl="1">
       <w:start w:val="1"/>
       <w:numFmt w:val="bullet"/>
-      <w:lvlText w:val="○"/>
+      <w:lvlText w:val="●"/>
       <w:lvlJc w:val="left"/>
       <w:pPr>
         <w:ind w:left="1440" w:hanging="360"/>
@@ -13088,7 +13617,7 @@
     <w:lvl w:ilvl="1">
       <w:start w:val="1"/>
       <w:numFmt w:val="bullet"/>
-      <w:lvlText w:val="●"/>
+      <w:lvlText w:val="○"/>
       <w:lvlJc w:val="left"/>
       <w:pPr>
         <w:ind w:left="1440" w:hanging="360"/>
@@ -13100,7 +13629,7 @@
     <w:lvl w:ilvl="2">
       <w:start w:val="1"/>
       <w:numFmt w:val="bullet"/>
-      <w:lvlText w:val="●"/>
+      <w:lvlText w:val="■"/>
       <w:lvlJc w:val="left"/>
       <w:pPr>
         <w:ind w:left="2160" w:hanging="360"/>
@@ -13124,7 +13653,7 @@
     <w:lvl w:ilvl="4">
       <w:start w:val="1"/>
       <w:numFmt w:val="bullet"/>
-      <w:lvlText w:val="●"/>
+      <w:lvlText w:val="○"/>
       <w:lvlJc w:val="left"/>
       <w:pPr>
         <w:ind w:left="3600" w:hanging="360"/>
@@ -13136,7 +13665,7 @@
     <w:lvl w:ilvl="5">
       <w:start w:val="1"/>
       <w:numFmt w:val="bullet"/>
-      <w:lvlText w:val="●"/>
+      <w:lvlText w:val="■"/>
       <w:lvlJc w:val="left"/>
       <w:pPr>
         <w:ind w:left="4320" w:hanging="360"/>
@@ -13160,7 +13689,7 @@
     <w:lvl w:ilvl="7">
       <w:start w:val="1"/>
       <w:numFmt w:val="bullet"/>
-      <w:lvlText w:val="●"/>
+      <w:lvlText w:val="○"/>
       <w:lvlJc w:val="left"/>
       <w:pPr>
         <w:ind w:left="5760" w:hanging="360"/>
@@ -13172,7 +13701,7 @@
     <w:lvl w:ilvl="8">
       <w:start w:val="1"/>
       <w:numFmt w:val="bullet"/>
-      <w:lvlText w:val="●"/>
+      <w:lvlText w:val="■"/>
       <w:lvlJc w:val="left"/>
       <w:pPr>
         <w:ind w:left="6480" w:hanging="360"/>
@@ -13183,226 +13712,6 @@
     </w:lvl>
   </w:abstractNum>
   <w:abstractNum w:abstractNumId="45">
-    <w:lvl w:ilvl="0">
-      <w:start w:val="1"/>
-      <w:numFmt w:val="bullet"/>
-      <w:lvlText w:val="●"/>
-      <w:lvlJc w:val="left"/>
-      <w:pPr>
-        <w:ind w:left="720" w:hanging="360"/>
-      </w:pPr>
-      <w:rPr>
-        <w:u w:val="none"/>
-      </w:rPr>
-    </w:lvl>
-    <w:lvl w:ilvl="1">
-      <w:start w:val="1"/>
-      <w:numFmt w:val="bullet"/>
-      <w:lvlText w:val="●"/>
-      <w:lvlJc w:val="left"/>
-      <w:pPr>
-        <w:ind w:left="1440" w:hanging="360"/>
-      </w:pPr>
-      <w:rPr>
-        <w:u w:val="none"/>
-      </w:rPr>
-    </w:lvl>
-    <w:lvl w:ilvl="2">
-      <w:start w:val="1"/>
-      <w:numFmt w:val="bullet"/>
-      <w:lvlText w:val="●"/>
-      <w:lvlJc w:val="left"/>
-      <w:pPr>
-        <w:ind w:left="2160" w:hanging="360"/>
-      </w:pPr>
-      <w:rPr>
-        <w:u w:val="none"/>
-      </w:rPr>
-    </w:lvl>
-    <w:lvl w:ilvl="3">
-      <w:start w:val="1"/>
-      <w:numFmt w:val="bullet"/>
-      <w:lvlText w:val="●"/>
-      <w:lvlJc w:val="left"/>
-      <w:pPr>
-        <w:ind w:left="2880" w:hanging="360"/>
-      </w:pPr>
-      <w:rPr>
-        <w:u w:val="none"/>
-      </w:rPr>
-    </w:lvl>
-    <w:lvl w:ilvl="4">
-      <w:start w:val="1"/>
-      <w:numFmt w:val="bullet"/>
-      <w:lvlText w:val="●"/>
-      <w:lvlJc w:val="left"/>
-      <w:pPr>
-        <w:ind w:left="3600" w:hanging="360"/>
-      </w:pPr>
-      <w:rPr>
-        <w:u w:val="none"/>
-      </w:rPr>
-    </w:lvl>
-    <w:lvl w:ilvl="5">
-      <w:start w:val="1"/>
-      <w:numFmt w:val="bullet"/>
-      <w:lvlText w:val="●"/>
-      <w:lvlJc w:val="left"/>
-      <w:pPr>
-        <w:ind w:left="4320" w:hanging="360"/>
-      </w:pPr>
-      <w:rPr>
-        <w:u w:val="none"/>
-      </w:rPr>
-    </w:lvl>
-    <w:lvl w:ilvl="6">
-      <w:start w:val="1"/>
-      <w:numFmt w:val="bullet"/>
-      <w:lvlText w:val="●"/>
-      <w:lvlJc w:val="left"/>
-      <w:pPr>
-        <w:ind w:left="5040" w:hanging="360"/>
-      </w:pPr>
-      <w:rPr>
-        <w:u w:val="none"/>
-      </w:rPr>
-    </w:lvl>
-    <w:lvl w:ilvl="7">
-      <w:start w:val="1"/>
-      <w:numFmt w:val="bullet"/>
-      <w:lvlText w:val="●"/>
-      <w:lvlJc w:val="left"/>
-      <w:pPr>
-        <w:ind w:left="5760" w:hanging="360"/>
-      </w:pPr>
-      <w:rPr>
-        <w:u w:val="none"/>
-      </w:rPr>
-    </w:lvl>
-    <w:lvl w:ilvl="8">
-      <w:start w:val="1"/>
-      <w:numFmt w:val="bullet"/>
-      <w:lvlText w:val="●"/>
-      <w:lvlJc w:val="left"/>
-      <w:pPr>
-        <w:ind w:left="6480" w:hanging="360"/>
-      </w:pPr>
-      <w:rPr>
-        <w:u w:val="none"/>
-      </w:rPr>
-    </w:lvl>
-  </w:abstractNum>
-  <w:abstractNum w:abstractNumId="46">
-    <w:lvl w:ilvl="0">
-      <w:start w:val="1"/>
-      <w:numFmt w:val="bullet"/>
-      <w:lvlText w:val="●"/>
-      <w:lvlJc w:val="left"/>
-      <w:pPr>
-        <w:ind w:left="720" w:hanging="360"/>
-      </w:pPr>
-      <w:rPr>
-        <w:u w:val="none"/>
-      </w:rPr>
-    </w:lvl>
-    <w:lvl w:ilvl="1">
-      <w:start w:val="1"/>
-      <w:numFmt w:val="bullet"/>
-      <w:lvlText w:val="○"/>
-      <w:lvlJc w:val="left"/>
-      <w:pPr>
-        <w:ind w:left="1440" w:hanging="360"/>
-      </w:pPr>
-      <w:rPr>
-        <w:u w:val="none"/>
-      </w:rPr>
-    </w:lvl>
-    <w:lvl w:ilvl="2">
-      <w:start w:val="1"/>
-      <w:numFmt w:val="bullet"/>
-      <w:lvlText w:val="■"/>
-      <w:lvlJc w:val="left"/>
-      <w:pPr>
-        <w:ind w:left="2160" w:hanging="360"/>
-      </w:pPr>
-      <w:rPr>
-        <w:u w:val="none"/>
-      </w:rPr>
-    </w:lvl>
-    <w:lvl w:ilvl="3">
-      <w:start w:val="1"/>
-      <w:numFmt w:val="bullet"/>
-      <w:lvlText w:val="●"/>
-      <w:lvlJc w:val="left"/>
-      <w:pPr>
-        <w:ind w:left="2880" w:hanging="360"/>
-      </w:pPr>
-      <w:rPr>
-        <w:u w:val="none"/>
-      </w:rPr>
-    </w:lvl>
-    <w:lvl w:ilvl="4">
-      <w:start w:val="1"/>
-      <w:numFmt w:val="bullet"/>
-      <w:lvlText w:val="○"/>
-      <w:lvlJc w:val="left"/>
-      <w:pPr>
-        <w:ind w:left="3600" w:hanging="360"/>
-      </w:pPr>
-      <w:rPr>
-        <w:u w:val="none"/>
-      </w:rPr>
-    </w:lvl>
-    <w:lvl w:ilvl="5">
-      <w:start w:val="1"/>
-      <w:numFmt w:val="bullet"/>
-      <w:lvlText w:val="■"/>
-      <w:lvlJc w:val="left"/>
-      <w:pPr>
-        <w:ind w:left="4320" w:hanging="360"/>
-      </w:pPr>
-      <w:rPr>
-        <w:u w:val="none"/>
-      </w:rPr>
-    </w:lvl>
-    <w:lvl w:ilvl="6">
-      <w:start w:val="1"/>
-      <w:numFmt w:val="bullet"/>
-      <w:lvlText w:val="●"/>
-      <w:lvlJc w:val="left"/>
-      <w:pPr>
-        <w:ind w:left="5040" w:hanging="360"/>
-      </w:pPr>
-      <w:rPr>
-        <w:u w:val="none"/>
-      </w:rPr>
-    </w:lvl>
-    <w:lvl w:ilvl="7">
-      <w:start w:val="1"/>
-      <w:numFmt w:val="bullet"/>
-      <w:lvlText w:val="○"/>
-      <w:lvlJc w:val="left"/>
-      <w:pPr>
-        <w:ind w:left="5760" w:hanging="360"/>
-      </w:pPr>
-      <w:rPr>
-        <w:u w:val="none"/>
-      </w:rPr>
-    </w:lvl>
-    <w:lvl w:ilvl="8">
-      <w:start w:val="1"/>
-      <w:numFmt w:val="bullet"/>
-      <w:lvlText w:val="■"/>
-      <w:lvlJc w:val="left"/>
-      <w:pPr>
-        <w:ind w:left="6480" w:hanging="360"/>
-      </w:pPr>
-      <w:rPr>
-        <w:u w:val="none"/>
-      </w:rPr>
-    </w:lvl>
-  </w:abstractNum>
-  <w:abstractNum w:abstractNumId="47">
     <w:lvl w:ilvl="0">
       <w:start w:val="1"/>
       <w:numFmt w:val="bullet"/>
@@ -13646,12 +13955,6 @@
   </w:num>
   <w:num w:numId="45">
     <w:abstractNumId w:val="45"/>
-  </w:num>
-  <w:num w:numId="46">
-    <w:abstractNumId w:val="46"/>
-  </w:num>
-  <w:num w:numId="47">
-    <w:abstractNumId w:val="47"/>
   </w:num>
 </w:numbering>
 </file>

</xml_diff>